<commit_message>
the final word document
</commit_message>
<xml_diff>
--- a/WorkProgress/DWH_Project _20230560_20230119_20230092_20231182_20230045.docx
+++ b/WorkProgress/DWH_Project _20230560_20230119_20230092_20231182_20230045.docx
@@ -711,15 +711,6 @@
     </w:p>
     <w:p>
       <w:pPr>
-        <w:rPr>
-          <w:b/>
-          <w:bCs/>
-          <w:lang w:val="en-GB"/>
-        </w:rPr>
-      </w:pPr>
-    </w:p>
-    <w:p>
-      <w:pPr>
         <w:pStyle w:val="ListParagraph"/>
         <w:numPr>
           <w:ilvl w:val="0"/>
@@ -823,60 +814,6 @@
     <w:p>
       <w:pPr>
         <w:pStyle w:val="ListParagraph"/>
-        <w:rPr>
-          <w:b/>
-          <w:bCs/>
-        </w:rPr>
-      </w:pPr>
-    </w:p>
-    <w:p>
-      <w:pPr>
-        <w:pStyle w:val="ListParagraph"/>
-        <w:rPr>
-          <w:b/>
-          <w:bCs/>
-        </w:rPr>
-      </w:pPr>
-    </w:p>
-    <w:p>
-      <w:pPr>
-        <w:pStyle w:val="ListParagraph"/>
-        <w:rPr>
-          <w:b/>
-          <w:bCs/>
-        </w:rPr>
-      </w:pPr>
-    </w:p>
-    <w:p>
-      <w:pPr>
-        <w:pStyle w:val="ListParagraph"/>
-        <w:rPr>
-          <w:b/>
-          <w:bCs/>
-        </w:rPr>
-      </w:pPr>
-    </w:p>
-    <w:p>
-      <w:pPr>
-        <w:pStyle w:val="ListParagraph"/>
-        <w:rPr>
-          <w:b/>
-          <w:bCs/>
-        </w:rPr>
-      </w:pPr>
-    </w:p>
-    <w:p>
-      <w:pPr>
-        <w:pStyle w:val="ListParagraph"/>
-        <w:rPr>
-          <w:b/>
-          <w:bCs/>
-        </w:rPr>
-      </w:pPr>
-    </w:p>
-    <w:p>
-      <w:pPr>
-        <w:pStyle w:val="ListParagraph"/>
         <w:numPr>
           <w:ilvl w:val="0"/>
           <w:numId w:val="34"/>
@@ -891,7 +828,6 @@
           <w:b/>
           <w:bCs/>
         </w:rPr>
-        <w:lastRenderedPageBreak/>
         <w:t>Source Description:</w:t>
       </w:r>
     </w:p>
@@ -1050,115 +986,11 @@
     <w:p>
       <w:pPr>
         <w:pStyle w:val="ListParagraph"/>
-        <w:numPr>
-          <w:ilvl w:val="0"/>
-          <w:numId w:val="35"/>
-        </w:numPr>
-        <w:rPr>
-          <w:lang w:val="en-GB"/>
-        </w:rPr>
-      </w:pPr>
-      <w:proofErr w:type="spellStart"/>
-      <w:r>
-        <w:rPr>
-          <w:b/>
-          <w:bCs/>
-          <w:lang w:val="en-GB"/>
-        </w:rPr>
-        <w:t>STG_Customers</w:t>
-      </w:r>
-      <w:proofErr w:type="spellEnd"/>
-      <w:r>
-        <w:rPr>
-          <w:b/>
-          <w:bCs/>
-          <w:lang w:val="en-GB"/>
-        </w:rPr>
-        <w:t>:</w:t>
-      </w:r>
-      <w:r>
-        <w:rPr>
-          <w:lang w:val="en-GB"/>
-        </w:rPr>
-        <w:t xml:space="preserve"> Contains profile and contact information for all registered customers.</w:t>
-      </w:r>
-    </w:p>
-    <w:p>
-      <w:pPr>
-        <w:pStyle w:val="ListParagraph"/>
-        <w:ind w:left="1440"/>
-        <w:rPr>
-          <w:lang w:val="en-GB"/>
-        </w:rPr>
-      </w:pPr>
-      <w:r>
-        <w:rPr>
-          <w:lang w:val="en-GB"/>
-        </w:rPr>
-        <w:t xml:space="preserve">Columns: </w:t>
-      </w:r>
-      <w:proofErr w:type="spellStart"/>
-      <w:r>
-        <w:rPr>
-          <w:lang w:val="en-GB"/>
-        </w:rPr>
-        <w:t>customer_id</w:t>
-      </w:r>
-      <w:proofErr w:type="spellEnd"/>
-      <w:r>
-        <w:rPr>
-          <w:lang w:val="en-GB"/>
-        </w:rPr>
-        <w:t xml:space="preserve">, </w:t>
-      </w:r>
-      <w:proofErr w:type="spellStart"/>
-      <w:r>
-        <w:rPr>
-          <w:lang w:val="en-GB"/>
-        </w:rPr>
-        <w:t>first_name</w:t>
-      </w:r>
-      <w:proofErr w:type="spellEnd"/>
-      <w:r>
-        <w:rPr>
-          <w:lang w:val="en-GB"/>
-        </w:rPr>
-        <w:t xml:space="preserve">, </w:t>
-      </w:r>
-      <w:proofErr w:type="spellStart"/>
-      <w:r>
-        <w:rPr>
-          <w:lang w:val="en-GB"/>
-        </w:rPr>
-        <w:t>last_name</w:t>
-      </w:r>
-      <w:proofErr w:type="spellEnd"/>
-      <w:r>
-        <w:rPr>
-          <w:lang w:val="en-GB"/>
-        </w:rPr>
-        <w:t>, phone, email, street, city,</w:t>
-      </w:r>
-      <w:r>
-        <w:rPr>
-          <w:lang w:val="en-GB"/>
-        </w:rPr>
-        <w:t xml:space="preserve"> </w:t>
-      </w:r>
-      <w:r>
-        <w:rPr>
-          <w:lang w:val="en-GB"/>
-        </w:rPr>
-        <w:t xml:space="preserve">state, </w:t>
-      </w:r>
-      <w:proofErr w:type="spellStart"/>
-      <w:r>
-        <w:rPr>
-          <w:lang w:val="en-GB"/>
-        </w:rPr>
-        <w:t>zip_code</w:t>
-      </w:r>
-      <w:proofErr w:type="spellEnd"/>
+        <w:ind w:left="1080" w:firstLine="360"/>
+        <w:rPr>
+          <w:lang w:val="en-GB"/>
+        </w:rPr>
+      </w:pPr>
     </w:p>
     <w:p>
       <w:pPr>
@@ -1178,7 +1010,8 @@
           <w:bCs/>
           <w:lang w:val="en-GB"/>
         </w:rPr>
-        <w:t>STG_Order_Items</w:t>
+        <w:lastRenderedPageBreak/>
+        <w:t>STG_Customers</w:t>
       </w:r>
       <w:proofErr w:type="spellEnd"/>
       <w:r>
@@ -1193,13 +1026,13 @@
         <w:rPr>
           <w:lang w:val="en-GB"/>
         </w:rPr>
-        <w:t xml:space="preserve"> Lists specific product details, pricing, and discounts for every order.</w:t>
+        <w:t xml:space="preserve"> Contains profile and contact information for all registered customers.</w:t>
       </w:r>
     </w:p>
     <w:p>
       <w:pPr>
         <w:pStyle w:val="ListParagraph"/>
-        <w:ind w:left="1080" w:firstLine="360"/>
+        <w:ind w:left="1440"/>
         <w:rPr>
           <w:lang w:val="en-GB"/>
         </w:rPr>
@@ -1215,7 +1048,7 @@
         <w:rPr>
           <w:lang w:val="en-GB"/>
         </w:rPr>
-        <w:t>order_id</w:t>
+        <w:t>customer_id</w:t>
       </w:r>
       <w:proofErr w:type="spellEnd"/>
       <w:r>
@@ -1229,7 +1062,7 @@
         <w:rPr>
           <w:lang w:val="en-GB"/>
         </w:rPr>
-        <w:t>item_id</w:t>
+        <w:t>first_name</w:t>
       </w:r>
       <w:proofErr w:type="spellEnd"/>
       <w:r>
@@ -1243,29 +1076,35 @@
         <w:rPr>
           <w:lang w:val="en-GB"/>
         </w:rPr>
-        <w:t>product_id</w:t>
+        <w:t>last_name</w:t>
       </w:r>
       <w:proofErr w:type="spellEnd"/>
       <w:r>
         <w:rPr>
           <w:lang w:val="en-GB"/>
         </w:rPr>
-        <w:t xml:space="preserve">, quantity, </w:t>
+        <w:t>, phone, email, street, city,</w:t>
+      </w:r>
+      <w:r>
+        <w:rPr>
+          <w:lang w:val="en-GB"/>
+        </w:rPr>
+        <w:t xml:space="preserve"> </w:t>
+      </w:r>
+      <w:r>
+        <w:rPr>
+          <w:lang w:val="en-GB"/>
+        </w:rPr>
+        <w:t xml:space="preserve">state, </w:t>
       </w:r>
       <w:proofErr w:type="spellStart"/>
       <w:r>
         <w:rPr>
           <w:lang w:val="en-GB"/>
         </w:rPr>
-        <w:t>list_price</w:t>
+        <w:t>zip_code</w:t>
       </w:r>
       <w:proofErr w:type="spellEnd"/>
-      <w:r>
-        <w:rPr>
-          <w:lang w:val="en-GB"/>
-        </w:rPr>
-        <w:t>, discount</w:t>
-      </w:r>
     </w:p>
     <w:p>
       <w:pPr>
@@ -1285,7 +1124,7 @@
           <w:bCs/>
           <w:lang w:val="en-GB"/>
         </w:rPr>
-        <w:t>STG_Orders</w:t>
+        <w:t>STG_Order_Items</w:t>
       </w:r>
       <w:proofErr w:type="spellEnd"/>
       <w:r>
@@ -1300,21 +1139,7 @@
         <w:rPr>
           <w:lang w:val="en-GB"/>
         </w:rPr>
-        <w:t xml:space="preserve"> Tracks the header-level details including order status and key </w:t>
-      </w:r>
-      <w:proofErr w:type="spellStart"/>
-      <w:r>
-        <w:rPr>
-          <w:lang w:val="en-GB"/>
-        </w:rPr>
-        <w:t>fulfillment</w:t>
-      </w:r>
-      <w:proofErr w:type="spellEnd"/>
-      <w:r>
-        <w:rPr>
-          <w:lang w:val="en-GB"/>
-        </w:rPr>
-        <w:t xml:space="preserve"> dates.</w:t>
+        <w:t xml:space="preserve"> Lists specific product details, pricing, and discounts for every order.</w:t>
       </w:r>
     </w:p>
     <w:p>
@@ -1350,7 +1175,7 @@
         <w:rPr>
           <w:lang w:val="en-GB"/>
         </w:rPr>
-        <w:t>customer_id</w:t>
+        <w:t>item_id</w:t>
       </w:r>
       <w:proofErr w:type="spellEnd"/>
       <w:r>
@@ -1364,79 +1189,29 @@
         <w:rPr>
           <w:lang w:val="en-GB"/>
         </w:rPr>
-        <w:t>order_status</w:t>
+        <w:t>product_id</w:t>
       </w:r>
       <w:proofErr w:type="spellEnd"/>
       <w:r>
         <w:rPr>
           <w:lang w:val="en-GB"/>
         </w:rPr>
-        <w:t xml:space="preserve">, </w:t>
+        <w:t xml:space="preserve">, quantity, </w:t>
       </w:r>
       <w:proofErr w:type="spellStart"/>
       <w:r>
         <w:rPr>
           <w:lang w:val="en-GB"/>
         </w:rPr>
-        <w:t>order_date</w:t>
+        <w:t>list_price</w:t>
       </w:r>
       <w:proofErr w:type="spellEnd"/>
       <w:r>
         <w:rPr>
           <w:lang w:val="en-GB"/>
         </w:rPr>
-        <w:t xml:space="preserve">, </w:t>
-      </w:r>
-      <w:proofErr w:type="spellStart"/>
-      <w:r>
-        <w:rPr>
-          <w:lang w:val="en-GB"/>
-        </w:rPr>
-        <w:t>required_date</w:t>
-      </w:r>
-      <w:proofErr w:type="spellEnd"/>
-      <w:r>
-        <w:rPr>
-          <w:lang w:val="en-GB"/>
-        </w:rPr>
-        <w:t xml:space="preserve">, </w:t>
-      </w:r>
-      <w:proofErr w:type="spellStart"/>
-      <w:r>
-        <w:rPr>
-          <w:lang w:val="en-GB"/>
-        </w:rPr>
-        <w:t>shipped_date</w:t>
-      </w:r>
-      <w:proofErr w:type="spellEnd"/>
-      <w:r>
-        <w:rPr>
-          <w:lang w:val="en-GB"/>
-        </w:rPr>
-        <w:t xml:space="preserve">, </w:t>
-      </w:r>
-      <w:proofErr w:type="spellStart"/>
-      <w:r>
-        <w:rPr>
-          <w:lang w:val="en-GB"/>
-        </w:rPr>
-        <w:t>store_id</w:t>
-      </w:r>
-      <w:proofErr w:type="spellEnd"/>
-      <w:r>
-        <w:rPr>
-          <w:lang w:val="en-GB"/>
-        </w:rPr>
-        <w:t xml:space="preserve">, </w:t>
-      </w:r>
-      <w:proofErr w:type="spellStart"/>
-      <w:r>
-        <w:rPr>
-          <w:lang w:val="en-GB"/>
-        </w:rPr>
-        <w:t>staff_id</w:t>
-      </w:r>
-      <w:proofErr w:type="spellEnd"/>
+        <w:t>, discount</w:t>
+      </w:r>
     </w:p>
     <w:p>
       <w:pPr>
@@ -1456,28 +1231,36 @@
           <w:bCs/>
           <w:lang w:val="en-GB"/>
         </w:rPr>
-        <w:t>STG_Products</w:t>
+        <w:t>STG_Orders</w:t>
       </w:r>
       <w:proofErr w:type="spellEnd"/>
       <w:r>
         <w:rPr>
-          <w:lang w:val="en-GB"/>
-        </w:rPr>
-        <w:t xml:space="preserve">: Serves as the master </w:t>
+          <w:b/>
+          <w:bCs/>
+          <w:lang w:val="en-GB"/>
+        </w:rPr>
+        <w:t>:</w:t>
+      </w:r>
+      <w:r>
+        <w:rPr>
+          <w:lang w:val="en-GB"/>
+        </w:rPr>
+        <w:t xml:space="preserve"> Tracks the header-level details including order status and key </w:t>
       </w:r>
       <w:proofErr w:type="spellStart"/>
       <w:r>
         <w:rPr>
           <w:lang w:val="en-GB"/>
         </w:rPr>
-        <w:t>catalog</w:t>
+        <w:t>fulfillment</w:t>
       </w:r>
       <w:proofErr w:type="spellEnd"/>
       <w:r>
         <w:rPr>
           <w:lang w:val="en-GB"/>
         </w:rPr>
-        <w:t xml:space="preserve"> for all bicycle models and their specifications.</w:t>
+        <w:t xml:space="preserve"> dates.</w:t>
       </w:r>
     </w:p>
     <w:p>
@@ -1499,7 +1282,7 @@
         <w:rPr>
           <w:lang w:val="en-GB"/>
         </w:rPr>
-        <w:t>product_id</w:t>
+        <w:t>order_id</w:t>
       </w:r>
       <w:proofErr w:type="spellEnd"/>
       <w:r>
@@ -1513,7 +1296,7 @@
         <w:rPr>
           <w:lang w:val="en-GB"/>
         </w:rPr>
-        <w:t>product_name</w:t>
+        <w:t>customer_id</w:t>
       </w:r>
       <w:proofErr w:type="spellEnd"/>
       <w:r>
@@ -1527,7 +1310,7 @@
         <w:rPr>
           <w:lang w:val="en-GB"/>
         </w:rPr>
-        <w:t>brand_id</w:t>
+        <w:t>order_status</w:t>
       </w:r>
       <w:proofErr w:type="spellEnd"/>
       <w:r>
@@ -1541,7 +1324,7 @@
         <w:rPr>
           <w:lang w:val="en-GB"/>
         </w:rPr>
-        <w:t>category_id</w:t>
+        <w:t>order_date</w:t>
       </w:r>
       <w:proofErr w:type="spellEnd"/>
       <w:r>
@@ -1555,7 +1338,7 @@
         <w:rPr>
           <w:lang w:val="en-GB"/>
         </w:rPr>
-        <w:t>model_year</w:t>
+        <w:t>required_date</w:t>
       </w:r>
       <w:proofErr w:type="spellEnd"/>
       <w:r>
@@ -1569,7 +1352,35 @@
         <w:rPr>
           <w:lang w:val="en-GB"/>
         </w:rPr>
-        <w:t>list_price</w:t>
+        <w:t>shipped_date</w:t>
+      </w:r>
+      <w:proofErr w:type="spellEnd"/>
+      <w:r>
+        <w:rPr>
+          <w:lang w:val="en-GB"/>
+        </w:rPr>
+        <w:t xml:space="preserve">, </w:t>
+      </w:r>
+      <w:proofErr w:type="spellStart"/>
+      <w:r>
+        <w:rPr>
+          <w:lang w:val="en-GB"/>
+        </w:rPr>
+        <w:t>store_id</w:t>
+      </w:r>
+      <w:proofErr w:type="spellEnd"/>
+      <w:r>
+        <w:rPr>
+          <w:lang w:val="en-GB"/>
+        </w:rPr>
+        <w:t xml:space="preserve">, </w:t>
+      </w:r>
+      <w:proofErr w:type="spellStart"/>
+      <w:r>
+        <w:rPr>
+          <w:lang w:val="en-GB"/>
+        </w:rPr>
+        <w:t>staff_id</w:t>
       </w:r>
       <w:proofErr w:type="spellEnd"/>
     </w:p>
@@ -1584,29 +1395,33 @@
           <w:lang w:val="en-GB"/>
         </w:rPr>
       </w:pPr>
+      <w:r>
+        <w:rPr>
+          <w:b/>
+          <w:bCs/>
+          <w:lang w:val="en-GB"/>
+        </w:rPr>
+        <w:t>STG_Products</w:t>
+      </w:r>
+      <w:r>
+        <w:rPr>
+          <w:lang w:val="en-GB"/>
+        </w:rPr>
+        <w:t xml:space="preserve">: Serves as the master </w:t>
+      </w:r>
       <w:proofErr w:type="spellStart"/>
       <w:r>
         <w:rPr>
-          <w:b/>
-          <w:bCs/>
-          <w:lang w:val="en-GB"/>
-        </w:rPr>
-        <w:t>STG_Staffs</w:t>
+          <w:lang w:val="en-GB"/>
+        </w:rPr>
+        <w:t>catalog</w:t>
       </w:r>
       <w:proofErr w:type="spellEnd"/>
       <w:r>
         <w:rPr>
-          <w:b/>
-          <w:bCs/>
-          <w:lang w:val="en-GB"/>
-        </w:rPr>
-        <w:t>:</w:t>
-      </w:r>
-      <w:r>
-        <w:rPr>
-          <w:lang w:val="en-GB"/>
-        </w:rPr>
-        <w:t xml:space="preserve"> Maintains records of employees, their roles, and their assigned store locations.</w:t>
+          <w:lang w:val="en-GB"/>
+        </w:rPr>
+        <w:t xml:space="preserve"> for all bicycle models and their specifications.</w:t>
       </w:r>
     </w:p>
     <w:p>
@@ -1628,7 +1443,7 @@
         <w:rPr>
           <w:lang w:val="en-GB"/>
         </w:rPr>
-        <w:t>staff_id</w:t>
+        <w:t>product_id</w:t>
       </w:r>
       <w:proofErr w:type="spellEnd"/>
       <w:r>
@@ -1642,7 +1457,7 @@
         <w:rPr>
           <w:lang w:val="en-GB"/>
         </w:rPr>
-        <w:t>first_name</w:t>
+        <w:t>product_name</w:t>
       </w:r>
       <w:proofErr w:type="spellEnd"/>
       <w:r>
@@ -1656,21 +1471,21 @@
         <w:rPr>
           <w:lang w:val="en-GB"/>
         </w:rPr>
-        <w:t>last_name</w:t>
+        <w:t>brand_id</w:t>
       </w:r>
       <w:proofErr w:type="spellEnd"/>
       <w:r>
         <w:rPr>
           <w:lang w:val="en-GB"/>
         </w:rPr>
-        <w:t xml:space="preserve">, email, phone, active, </w:t>
+        <w:t xml:space="preserve">, </w:t>
       </w:r>
       <w:proofErr w:type="spellStart"/>
       <w:r>
         <w:rPr>
           <w:lang w:val="en-GB"/>
         </w:rPr>
-        <w:t>store_id</w:t>
+        <w:t>category_id</w:t>
       </w:r>
       <w:proofErr w:type="spellEnd"/>
       <w:r>
@@ -1684,7 +1499,21 @@
         <w:rPr>
           <w:lang w:val="en-GB"/>
         </w:rPr>
-        <w:t>manager_id</w:t>
+        <w:t>model_year</w:t>
+      </w:r>
+      <w:proofErr w:type="spellEnd"/>
+      <w:r>
+        <w:rPr>
+          <w:lang w:val="en-GB"/>
+        </w:rPr>
+        <w:t xml:space="preserve">, </w:t>
+      </w:r>
+      <w:proofErr w:type="spellStart"/>
+      <w:r>
+        <w:rPr>
+          <w:lang w:val="en-GB"/>
+        </w:rPr>
+        <w:t>list_price</w:t>
       </w:r>
       <w:proofErr w:type="spellEnd"/>
     </w:p>
@@ -1706,7 +1535,7 @@
           <w:bCs/>
           <w:lang w:val="en-GB"/>
         </w:rPr>
-        <w:t>STG_Stocks</w:t>
+        <w:t>STG_Staffs</w:t>
       </w:r>
       <w:proofErr w:type="spellEnd"/>
       <w:r>
@@ -1721,7 +1550,7 @@
         <w:rPr>
           <w:lang w:val="en-GB"/>
         </w:rPr>
-        <w:t xml:space="preserve"> Records the current inventory levels for every product across different store locations.</w:t>
+        <w:t xml:space="preserve"> Maintains records of employees, their roles, and their assigned store locations.</w:t>
       </w:r>
     </w:p>
     <w:p>
@@ -1743,6 +1572,48 @@
         <w:rPr>
           <w:lang w:val="en-GB"/>
         </w:rPr>
+        <w:t>staff_id</w:t>
+      </w:r>
+      <w:proofErr w:type="spellEnd"/>
+      <w:r>
+        <w:rPr>
+          <w:lang w:val="en-GB"/>
+        </w:rPr>
+        <w:t xml:space="preserve">, </w:t>
+      </w:r>
+      <w:proofErr w:type="spellStart"/>
+      <w:r>
+        <w:rPr>
+          <w:lang w:val="en-GB"/>
+        </w:rPr>
+        <w:t>first_name</w:t>
+      </w:r>
+      <w:proofErr w:type="spellEnd"/>
+      <w:r>
+        <w:rPr>
+          <w:lang w:val="en-GB"/>
+        </w:rPr>
+        <w:t xml:space="preserve">, </w:t>
+      </w:r>
+      <w:proofErr w:type="spellStart"/>
+      <w:r>
+        <w:rPr>
+          <w:lang w:val="en-GB"/>
+        </w:rPr>
+        <w:t>last_name</w:t>
+      </w:r>
+      <w:proofErr w:type="spellEnd"/>
+      <w:r>
+        <w:rPr>
+          <w:lang w:val="en-GB"/>
+        </w:rPr>
+        <w:t xml:space="preserve">, email, phone, active, </w:t>
+      </w:r>
+      <w:proofErr w:type="spellStart"/>
+      <w:r>
+        <w:rPr>
+          <w:lang w:val="en-GB"/>
+        </w:rPr>
         <w:t>store_id</w:t>
       </w:r>
       <w:proofErr w:type="spellEnd"/>
@@ -1757,15 +1628,9 @@
         <w:rPr>
           <w:lang w:val="en-GB"/>
         </w:rPr>
-        <w:t>product_id</w:t>
+        <w:t>manager_id</w:t>
       </w:r>
       <w:proofErr w:type="spellEnd"/>
-      <w:r>
-        <w:rPr>
-          <w:lang w:val="en-GB"/>
-        </w:rPr>
-        <w:t>, quantity</w:t>
-      </w:r>
     </w:p>
     <w:p>
       <w:pPr>
@@ -1785,7 +1650,7 @@
           <w:bCs/>
           <w:lang w:val="en-GB"/>
         </w:rPr>
-        <w:t>STG_Stores</w:t>
+        <w:t>STG_Stocks</w:t>
       </w:r>
       <w:proofErr w:type="spellEnd"/>
       <w:r>
@@ -1800,7 +1665,7 @@
         <w:rPr>
           <w:lang w:val="en-GB"/>
         </w:rPr>
-        <w:t xml:space="preserve"> Contains information and locations for the physical retail outlets.</w:t>
+        <w:t xml:space="preserve"> Records the current inventory levels for every product across different store locations.</w:t>
       </w:r>
     </w:p>
     <w:p>
@@ -1836,23 +1701,41 @@
         <w:rPr>
           <w:lang w:val="en-GB"/>
         </w:rPr>
-        <w:t>store_name</w:t>
+        <w:t>product_id</w:t>
       </w:r>
       <w:proofErr w:type="spellEnd"/>
       <w:r>
         <w:rPr>
           <w:lang w:val="en-GB"/>
         </w:rPr>
-        <w:t xml:space="preserve">, phone, email, street, city, state, </w:t>
-      </w:r>
-      <w:proofErr w:type="spellStart"/>
-      <w:r>
-        <w:rPr>
-          <w:lang w:val="en-GB"/>
-        </w:rPr>
-        <w:t>zip_code</w:t>
-      </w:r>
-      <w:proofErr w:type="spellEnd"/>
+        <w:t>, quantity</w:t>
+      </w:r>
+    </w:p>
+    <w:p>
+      <w:pPr>
+        <w:pStyle w:val="ListParagraph"/>
+        <w:numPr>
+          <w:ilvl w:val="0"/>
+          <w:numId w:val="35"/>
+        </w:numPr>
+        <w:rPr>
+          <w:lang w:val="en-GB"/>
+        </w:rPr>
+      </w:pPr>
+      <w:r>
+        <w:rPr>
+          <w:b/>
+          <w:bCs/>
+          <w:lang w:val="en-GB"/>
+        </w:rPr>
+        <w:t>STG_Stores:</w:t>
+      </w:r>
+      <w:r>
+        <w:rPr>
+          <w:lang w:val="en-GB"/>
+        </w:rPr>
+        <w:t xml:space="preserve"> Contains information and locations for the physical retail outlets.</w:t>
+      </w:r>
     </w:p>
     <w:p>
       <w:pPr>
@@ -1862,31 +1745,54 @@
           <w:lang w:val="en-GB"/>
         </w:rPr>
       </w:pPr>
+      <w:r>
+        <w:rPr>
+          <w:lang w:val="en-GB"/>
+        </w:rPr>
+        <w:t xml:space="preserve">Columns: </w:t>
+      </w:r>
+      <w:proofErr w:type="spellStart"/>
+      <w:r>
+        <w:rPr>
+          <w:lang w:val="en-GB"/>
+        </w:rPr>
+        <w:t>store_id</w:t>
+      </w:r>
+      <w:proofErr w:type="spellEnd"/>
+      <w:r>
+        <w:rPr>
+          <w:lang w:val="en-GB"/>
+        </w:rPr>
+        <w:t xml:space="preserve">, </w:t>
+      </w:r>
+      <w:proofErr w:type="spellStart"/>
+      <w:r>
+        <w:rPr>
+          <w:lang w:val="en-GB"/>
+        </w:rPr>
+        <w:t>store_name</w:t>
+      </w:r>
+      <w:proofErr w:type="spellEnd"/>
+      <w:r>
+        <w:rPr>
+          <w:lang w:val="en-GB"/>
+        </w:rPr>
+        <w:t xml:space="preserve">, phone, email, street, city, state, </w:t>
+      </w:r>
+      <w:proofErr w:type="spellStart"/>
+      <w:r>
+        <w:rPr>
+          <w:lang w:val="en-GB"/>
+        </w:rPr>
+        <w:t>zip_code</w:t>
+      </w:r>
+      <w:proofErr w:type="spellEnd"/>
     </w:p>
     <w:p>
       <w:pPr>
         <w:pStyle w:val="ListParagraph"/>
         <w:ind w:left="1080" w:firstLine="360"/>
         <w:rPr>
-          <w:lang w:val="en-GB"/>
-        </w:rPr>
-      </w:pPr>
-    </w:p>
-    <w:p>
-      <w:pPr>
-        <w:pStyle w:val="ListParagraph"/>
-        <w:ind w:left="1080" w:firstLine="360"/>
-        <w:rPr>
-          <w:lang w:val="en-GB"/>
-        </w:rPr>
-      </w:pPr>
-    </w:p>
-    <w:p>
-      <w:pPr>
-        <w:pStyle w:val="ListParagraph"/>
-        <w:ind w:left="1080" w:firstLine="360"/>
-        <w:rPr>
-          <w:u w:val="single"/>
           <w:lang w:val="en-GB"/>
         </w:rPr>
       </w:pPr>
@@ -1923,12 +1829,14 @@
         <w:rPr>
           <w:b/>
           <w:bCs/>
-        </w:rPr>
-      </w:pPr>
-      <w:r>
-        <w:rPr>
-          <w:b/>
-          <w:bCs/>
+          <w:u w:val="single"/>
+        </w:rPr>
+      </w:pPr>
+      <w:r>
+        <w:rPr>
+          <w:b/>
+          <w:bCs/>
+          <w:u w:val="single"/>
         </w:rPr>
         <w:t>Business Processes Modeled</w:t>
       </w:r>
@@ -1959,7 +1867,6 @@
           <w:bCs/>
           <w:lang w:val="en-GB"/>
         </w:rPr>
-        <w:lastRenderedPageBreak/>
         <w:t>Sales Transactions</w:t>
       </w:r>
       <w:r>
@@ -2170,15 +2077,14 @@
         <w:rPr>
           <w:lang w:val="en-GB"/>
         </w:rPr>
-        <w:t xml:space="preserve"> It summarizes the overall financial benefit of transactions across different store locations and staff members.</w:t>
-      </w:r>
-    </w:p>
-    <w:p>
-      <w:pPr>
-        <w:rPr>
-          <w:lang w:val="en-GB"/>
-        </w:rPr>
-      </w:pPr>
+        <w:t xml:space="preserve"> It summarizes the overall financial benefit of transactions across different store locations and staff members</w:t>
+      </w:r>
+      <w:r>
+        <w:rPr>
+          <w:lang w:val="en-GB"/>
+        </w:rPr>
+        <w:t>.</w:t>
+      </w:r>
     </w:p>
     <w:p>
       <w:pPr>
@@ -2190,13 +2096,16 @@
         <w:rPr>
           <w:b/>
           <w:bCs/>
-        </w:rPr>
-      </w:pPr>
-      <w:r>
-        <w:rPr>
-          <w:b/>
-          <w:bCs/>
-        </w:rPr>
+          <w:u w:val="single"/>
+        </w:rPr>
+      </w:pPr>
+      <w:r>
+        <w:rPr>
+          <w:b/>
+          <w:bCs/>
+          <w:u w:val="single"/>
+        </w:rPr>
+        <w:lastRenderedPageBreak/>
         <w:t>Grain of the Fact Tables</w:t>
       </w:r>
     </w:p>
@@ -2219,21 +2128,12 @@
           <w:tab w:val="num" w:pos="720"/>
         </w:tabs>
       </w:pPr>
-      <w:proofErr w:type="spellStart"/>
-      <w:r>
-        <w:rPr>
-          <w:b/>
-          <w:bCs/>
-        </w:rPr>
-        <w:t>Fact_Sales</w:t>
-      </w:r>
-      <w:proofErr w:type="spellEnd"/>
-      <w:r>
-        <w:rPr>
-          <w:b/>
-          <w:bCs/>
-        </w:rPr>
-        <w:t>:</w:t>
+      <w:r>
+        <w:rPr>
+          <w:b/>
+          <w:bCs/>
+        </w:rPr>
+        <w:t>Fact_Sales:</w:t>
       </w:r>
       <w:r>
         <w:t xml:space="preserve"> </w:t>
@@ -2256,21 +2156,12 @@
           <w:tab w:val="num" w:pos="720"/>
         </w:tabs>
       </w:pPr>
-      <w:proofErr w:type="spellStart"/>
-      <w:r>
-        <w:rPr>
-          <w:b/>
-          <w:bCs/>
-        </w:rPr>
-        <w:t>Fact_Shipping</w:t>
-      </w:r>
-      <w:proofErr w:type="spellEnd"/>
-      <w:r>
-        <w:rPr>
-          <w:b/>
-          <w:bCs/>
-        </w:rPr>
-        <w:t>:</w:t>
+      <w:r>
+        <w:rPr>
+          <w:b/>
+          <w:bCs/>
+        </w:rPr>
+        <w:t>Fact_Shipping:</w:t>
       </w:r>
       <w:r>
         <w:t xml:space="preserve"> One row per shipment transaction for a given </w:t>
@@ -2295,31 +2186,18 @@
           <w:numId w:val="8"/>
         </w:numPr>
       </w:pPr>
-      <w:proofErr w:type="spellStart"/>
-      <w:r>
-        <w:rPr>
-          <w:b/>
-          <w:bCs/>
-        </w:rPr>
-        <w:t>Fact_Orders</w:t>
-      </w:r>
-      <w:proofErr w:type="spellEnd"/>
-      <w:r>
-        <w:rPr>
-          <w:b/>
-          <w:bCs/>
-        </w:rPr>
-        <w:t>:</w:t>
+      <w:r>
+        <w:rPr>
+          <w:b/>
+          <w:bCs/>
+        </w:rPr>
+        <w:t>Fact_Orders:</w:t>
       </w:r>
       <w:r>
         <w:t xml:space="preserve"> One row per unique Order ID (Header level grain). This summarizes the entire transaction regardless of how many items were purchased.</w:t>
       </w:r>
     </w:p>
-    <w:p>
-      <w:pPr>
-        <w:ind w:left="1080"/>
-      </w:pPr>
-    </w:p>
+    <w:p/>
     <w:p>
       <w:pPr>
         <w:pStyle w:val="ListParagraph"/>
@@ -2330,12 +2208,14 @@
         <w:rPr>
           <w:b/>
           <w:bCs/>
-        </w:rPr>
-      </w:pPr>
-      <w:r>
-        <w:rPr>
-          <w:b/>
-          <w:bCs/>
+          <w:u w:val="single"/>
+        </w:rPr>
+      </w:pPr>
+      <w:r>
+        <w:rPr>
+          <w:b/>
+          <w:bCs/>
+          <w:u w:val="single"/>
         </w:rPr>
         <w:t>Type of Each Fact Table</w:t>
       </w:r>
@@ -2343,6 +2223,10 @@
     <w:p>
       <w:pPr>
         <w:pStyle w:val="ListParagraph"/>
+        <w:numPr>
+          <w:ilvl w:val="0"/>
+          <w:numId w:val="44"/>
+        </w:numPr>
         <w:rPr>
           <w:b/>
           <w:bCs/>
@@ -2471,6 +2355,14 @@
       </w:r>
       <w:r>
         <w:rPr>
+          <w:b/>
+          <w:bCs/>
+          <w:lang w:val="en-GB"/>
+        </w:rPr>
+        <w:t xml:space="preserve"> per Brand</w:t>
+      </w:r>
+      <w:r>
+        <w:rPr>
           <w:lang w:val="en-GB"/>
         </w:rPr>
         <w:t xml:space="preserve">: The sum of </w:t>
@@ -2487,7 +2379,19 @@
         <w:rPr>
           <w:lang w:val="en-GB"/>
         </w:rPr>
-        <w:t xml:space="preserve"> minus Discount to show actual earnings.</w:t>
+        <w:t xml:space="preserve"> minus Discount to show actual earnings</w:t>
+      </w:r>
+      <w:r>
+        <w:rPr>
+          <w:lang w:val="en-GB"/>
+        </w:rPr>
+        <w:t xml:space="preserve"> per brand</w:t>
+      </w:r>
+      <w:r>
+        <w:rPr>
+          <w:lang w:val="en-GB"/>
+        </w:rPr>
+        <w:t>.</w:t>
       </w:r>
     </w:p>
     <w:p>
@@ -2559,6 +2463,14 @@
       </w:r>
       <w:r>
         <w:rPr>
+          <w:b/>
+          <w:bCs/>
+          <w:lang w:val="en-GB"/>
+        </w:rPr>
+        <w:t xml:space="preserve"> per quantity</w:t>
+      </w:r>
+      <w:r>
+        <w:rPr>
           <w:lang w:val="en-GB"/>
         </w:rPr>
         <w:t>: A ranking based on the total Quantity sold to identify popular items.</w:t>
@@ -2574,7 +2486,7 @@
         <w:tabs>
           <w:tab w:val="num" w:pos="1800"/>
         </w:tabs>
-        <w:ind w:left="1800"/>
+        <w:ind w:left="2160"/>
         <w:rPr>
           <w:lang w:val="en-GB"/>
         </w:rPr>
@@ -2596,14 +2508,20 @@
     </w:p>
     <w:p>
       <w:pPr>
-        <w:rPr>
-          <w:lang w:val="en-GB"/>
-        </w:rPr>
-      </w:pPr>
-    </w:p>
-    <w:p>
-      <w:pPr>
         <w:pStyle w:val="ListParagraph"/>
+        <w:ind w:left="2160"/>
+        <w:rPr>
+          <w:lang w:val="en-GB"/>
+        </w:rPr>
+      </w:pPr>
+    </w:p>
+    <w:p>
+      <w:pPr>
+        <w:pStyle w:val="ListParagraph"/>
+        <w:numPr>
+          <w:ilvl w:val="0"/>
+          <w:numId w:val="44"/>
+        </w:numPr>
         <w:rPr>
           <w:lang w:val="en-GB"/>
         </w:rPr>
@@ -2615,7 +2533,6 @@
           <w:bCs/>
           <w:lang w:val="en-GB"/>
         </w:rPr>
-        <w:lastRenderedPageBreak/>
         <w:t>Fact_Shipping</w:t>
       </w:r>
       <w:proofErr w:type="spellEnd"/>
@@ -2744,9 +2661,29 @@
       </w:r>
       <w:r>
         <w:rPr>
-          <w:lang w:val="en-GB"/>
-        </w:rPr>
-        <w:t>: The percentage of total orders where delivery occurred after the required date.</w:t>
+          <w:b/>
+          <w:bCs/>
+          <w:lang w:val="en-GB"/>
+        </w:rPr>
+        <w:t xml:space="preserve"> per Store</w:t>
+      </w:r>
+      <w:r>
+        <w:rPr>
+          <w:lang w:val="en-GB"/>
+        </w:rPr>
+        <w:t xml:space="preserve">: The percentage of total orders </w:t>
+      </w:r>
+      <w:r>
+        <w:rPr>
+          <w:lang w:val="en-GB"/>
+        </w:rPr>
+        <w:t xml:space="preserve">per store </w:t>
+      </w:r>
+      <w:r>
+        <w:rPr>
+          <w:lang w:val="en-GB"/>
+        </w:rPr>
+        <w:t>where delivery occurred after the required date.</w:t>
       </w:r>
     </w:p>
     <w:p>
@@ -2799,7 +2736,32 @@
     </w:p>
     <w:p>
       <w:pPr>
+        <w:rPr>
+          <w:lang w:val="en-GB"/>
+        </w:rPr>
+      </w:pPr>
+    </w:p>
+    <w:p>
+      <w:pPr>
+        <w:rPr>
+          <w:lang w:val="en-GB"/>
+        </w:rPr>
+      </w:pPr>
+    </w:p>
+    <w:p>
+      <w:pPr>
+        <w:rPr>
+          <w:lang w:val="en-GB"/>
+        </w:rPr>
+      </w:pPr>
+    </w:p>
+    <w:p>
+      <w:pPr>
         <w:pStyle w:val="ListParagraph"/>
+        <w:numPr>
+          <w:ilvl w:val="0"/>
+          <w:numId w:val="44"/>
+        </w:numPr>
         <w:rPr>
           <w:lang w:val="en-GB"/>
         </w:rPr>
@@ -2811,6 +2773,7 @@
           <w:bCs/>
           <w:lang w:val="en-GB"/>
         </w:rPr>
+        <w:lastRenderedPageBreak/>
         <w:t>Fact_Orders</w:t>
       </w:r>
       <w:proofErr w:type="spellEnd"/>
@@ -2873,12 +2836,8 @@
         <w:pStyle w:val="ListParagraph"/>
         <w:numPr>
           <w:ilvl w:val="0"/>
-          <w:numId w:val="21"/>
+          <w:numId w:val="18"/>
         </w:numPr>
-        <w:tabs>
-          <w:tab w:val="num" w:pos="1080"/>
-        </w:tabs>
-        <w:ind w:left="1440"/>
         <w:rPr>
           <w:lang w:val="en-GB"/>
         </w:rPr>
@@ -2955,7 +2914,19 @@
         <w:rPr>
           <w:lang w:val="en-GB"/>
         </w:rPr>
-        <w:t xml:space="preserve">: The percentage of transactions that reach a </w:t>
+        <w:t>: The percentage of transactions that reach</w:t>
+      </w:r>
+      <w:r>
+        <w:rPr>
+          <w:lang w:val="en-GB"/>
+        </w:rPr>
+        <w:t>ed</w:t>
+      </w:r>
+      <w:r>
+        <w:rPr>
+          <w:lang w:val="en-GB"/>
+        </w:rPr>
+        <w:t xml:space="preserve"> a </w:t>
       </w:r>
       <w:r>
         <w:rPr>
@@ -2980,6 +2951,12 @@
           <w:lang w:val="en-GB"/>
         </w:rPr>
         <w:t>ed or rejected.</w:t>
+      </w:r>
+      <w:r>
+        <w:rPr>
+          <w:lang w:val="en-GB"/>
+        </w:rPr>
+        <w:t xml:space="preserve"> As well as the percentage of orders that were rejected, processed and rejected to help in comparison.</w:t>
       </w:r>
     </w:p>
     <w:p>
@@ -3003,30 +2980,20 @@
           <w:bCs/>
           <w:lang w:val="en-GB"/>
         </w:rPr>
-        <w:t>Basket Size</w:t>
-      </w:r>
-      <w:r>
-        <w:rPr>
-          <w:lang w:val="en-GB"/>
-        </w:rPr>
-        <w:t>: The average number of unique items contained within a single transaction.</w:t>
-      </w:r>
-    </w:p>
-    <w:p>
-      <w:pPr>
-        <w:pStyle w:val="ListParagraph"/>
-        <w:ind w:left="1440"/>
-        <w:rPr>
-          <w:b/>
-          <w:bCs/>
-          <w:lang w:val="en-GB"/>
-        </w:rPr>
-      </w:pPr>
-    </w:p>
-    <w:p>
-      <w:pPr>
-        <w:pStyle w:val="ListParagraph"/>
-        <w:ind w:left="1440"/>
+        <w:t>Average items count</w:t>
+      </w:r>
+      <w:r>
+        <w:rPr>
+          <w:lang w:val="en-GB"/>
+        </w:rPr>
+        <w:t>: The average number of items contained within a single transaction.</w:t>
+      </w:r>
+    </w:p>
+    <w:p>
+      <w:pPr>
+        <w:rPr>
+          <w:lang w:val="en-GB"/>
+        </w:rPr>
       </w:pPr>
     </w:p>
     <w:p>
@@ -3503,11 +3470,7 @@
               </w:rPr>
             </w:pPr>
             <w:r>
-              <w:t xml:space="preserve">Stores staff names, emails, and active status. Maintains full history by expiring the old record </w:t>
-            </w:r>
-            <w:r>
-              <w:lastRenderedPageBreak/>
-              <w:t>and inserting a new version whenever staff details change.</w:t>
+              <w:t>Stores staff names, emails, and active status. Maintains full history by expiring the old record and inserting a new version whenever staff details change.</w:t>
             </w:r>
           </w:p>
         </w:tc>
@@ -3531,7 +3494,6 @@
             </w:pPr>
             <w:proofErr w:type="spellStart"/>
             <w:r>
-              <w:lastRenderedPageBreak/>
               <w:t>Dim_Order_</w:t>
             </w:r>
             <w:r>
@@ -3574,6 +3536,17 @@
     <w:p/>
     <w:p/>
     <w:p/>
+    <w:p/>
+    <w:p/>
+    <w:p/>
+    <w:p/>
+    <w:p/>
+    <w:p/>
+    <w:p/>
+    <w:p/>
+    <w:p/>
+    <w:p/>
+    <w:p/>
     <w:p>
       <w:pPr>
         <w:pStyle w:val="ListParagraph"/>
@@ -3591,29 +3564,22 @@
           <w:b/>
           <w:bCs/>
         </w:rPr>
+        <w:lastRenderedPageBreak/>
         <w:t>Measures and Data Types</w:t>
-      </w:r>
-    </w:p>
-    <w:p>
-      <w:pPr>
-        <w:pStyle w:val="ListParagraph"/>
-      </w:pPr>
-      <w:r>
-        <w:t xml:space="preserve">Measures are the quantitative values stored in fact tables used for KPI calculations: </w:t>
       </w:r>
     </w:p>
     <w:tbl>
       <w:tblPr>
         <w:tblStyle w:val="GridTable4-Accent1"/>
-        <w:tblpPr w:leftFromText="180" w:rightFromText="180" w:vertAnchor="text" w:horzAnchor="margin" w:tblpXSpec="right" w:tblpY="203"/>
-        <w:tblW w:w="8275" w:type="dxa"/>
+        <w:tblpPr w:leftFromText="180" w:rightFromText="180" w:vertAnchor="text" w:horzAnchor="page" w:tblpX="2001" w:tblpY="732"/>
+        <w:tblW w:w="9067" w:type="dxa"/>
         <w:tblLook w:val="04A0" w:firstRow="1" w:lastRow="0" w:firstColumn="1" w:lastColumn="0" w:noHBand="0" w:noVBand="1"/>
       </w:tblPr>
       <w:tblGrid>
         <w:gridCol w:w="1870"/>
         <w:gridCol w:w="1906"/>
         <w:gridCol w:w="1710"/>
-        <w:gridCol w:w="3012"/>
+        <w:gridCol w:w="3581"/>
       </w:tblGrid>
       <w:tr>
         <w:trPr>
@@ -3693,7 +3659,7 @@
         </w:tc>
         <w:tc>
           <w:tcPr>
-            <w:tcW w:w="3078" w:type="dxa"/>
+            <w:tcW w:w="3581" w:type="dxa"/>
             <w:hideMark/>
           </w:tcPr>
           <w:p>
@@ -3734,7 +3700,6 @@
                 <w14:ligatures w14:val="none"/>
               </w:rPr>
             </w:pPr>
-            <w:proofErr w:type="spellStart"/>
             <w:r>
               <w:rPr>
                 <w:rFonts w:ascii="Arial" w:eastAsia="Times New Roman" w:hAnsi="Arial" w:cs="Arial"/>
@@ -3743,7 +3708,6 @@
               </w:rPr>
               <w:t>Fact_Sales</w:t>
             </w:r>
-            <w:proofErr w:type="spellEnd"/>
           </w:p>
         </w:tc>
         <w:tc>
@@ -3810,7 +3774,7 @@
         </w:tc>
         <w:tc>
           <w:tcPr>
-            <w:tcW w:w="3078" w:type="dxa"/>
+            <w:tcW w:w="3581" w:type="dxa"/>
             <w:hideMark/>
           </w:tcPr>
           <w:p>
@@ -3884,7 +3848,6 @@
                 <w14:ligatures w14:val="none"/>
               </w:rPr>
             </w:pPr>
-            <w:proofErr w:type="spellStart"/>
             <w:r>
               <w:rPr>
                 <w:rFonts w:ascii="Arial" w:eastAsia="Times New Roman" w:hAnsi="Arial" w:cs="Arial"/>
@@ -3893,7 +3856,6 @@
               </w:rPr>
               <w:t>Fact_Sales</w:t>
             </w:r>
-            <w:proofErr w:type="spellEnd"/>
           </w:p>
         </w:tc>
         <w:tc>
@@ -3948,7 +3910,7 @@
         </w:tc>
         <w:tc>
           <w:tcPr>
-            <w:tcW w:w="3078" w:type="dxa"/>
+            <w:tcW w:w="3581" w:type="dxa"/>
             <w:hideMark/>
           </w:tcPr>
           <w:p>
@@ -3989,7 +3951,6 @@
                 <w14:ligatures w14:val="none"/>
               </w:rPr>
             </w:pPr>
-            <w:proofErr w:type="spellStart"/>
             <w:r>
               <w:rPr>
                 <w:rFonts w:ascii="Arial" w:eastAsia="Times New Roman" w:hAnsi="Arial" w:cs="Arial"/>
@@ -3998,7 +3959,6 @@
               </w:rPr>
               <w:t>Fact_Sales</w:t>
             </w:r>
-            <w:proofErr w:type="spellEnd"/>
           </w:p>
         </w:tc>
         <w:tc>
@@ -4063,7 +4023,7 @@
         </w:tc>
         <w:tc>
           <w:tcPr>
-            <w:tcW w:w="3078" w:type="dxa"/>
+            <w:tcW w:w="3581" w:type="dxa"/>
             <w:hideMark/>
           </w:tcPr>
           <w:p>
@@ -4101,7 +4061,6 @@
                 <w14:ligatures w14:val="none"/>
               </w:rPr>
             </w:pPr>
-            <w:proofErr w:type="spellStart"/>
             <w:r>
               <w:rPr>
                 <w:rFonts w:ascii="Arial" w:eastAsia="Times New Roman" w:hAnsi="Arial" w:cs="Arial"/>
@@ -4110,7 +4069,6 @@
               </w:rPr>
               <w:t>Fact_Shipping</w:t>
             </w:r>
-            <w:proofErr w:type="spellEnd"/>
           </w:p>
         </w:tc>
         <w:tc>
@@ -4127,7 +4085,6 @@
                 <w14:ligatures w14:val="none"/>
               </w:rPr>
             </w:pPr>
-            <w:proofErr w:type="spellStart"/>
             <w:r>
               <w:rPr>
                 <w:rFonts w:ascii="Arial" w:eastAsia="Times New Roman" w:hAnsi="Arial" w:cs="Arial"/>
@@ -4138,7 +4095,6 @@
               </w:rPr>
               <w:t>ActualDays</w:t>
             </w:r>
-            <w:proofErr w:type="spellEnd"/>
           </w:p>
         </w:tc>
         <w:tc>
@@ -4167,7 +4123,7 @@
         </w:tc>
         <w:tc>
           <w:tcPr>
-            <w:tcW w:w="3078" w:type="dxa"/>
+            <w:tcW w:w="3581" w:type="dxa"/>
             <w:hideMark/>
           </w:tcPr>
           <w:p>
@@ -4244,7 +4200,6 @@
                 <w14:ligatures w14:val="none"/>
               </w:rPr>
             </w:pPr>
-            <w:proofErr w:type="spellStart"/>
             <w:r>
               <w:rPr>
                 <w:rFonts w:ascii="Arial" w:eastAsia="Times New Roman" w:hAnsi="Arial" w:cs="Arial"/>
@@ -4253,7 +4208,6 @@
               </w:rPr>
               <w:t>Fact_Shipping</w:t>
             </w:r>
-            <w:proofErr w:type="spellEnd"/>
           </w:p>
         </w:tc>
         <w:tc>
@@ -4310,7 +4264,7 @@
         </w:tc>
         <w:tc>
           <w:tcPr>
-            <w:tcW w:w="3078" w:type="dxa"/>
+            <w:tcW w:w="3581" w:type="dxa"/>
             <w:hideMark/>
           </w:tcPr>
           <w:p>
@@ -4386,7 +4340,6 @@
                 <w14:ligatures w14:val="none"/>
               </w:rPr>
             </w:pPr>
-            <w:proofErr w:type="spellStart"/>
             <w:r>
               <w:rPr>
                 <w:rFonts w:ascii="Arial" w:eastAsia="Times New Roman" w:hAnsi="Arial" w:cs="Arial"/>
@@ -4395,7 +4348,6 @@
               </w:rPr>
               <w:t>Fact_Shipping</w:t>
             </w:r>
-            <w:proofErr w:type="spellEnd"/>
           </w:p>
         </w:tc>
         <w:tc>
@@ -4452,7 +4404,7 @@
         </w:tc>
         <w:tc>
           <w:tcPr>
-            <w:tcW w:w="3078" w:type="dxa"/>
+            <w:tcW w:w="3581" w:type="dxa"/>
             <w:hideMark/>
           </w:tcPr>
           <w:p>
@@ -4539,7 +4491,6 @@
                 <w14:ligatures w14:val="none"/>
               </w:rPr>
             </w:pPr>
-            <w:proofErr w:type="spellStart"/>
             <w:r>
               <w:rPr>
                 <w:rFonts w:ascii="Arial" w:eastAsia="Times New Roman" w:hAnsi="Arial" w:cs="Arial"/>
@@ -4548,7 +4499,6 @@
               </w:rPr>
               <w:t>Fact_Orders</w:t>
             </w:r>
-            <w:proofErr w:type="spellEnd"/>
           </w:p>
         </w:tc>
         <w:tc>
@@ -4575,17 +4525,7 @@
                 <w:szCs w:val="20"/>
                 <w14:ligatures w14:val="none"/>
               </w:rPr>
-              <w:t>Order_</w:t>
-            </w:r>
-            <w:r>
-              <w:rPr>
-                <w:rFonts w:ascii="Arial" w:eastAsia="Times New Roman" w:hAnsi="Arial" w:cs="Arial"/>
-                <w:kern w:val="0"/>
-                <w:sz w:val="20"/>
-                <w:szCs w:val="20"/>
-                <w14:ligatures w14:val="none"/>
-              </w:rPr>
-              <w:t>Total_Value</w:t>
+              <w:t>Order_Total_Value</w:t>
             </w:r>
           </w:p>
         </w:tc>
@@ -4625,7 +4565,7 @@
         </w:tc>
         <w:tc>
           <w:tcPr>
-            <w:tcW w:w="3078" w:type="dxa"/>
+            <w:tcW w:w="3581" w:type="dxa"/>
             <w:hideMark/>
           </w:tcPr>
           <w:p>
@@ -4663,7 +4603,6 @@
                 <w14:ligatures w14:val="none"/>
               </w:rPr>
             </w:pPr>
-            <w:proofErr w:type="spellStart"/>
             <w:r>
               <w:rPr>
                 <w:rFonts w:ascii="Arial" w:eastAsia="Times New Roman" w:hAnsi="Arial" w:cs="Arial"/>
@@ -4672,7 +4611,6 @@
               </w:rPr>
               <w:t>Fact_Orders</w:t>
             </w:r>
-            <w:proofErr w:type="spellEnd"/>
           </w:p>
         </w:tc>
         <w:tc>
@@ -4695,23 +4633,7 @@
                 <w:kern w:val="0"/>
                 <w14:ligatures w14:val="none"/>
               </w:rPr>
-              <w:t>Item</w:t>
-            </w:r>
-            <w:r>
-              <w:rPr>
-                <w:rFonts w:ascii="Arial" w:eastAsia="Times New Roman" w:hAnsi="Arial" w:cs="Arial"/>
-                <w:kern w:val="0"/>
-                <w14:ligatures w14:val="none"/>
-              </w:rPr>
-              <w:t>_</w:t>
-            </w:r>
-            <w:r>
-              <w:rPr>
-                <w:rFonts w:ascii="Arial" w:eastAsia="Times New Roman" w:hAnsi="Arial" w:cs="Arial"/>
-                <w:kern w:val="0"/>
-                <w14:ligatures w14:val="none"/>
-              </w:rPr>
-              <w:t>Count</w:t>
+              <w:t>Item_Count</w:t>
             </w:r>
           </w:p>
         </w:tc>
@@ -4741,7 +4663,7 @@
         </w:tc>
         <w:tc>
           <w:tcPr>
-            <w:tcW w:w="3078" w:type="dxa"/>
+            <w:tcW w:w="3581" w:type="dxa"/>
             <w:hideMark/>
           </w:tcPr>
           <w:p>
@@ -4777,79 +4699,14 @@
     </w:tbl>
     <w:p>
       <w:pPr>
-        <w:rPr>
-          <w:b/>
-          <w:bCs/>
-        </w:rPr>
-      </w:pPr>
-    </w:p>
-    <w:p>
-      <w:pPr>
-        <w:rPr>
-          <w:b/>
-          <w:bCs/>
-        </w:rPr>
-      </w:pPr>
-    </w:p>
-    <w:p>
-      <w:pPr>
-        <w:rPr>
-          <w:b/>
-          <w:bCs/>
-        </w:rPr>
-      </w:pPr>
-    </w:p>
-    <w:p>
-      <w:pPr>
-        <w:rPr>
-          <w:b/>
-          <w:bCs/>
-        </w:rPr>
-      </w:pPr>
-    </w:p>
-    <w:p>
-      <w:pPr>
-        <w:rPr>
-          <w:b/>
-          <w:bCs/>
-        </w:rPr>
-      </w:pPr>
-    </w:p>
-    <w:p>
-      <w:pPr>
-        <w:rPr>
-          <w:b/>
-          <w:bCs/>
-        </w:rPr>
-      </w:pPr>
-    </w:p>
-    <w:p>
-      <w:pPr>
-        <w:rPr>
-          <w:b/>
-          <w:bCs/>
-        </w:rPr>
-      </w:pPr>
-    </w:p>
-    <w:p>
-      <w:pPr>
-        <w:rPr>
-          <w:b/>
-          <w:bCs/>
-        </w:rPr>
-      </w:pPr>
-    </w:p>
-    <w:p>
-      <w:pPr>
-        <w:rPr>
-          <w:b/>
-          <w:bCs/>
-        </w:rPr>
-      </w:pPr>
-    </w:p>
-    <w:p>
-      <w:pPr>
         <w:pStyle w:val="ListParagraph"/>
+      </w:pPr>
+      <w:r>
+        <w:t xml:space="preserve">Measures are the quantitative values stored in fact tables used for KPI calculations: </w:t>
+      </w:r>
+    </w:p>
+    <w:p>
+      <w:pPr>
         <w:rPr>
           <w:b/>
           <w:bCs/>
@@ -4873,7 +4730,6 @@
           <w:b/>
           <w:bCs/>
         </w:rPr>
-        <w:lastRenderedPageBreak/>
         <w:t>Galaxy Schema</w:t>
       </w:r>
       <w:r>
@@ -4911,13 +4767,13 @@
           <w:color w:val="FFFFFF" w:themeColor="background1"/>
         </w:rPr>
         <w:drawing>
-          <wp:anchor distT="0" distB="0" distL="114300" distR="114300" simplePos="0" relativeHeight="251662848" behindDoc="0" locked="0" layoutInCell="1" allowOverlap="1" wp14:anchorId="7268B1D3" wp14:editId="5D322CCD">
+          <wp:anchor distT="0" distB="0" distL="114300" distR="114300" simplePos="0" relativeHeight="251662848" behindDoc="0" locked="0" layoutInCell="1" allowOverlap="1" wp14:anchorId="7268B1D3" wp14:editId="18F9A733">
             <wp:simplePos x="0" y="0"/>
             <wp:positionH relativeFrom="page">
-              <wp:posOffset>121285</wp:posOffset>
+              <wp:posOffset>114935</wp:posOffset>
             </wp:positionH>
             <wp:positionV relativeFrom="paragraph">
-              <wp:posOffset>222531</wp:posOffset>
+              <wp:posOffset>400050</wp:posOffset>
             </wp:positionV>
             <wp:extent cx="7349490" cy="3819525"/>
             <wp:effectExtent l="0" t="0" r="3810" b="9525"/>
@@ -5268,20 +5124,11 @@
           <w:b/>
           <w:bCs/>
         </w:rPr>
-        <w:t xml:space="preserve">Flow </w:t>
-      </w:r>
-      <w:proofErr w:type="gramStart"/>
-      <w:r>
-        <w:rPr>
-          <w:b/>
-          <w:bCs/>
-        </w:rPr>
-        <w:t>Type</w:t>
+        <w:t>Flow Type</w:t>
       </w:r>
       <w:r>
         <w:t>:</w:t>
       </w:r>
-      <w:proofErr w:type="gramEnd"/>
       <w:r>
         <w:t xml:space="preserve"> is </w:t>
       </w:r>
@@ -5744,17 +5591,8 @@
           <w:rFonts w:eastAsia="Arial" w:cs="Arial"/>
           <w:color w:val="222222"/>
         </w:rPr>
-        <w:t xml:space="preserve">. No SSIS Data Flow </w:t>
-      </w:r>
-      <w:proofErr w:type="gramStart"/>
-      <w:r>
-        <w:rPr>
-          <w:rFonts w:eastAsia="Arial" w:cs="Arial"/>
-          <w:color w:val="222222"/>
-        </w:rPr>
-        <w:t>needed</w:t>
-      </w:r>
-      <w:proofErr w:type="gramEnd"/>
+        <w:t>. No SSIS Data Flow needed</w:t>
+      </w:r>
       <w:r>
         <w:rPr>
           <w:rFonts w:eastAsia="Arial" w:cs="Arial"/>
@@ -5847,10 +5685,10 @@
           <w:noProof/>
         </w:rPr>
         <w:drawing>
-          <wp:anchor distT="0" distB="0" distL="114300" distR="114300" simplePos="0" relativeHeight="251666944" behindDoc="0" locked="0" layoutInCell="1" allowOverlap="1" wp14:anchorId="5083EB37" wp14:editId="01495BF9">
+          <wp:anchor distT="0" distB="0" distL="114300" distR="114300" simplePos="0" relativeHeight="251666944" behindDoc="0" locked="0" layoutInCell="1" allowOverlap="1" wp14:anchorId="5083EB37" wp14:editId="645B2BE3">
             <wp:simplePos x="0" y="0"/>
             <wp:positionH relativeFrom="margin">
-              <wp:align>left</wp:align>
+              <wp:align>right</wp:align>
             </wp:positionH>
             <wp:positionV relativeFrom="paragraph">
               <wp:posOffset>329565</wp:posOffset>
@@ -5978,20 +5816,11 @@
           <w:b/>
           <w:bCs/>
         </w:rPr>
-        <w:t xml:space="preserve">Flow </w:t>
-      </w:r>
-      <w:proofErr w:type="gramStart"/>
-      <w:r>
-        <w:rPr>
-          <w:b/>
-          <w:bCs/>
-        </w:rPr>
-        <w:t>Type</w:t>
+        <w:t>Flow Type</w:t>
       </w:r>
       <w:r>
         <w:t>:</w:t>
       </w:r>
-      <w:proofErr w:type="gramEnd"/>
       <w:r>
         <w:t xml:space="preserve"> is Data Flow</w:t>
       </w:r>
@@ -6483,6 +6312,7 @@
         <w:lastRenderedPageBreak/>
         <w:t>Dim_Geography.dtsx</w:t>
       </w:r>
+      <w:proofErr w:type="spellEnd"/>
       <w:r>
         <w:rPr>
           <w:rFonts w:eastAsia="Wingdings" w:cs="Wingdings"/>
@@ -6491,7 +6321,6 @@
         </w:rPr>
         <w:t>:</w:t>
       </w:r>
-      <w:proofErr w:type="spellEnd"/>
     </w:p>
     <w:p>
       <w:pPr>
@@ -7632,7 +7461,7 @@
           <w:noProof/>
         </w:rPr>
         <w:drawing>
-          <wp:anchor distT="0" distB="0" distL="114300" distR="114300" simplePos="0" relativeHeight="251675136" behindDoc="0" locked="0" layoutInCell="1" allowOverlap="1" wp14:anchorId="0BF863E1" wp14:editId="7C2B9CF1">
+          <wp:anchor distT="0" distB="0" distL="114300" distR="114300" simplePos="0" relativeHeight="251675136" behindDoc="0" locked="0" layoutInCell="1" allowOverlap="1" wp14:anchorId="0BF863E1" wp14:editId="22AAA483">
             <wp:simplePos x="0" y="0"/>
             <wp:positionH relativeFrom="margin">
               <wp:posOffset>228600</wp:posOffset>
@@ -7806,17 +7635,8 @@
           <w:rFonts w:eastAsia="Arial" w:cs="Arial"/>
           <w:color w:val="222222"/>
         </w:rPr>
-        <w:t xml:space="preserve">o </w:t>
-      </w:r>
-      <w:proofErr w:type="gramStart"/>
-      <w:r>
-        <w:rPr>
-          <w:rFonts w:eastAsia="Arial" w:cs="Arial"/>
-          <w:color w:val="222222"/>
-        </w:rPr>
-        <w:t>Match</w:t>
-      </w:r>
-      <w:proofErr w:type="gramEnd"/>
+        <w:t>o Match</w:t>
+      </w:r>
       <w:r>
         <w:rPr>
           <w:rFonts w:eastAsia="Arial" w:cs="Arial"/>
@@ -8609,30 +8429,14 @@
           <w:rFonts w:eastAsia="Arial" w:cs="Arial"/>
           <w:color w:val="222222"/>
         </w:rPr>
-        <w:t xml:space="preserve">If there is no </w:t>
-      </w:r>
-      <w:proofErr w:type="gramStart"/>
-      <w:r>
-        <w:rPr>
-          <w:rFonts w:eastAsia="Arial" w:cs="Arial"/>
-          <w:color w:val="222222"/>
-        </w:rPr>
-        <w:t>m</w:t>
-      </w:r>
-      <w:r>
-        <w:rPr>
-          <w:rFonts w:eastAsia="Arial" w:cs="Arial"/>
-          <w:color w:val="222222"/>
-        </w:rPr>
-        <w:t>atch</w:t>
-      </w:r>
-      <w:proofErr w:type="gramEnd"/>
-      <w:r>
-        <w:rPr>
-          <w:rFonts w:eastAsia="Arial" w:cs="Arial"/>
-          <w:color w:val="222222"/>
-        </w:rPr>
-        <w:t xml:space="preserve"> </w:t>
+        <w:t>If there is no m</w:t>
+      </w:r>
+      <w:r>
+        <w:rPr>
+          <w:rFonts w:eastAsia="Arial" w:cs="Arial"/>
+          <w:color w:val="222222"/>
+        </w:rPr>
+        <w:t xml:space="preserve">atch </w:t>
       </w:r>
       <w:r>
         <w:rPr>
@@ -9677,8 +9481,8 @@
           <w:noProof/>
         </w:rPr>
         <w:drawing>
-          <wp:inline distT="0" distB="0" distL="0" distR="0" wp14:anchorId="1572186D" wp14:editId="051FC3D8">
-            <wp:extent cx="5724525" cy="2733699"/>
+          <wp:inline distT="0" distB="0" distL="0" distR="0" wp14:anchorId="1572186D" wp14:editId="7CFDDEE1">
+            <wp:extent cx="5724475" cy="2425700"/>
             <wp:effectExtent l="0" t="0" r="0" b="0"/>
             <wp:docPr id="867867444" name="drawing"/>
             <wp:cNvGraphicFramePr>
@@ -9691,7 +9495,7 @@
                     <pic:cNvPr id="867867444" name="Picture 867867444"/>
                     <pic:cNvPicPr/>
                   </pic:nvPicPr>
-                  <pic:blipFill>
+                  <pic:blipFill rotWithShape="1">
                     <a:blip r:embed="rId33">
                       <a:extLst>
                         <a:ext uri="{28A0092B-C50C-407E-A947-70E740481C1C}">
@@ -9699,7 +9503,224 @@
                         </a:ext>
                       </a:extLst>
                     </a:blip>
-                    <a:srcRect t="3846" b="11242"/>
+                    <a:srcRect t="3846" b="20808"/>
+                    <a:stretch>
+                      <a:fillRect/>
+                    </a:stretch>
+                  </pic:blipFill>
+                  <pic:spPr bwMode="auto">
+                    <a:xfrm>
+                      <a:off x="0" y="0"/>
+                      <a:ext cx="5724525" cy="2425721"/>
+                    </a:xfrm>
+                    <a:prstGeom prst="rect">
+                      <a:avLst/>
+                    </a:prstGeom>
+                    <a:ln>
+                      <a:noFill/>
+                    </a:ln>
+                    <a:extLst>
+                      <a:ext uri="{53640926-AAD7-44D8-BBD7-CCE9431645EC}">
+                        <a14:shadowObscured xmlns:a14="http://schemas.microsoft.com/office/drawing/2010/main"/>
+                      </a:ext>
+                    </a:extLst>
+                  </pic:spPr>
+                </pic:pic>
+              </a:graphicData>
+            </a:graphic>
+          </wp:inline>
+        </w:drawing>
+      </w:r>
+    </w:p>
+    <w:p>
+      <w:pPr>
+        <w:pStyle w:val="ListParagraph"/>
+        <w:numPr>
+          <w:ilvl w:val="0"/>
+          <w:numId w:val="6"/>
+        </w:numPr>
+        <w:rPr>
+          <w:u w:val="single"/>
+        </w:rPr>
+      </w:pPr>
+      <w:r>
+        <w:rPr>
+          <w:b/>
+          <w:bCs/>
+          <w:u w:val="single"/>
+        </w:rPr>
+        <w:t xml:space="preserve">Queries on each fact </w:t>
+      </w:r>
+      <w:r>
+        <w:rPr>
+          <w:b/>
+          <w:bCs/>
+          <w:u w:val="single"/>
+        </w:rPr>
+        <w:t>table</w:t>
+      </w:r>
+      <w:r>
+        <w:rPr>
+          <w:b/>
+          <w:bCs/>
+          <w:u w:val="single"/>
+        </w:rPr>
+        <w:t xml:space="preserve"> </w:t>
+      </w:r>
+    </w:p>
+    <w:p>
+      <w:pPr>
+        <w:pStyle w:val="ListParagraph"/>
+        <w:numPr>
+          <w:ilvl w:val="0"/>
+          <w:numId w:val="38"/>
+        </w:numPr>
+        <w:rPr>
+          <w:b/>
+          <w:bCs/>
+        </w:rPr>
+      </w:pPr>
+      <w:r>
+        <w:rPr>
+          <w:b/>
+          <w:bCs/>
+        </w:rPr>
+        <w:t xml:space="preserve">Fact_Sales </w:t>
+      </w:r>
+      <w:r>
+        <w:rPr>
+          <w:b/>
+          <w:bCs/>
+        </w:rPr>
+        <w:t>queries: -</w:t>
+      </w:r>
+    </w:p>
+    <w:p>
+      <w:pPr>
+        <w:pStyle w:val="ListParagraph"/>
+        <w:numPr>
+          <w:ilvl w:val="0"/>
+          <w:numId w:val="39"/>
+        </w:numPr>
+        <w:rPr>
+          <w:b/>
+          <w:bCs/>
+        </w:rPr>
+      </w:pPr>
+      <w:r>
+        <w:rPr>
+          <w:b/>
+          <w:bCs/>
+        </w:rPr>
+        <w:t>Top Selling Products by Quantity.</w:t>
+      </w:r>
+    </w:p>
+    <w:p>
+      <w:pPr>
+        <w:ind w:firstLine="360"/>
+      </w:pPr>
+      <w:r>
+        <w:rPr>
+          <w:noProof/>
+        </w:rPr>
+        <w:drawing>
+          <wp:inline distT="0" distB="0" distL="0" distR="0" wp14:anchorId="2C7EDA76" wp14:editId="1D101E5E">
+            <wp:extent cx="5731510" cy="3498850"/>
+            <wp:effectExtent l="0" t="0" r="2540" b="6350"/>
+            <wp:docPr id="1815116924" name="Picture 1"/>
+            <wp:cNvGraphicFramePr>
+              <a:graphicFrameLocks xmlns:a="http://schemas.openxmlformats.org/drawingml/2006/main" noChangeAspect="1"/>
+            </wp:cNvGraphicFramePr>
+            <a:graphic xmlns:a="http://schemas.openxmlformats.org/drawingml/2006/main">
+              <a:graphicData uri="http://schemas.openxmlformats.org/drawingml/2006/picture">
+                <pic:pic xmlns:pic="http://schemas.openxmlformats.org/drawingml/2006/picture">
+                  <pic:nvPicPr>
+                    <pic:cNvPr id="1815116924" name=""/>
+                    <pic:cNvPicPr/>
+                  </pic:nvPicPr>
+                  <pic:blipFill rotWithShape="1">
+                    <a:blip r:embed="rId34"/>
+                    <a:srcRect b="5812"/>
+                    <a:stretch>
+                      <a:fillRect/>
+                    </a:stretch>
+                  </pic:blipFill>
+                  <pic:spPr bwMode="auto">
+                    <a:xfrm>
+                      <a:off x="0" y="0"/>
+                      <a:ext cx="5731510" cy="3498850"/>
+                    </a:xfrm>
+                    <a:prstGeom prst="rect">
+                      <a:avLst/>
+                    </a:prstGeom>
+                    <a:ln>
+                      <a:noFill/>
+                    </a:ln>
+                    <a:extLst>
+                      <a:ext uri="{53640926-AAD7-44D8-BBD7-CCE9431645EC}">
+                        <a14:shadowObscured xmlns:a14="http://schemas.microsoft.com/office/drawing/2010/main"/>
+                      </a:ext>
+                    </a:extLst>
+                  </pic:spPr>
+                </pic:pic>
+              </a:graphicData>
+            </a:graphic>
+          </wp:inline>
+        </w:drawing>
+      </w:r>
+    </w:p>
+    <w:p>
+      <w:pPr>
+        <w:pStyle w:val="ListParagraph"/>
+        <w:numPr>
+          <w:ilvl w:val="0"/>
+          <w:numId w:val="40"/>
+        </w:numPr>
+        <w:rPr>
+          <w:b/>
+          <w:bCs/>
+        </w:rPr>
+      </w:pPr>
+      <w:r>
+        <w:rPr>
+          <w:b/>
+          <w:bCs/>
+        </w:rPr>
+        <w:lastRenderedPageBreak/>
+        <w:t>Total Net Revenue by Brand.</w:t>
+      </w:r>
+    </w:p>
+    <w:p>
+      <w:pPr>
+        <w:ind w:firstLine="360"/>
+        <w:rPr>
+          <w:b/>
+          <w:bCs/>
+        </w:rPr>
+      </w:pPr>
+      <w:r>
+        <w:rPr>
+          <w:b/>
+          <w:bCs/>
+          <w:noProof/>
+        </w:rPr>
+        <w:drawing>
+          <wp:inline distT="0" distB="0" distL="0" distR="0" wp14:anchorId="33F09B6D" wp14:editId="31FD773D">
+            <wp:extent cx="5731510" cy="3595370"/>
+            <wp:effectExtent l="0" t="0" r="2540" b="5080"/>
+            <wp:docPr id="921242189" name="Picture 1"/>
+            <wp:cNvGraphicFramePr>
+              <a:graphicFrameLocks xmlns:a="http://schemas.openxmlformats.org/drawingml/2006/main" noChangeAspect="1"/>
+            </wp:cNvGraphicFramePr>
+            <a:graphic xmlns:a="http://schemas.openxmlformats.org/drawingml/2006/main">
+              <a:graphicData uri="http://schemas.openxmlformats.org/drawingml/2006/picture">
+                <pic:pic xmlns:pic="http://schemas.openxmlformats.org/drawingml/2006/picture">
+                  <pic:nvPicPr>
+                    <pic:cNvPr id="921242189" name=""/>
+                    <pic:cNvPicPr/>
+                  </pic:nvPicPr>
+                  <pic:blipFill>
+                    <a:blip r:embed="rId35"/>
                     <a:stretch>
                       <a:fillRect/>
                     </a:stretch>
@@ -9707,7 +9728,7 @@
                   <pic:spPr>
                     <a:xfrm>
                       <a:off x="0" y="0"/>
-                      <a:ext cx="5724525" cy="2733699"/>
+                      <a:ext cx="5731510" cy="3595370"/>
                     </a:xfrm>
                     <a:prstGeom prst="rect">
                       <a:avLst/>
@@ -9720,7 +9741,426 @@
         </w:drawing>
       </w:r>
     </w:p>
-    <w:p/>
+    <w:p>
+      <w:pPr>
+        <w:ind w:firstLine="360"/>
+        <w:rPr>
+          <w:b/>
+          <w:bCs/>
+        </w:rPr>
+      </w:pPr>
+    </w:p>
+    <w:p>
+      <w:pPr>
+        <w:pStyle w:val="ListParagraph"/>
+        <w:numPr>
+          <w:ilvl w:val="0"/>
+          <w:numId w:val="38"/>
+        </w:numPr>
+        <w:rPr>
+          <w:b/>
+          <w:bCs/>
+        </w:rPr>
+      </w:pPr>
+      <w:r>
+        <w:rPr>
+          <w:b/>
+          <w:bCs/>
+        </w:rPr>
+        <w:t xml:space="preserve">Fact_Shipping </w:t>
+      </w:r>
+      <w:proofErr w:type="gramStart"/>
+      <w:r>
+        <w:rPr>
+          <w:b/>
+          <w:bCs/>
+        </w:rPr>
+        <w:t>queries:-</w:t>
+      </w:r>
+      <w:proofErr w:type="gramEnd"/>
+    </w:p>
+    <w:p>
+      <w:pPr>
+        <w:pStyle w:val="ListParagraph"/>
+        <w:numPr>
+          <w:ilvl w:val="0"/>
+          <w:numId w:val="41"/>
+        </w:numPr>
+        <w:rPr>
+          <w:b/>
+          <w:bCs/>
+        </w:rPr>
+      </w:pPr>
+      <w:r>
+        <w:rPr>
+          <w:b/>
+          <w:bCs/>
+        </w:rPr>
+        <w:t>Late Shipment Rate per Store.</w:t>
+      </w:r>
+    </w:p>
+    <w:p>
+      <w:pPr>
+        <w:ind w:firstLine="360"/>
+      </w:pPr>
+      <w:r>
+        <w:rPr>
+          <w:noProof/>
+        </w:rPr>
+        <w:drawing>
+          <wp:inline distT="0" distB="0" distL="0" distR="0" wp14:anchorId="7E8BAC92" wp14:editId="18EF5399">
+            <wp:extent cx="5731510" cy="2101850"/>
+            <wp:effectExtent l="0" t="0" r="2540" b="0"/>
+            <wp:docPr id="783204833" name="Picture 1"/>
+            <wp:cNvGraphicFramePr>
+              <a:graphicFrameLocks xmlns:a="http://schemas.openxmlformats.org/drawingml/2006/main" noChangeAspect="1"/>
+            </wp:cNvGraphicFramePr>
+            <a:graphic xmlns:a="http://schemas.openxmlformats.org/drawingml/2006/main">
+              <a:graphicData uri="http://schemas.openxmlformats.org/drawingml/2006/picture">
+                <pic:pic xmlns:pic="http://schemas.openxmlformats.org/drawingml/2006/picture">
+                  <pic:nvPicPr>
+                    <pic:cNvPr id="783204833" name=""/>
+                    <pic:cNvPicPr/>
+                  </pic:nvPicPr>
+                  <pic:blipFill>
+                    <a:blip r:embed="rId36"/>
+                    <a:stretch>
+                      <a:fillRect/>
+                    </a:stretch>
+                  </pic:blipFill>
+                  <pic:spPr>
+                    <a:xfrm>
+                      <a:off x="0" y="0"/>
+                      <a:ext cx="5731510" cy="2101850"/>
+                    </a:xfrm>
+                    <a:prstGeom prst="rect">
+                      <a:avLst/>
+                    </a:prstGeom>
+                  </pic:spPr>
+                </pic:pic>
+              </a:graphicData>
+            </a:graphic>
+          </wp:inline>
+        </w:drawing>
+      </w:r>
+    </w:p>
+    <w:p>
+      <w:pPr>
+        <w:pStyle w:val="ListParagraph"/>
+        <w:numPr>
+          <w:ilvl w:val="0"/>
+          <w:numId w:val="42"/>
+        </w:numPr>
+        <w:rPr>
+          <w:b/>
+          <w:bCs/>
+        </w:rPr>
+      </w:pPr>
+      <w:r>
+        <w:rPr>
+          <w:b/>
+          <w:bCs/>
+          <w:noProof/>
+        </w:rPr>
+        <w:lastRenderedPageBreak/>
+        <w:drawing>
+          <wp:anchor distT="0" distB="0" distL="114300" distR="114300" simplePos="0" relativeHeight="251685376" behindDoc="0" locked="0" layoutInCell="1" allowOverlap="1" wp14:anchorId="58F06803" wp14:editId="7D20EA5D">
+            <wp:simplePos x="0" y="0"/>
+            <wp:positionH relativeFrom="column">
+              <wp:posOffset>238125</wp:posOffset>
+            </wp:positionH>
+            <wp:positionV relativeFrom="paragraph">
+              <wp:posOffset>494665</wp:posOffset>
+            </wp:positionV>
+            <wp:extent cx="5731510" cy="1450975"/>
+            <wp:effectExtent l="0" t="0" r="2540" b="0"/>
+            <wp:wrapSquare wrapText="bothSides"/>
+            <wp:docPr id="894579020" name="Picture 1"/>
+            <wp:cNvGraphicFramePr>
+              <a:graphicFrameLocks xmlns:a="http://schemas.openxmlformats.org/drawingml/2006/main" noChangeAspect="1"/>
+            </wp:cNvGraphicFramePr>
+            <a:graphic xmlns:a="http://schemas.openxmlformats.org/drawingml/2006/main">
+              <a:graphicData uri="http://schemas.openxmlformats.org/drawingml/2006/picture">
+                <pic:pic xmlns:pic="http://schemas.openxmlformats.org/drawingml/2006/picture">
+                  <pic:nvPicPr>
+                    <pic:cNvPr id="894579020" name=""/>
+                    <pic:cNvPicPr/>
+                  </pic:nvPicPr>
+                  <pic:blipFill>
+                    <a:blip r:embed="rId37">
+                      <a:extLst>
+                        <a:ext uri="{28A0092B-C50C-407E-A947-70E740481C1C}">
+                          <a14:useLocalDpi xmlns:a14="http://schemas.microsoft.com/office/drawing/2010/main" val="0"/>
+                        </a:ext>
+                      </a:extLst>
+                    </a:blip>
+                    <a:stretch>
+                      <a:fillRect/>
+                    </a:stretch>
+                  </pic:blipFill>
+                  <pic:spPr>
+                    <a:xfrm>
+                      <a:off x="0" y="0"/>
+                      <a:ext cx="5731510" cy="1450975"/>
+                    </a:xfrm>
+                    <a:prstGeom prst="rect">
+                      <a:avLst/>
+                    </a:prstGeom>
+                  </pic:spPr>
+                </pic:pic>
+              </a:graphicData>
+            </a:graphic>
+          </wp:anchor>
+        </w:drawing>
+      </w:r>
+      <w:r>
+        <w:rPr>
+          <w:b/>
+          <w:bCs/>
+        </w:rPr>
+        <w:t>Average Fulfillment Time</w:t>
+      </w:r>
+      <w:r>
+        <w:rPr>
+          <w:b/>
+          <w:bCs/>
+        </w:rPr>
+        <w:t>.</w:t>
+      </w:r>
+    </w:p>
+    <w:p>
+      <w:pPr>
+        <w:rPr>
+          <w:b/>
+          <w:bCs/>
+        </w:rPr>
+      </w:pPr>
+      <w:r>
+        <w:rPr>
+          <w:b/>
+          <w:bCs/>
+        </w:rPr>
+        <w:t xml:space="preserve">      </w:t>
+      </w:r>
+    </w:p>
+    <w:p>
+      <w:pPr>
+        <w:pStyle w:val="ListParagraph"/>
+        <w:numPr>
+          <w:ilvl w:val="0"/>
+          <w:numId w:val="38"/>
+        </w:numPr>
+        <w:rPr>
+          <w:b/>
+          <w:bCs/>
+        </w:rPr>
+      </w:pPr>
+      <w:r>
+        <w:rPr>
+          <w:b/>
+          <w:bCs/>
+        </w:rPr>
+        <w:t xml:space="preserve">Fact_Orders </w:t>
+      </w:r>
+      <w:proofErr w:type="gramStart"/>
+      <w:r>
+        <w:rPr>
+          <w:b/>
+          <w:bCs/>
+        </w:rPr>
+        <w:t>queries:-</w:t>
+      </w:r>
+      <w:proofErr w:type="gramEnd"/>
+    </w:p>
+    <w:p>
+      <w:pPr>
+        <w:pStyle w:val="ListParagraph"/>
+        <w:numPr>
+          <w:ilvl w:val="0"/>
+          <w:numId w:val="43"/>
+        </w:numPr>
+        <w:rPr>
+          <w:b/>
+          <w:bCs/>
+        </w:rPr>
+      </w:pPr>
+      <w:r>
+        <w:rPr>
+          <w:b/>
+          <w:bCs/>
+          <w:noProof/>
+        </w:rPr>
+        <w:drawing>
+          <wp:anchor distT="0" distB="0" distL="114300" distR="114300" simplePos="0" relativeHeight="251686400" behindDoc="0" locked="0" layoutInCell="1" allowOverlap="1" wp14:anchorId="70539B3C" wp14:editId="06C38807">
+            <wp:simplePos x="0" y="0"/>
+            <wp:positionH relativeFrom="column">
+              <wp:posOffset>228600</wp:posOffset>
+            </wp:positionH>
+            <wp:positionV relativeFrom="paragraph">
+              <wp:posOffset>457835</wp:posOffset>
+            </wp:positionV>
+            <wp:extent cx="5731510" cy="2052320"/>
+            <wp:effectExtent l="0" t="0" r="2540" b="5080"/>
+            <wp:wrapSquare wrapText="bothSides"/>
+            <wp:docPr id="544036264" name="Picture 1"/>
+            <wp:cNvGraphicFramePr>
+              <a:graphicFrameLocks xmlns:a="http://schemas.openxmlformats.org/drawingml/2006/main" noChangeAspect="1"/>
+            </wp:cNvGraphicFramePr>
+            <a:graphic xmlns:a="http://schemas.openxmlformats.org/drawingml/2006/main">
+              <a:graphicData uri="http://schemas.openxmlformats.org/drawingml/2006/picture">
+                <pic:pic xmlns:pic="http://schemas.openxmlformats.org/drawingml/2006/picture">
+                  <pic:nvPicPr>
+                    <pic:cNvPr id="544036264" name=""/>
+                    <pic:cNvPicPr/>
+                  </pic:nvPicPr>
+                  <pic:blipFill>
+                    <a:blip r:embed="rId38">
+                      <a:extLst>
+                        <a:ext uri="{28A0092B-C50C-407E-A947-70E740481C1C}">
+                          <a14:useLocalDpi xmlns:a14="http://schemas.microsoft.com/office/drawing/2010/main" val="0"/>
+                        </a:ext>
+                      </a:extLst>
+                    </a:blip>
+                    <a:stretch>
+                      <a:fillRect/>
+                    </a:stretch>
+                  </pic:blipFill>
+                  <pic:spPr>
+                    <a:xfrm>
+                      <a:off x="0" y="0"/>
+                      <a:ext cx="5731510" cy="2052320"/>
+                    </a:xfrm>
+                    <a:prstGeom prst="rect">
+                      <a:avLst/>
+                    </a:prstGeom>
+                  </pic:spPr>
+                </pic:pic>
+              </a:graphicData>
+            </a:graphic>
+          </wp:anchor>
+        </w:drawing>
+      </w:r>
+      <w:r>
+        <w:rPr>
+          <w:b/>
+          <w:bCs/>
+        </w:rPr>
+        <w:t>Order Success Rate.</w:t>
+      </w:r>
+    </w:p>
+    <w:p>
+      <w:pPr>
+        <w:rPr>
+          <w:b/>
+          <w:bCs/>
+        </w:rPr>
+      </w:pPr>
+      <w:r>
+        <w:rPr>
+          <w:b/>
+          <w:bCs/>
+        </w:rPr>
+        <w:t xml:space="preserve">      </w:t>
+      </w:r>
+    </w:p>
+    <w:p>
+      <w:pPr>
+        <w:pStyle w:val="ListParagraph"/>
+        <w:numPr>
+          <w:ilvl w:val="0"/>
+          <w:numId w:val="43"/>
+        </w:numPr>
+        <w:rPr>
+          <w:b/>
+          <w:bCs/>
+        </w:rPr>
+      </w:pPr>
+      <w:r>
+        <w:rPr>
+          <w:b/>
+          <w:bCs/>
+        </w:rPr>
+        <w:t xml:space="preserve">Average </w:t>
+      </w:r>
+      <w:r>
+        <w:rPr>
+          <w:b/>
+          <w:bCs/>
+        </w:rPr>
+        <w:t>items count</w:t>
+      </w:r>
+      <w:r>
+        <w:rPr>
+          <w:b/>
+          <w:bCs/>
+        </w:rPr>
+        <w:t>.</w:t>
+      </w:r>
+    </w:p>
+    <w:p>
+      <w:pPr>
+        <w:rPr>
+          <w:b/>
+          <w:bCs/>
+        </w:rPr>
+      </w:pPr>
+      <w:r>
+        <w:rPr>
+          <w:b/>
+          <w:bCs/>
+          <w:noProof/>
+        </w:rPr>
+        <w:drawing>
+          <wp:anchor distT="0" distB="0" distL="114300" distR="114300" simplePos="0" relativeHeight="251687424" behindDoc="0" locked="0" layoutInCell="1" allowOverlap="1" wp14:anchorId="3DED7DD3" wp14:editId="5FBA1685">
+            <wp:simplePos x="0" y="0"/>
+            <wp:positionH relativeFrom="column">
+              <wp:posOffset>247650</wp:posOffset>
+            </wp:positionH>
+            <wp:positionV relativeFrom="paragraph">
+              <wp:posOffset>0</wp:posOffset>
+            </wp:positionV>
+            <wp:extent cx="5731510" cy="1595755"/>
+            <wp:effectExtent l="0" t="0" r="2540" b="4445"/>
+            <wp:wrapSquare wrapText="bothSides"/>
+            <wp:docPr id="862068293" name="Picture 1"/>
+            <wp:cNvGraphicFramePr>
+              <a:graphicFrameLocks xmlns:a="http://schemas.openxmlformats.org/drawingml/2006/main" noChangeAspect="1"/>
+            </wp:cNvGraphicFramePr>
+            <a:graphic xmlns:a="http://schemas.openxmlformats.org/drawingml/2006/main">
+              <a:graphicData uri="http://schemas.openxmlformats.org/drawingml/2006/picture">
+                <pic:pic xmlns:pic="http://schemas.openxmlformats.org/drawingml/2006/picture">
+                  <pic:nvPicPr>
+                    <pic:cNvPr id="862068293" name=""/>
+                    <pic:cNvPicPr/>
+                  </pic:nvPicPr>
+                  <pic:blipFill>
+                    <a:blip r:embed="rId39">
+                      <a:extLst>
+                        <a:ext uri="{28A0092B-C50C-407E-A947-70E740481C1C}">
+                          <a14:useLocalDpi xmlns:a14="http://schemas.microsoft.com/office/drawing/2010/main" val="0"/>
+                        </a:ext>
+                      </a:extLst>
+                    </a:blip>
+                    <a:stretch>
+                      <a:fillRect/>
+                    </a:stretch>
+                  </pic:blipFill>
+                  <pic:spPr>
+                    <a:xfrm>
+                      <a:off x="0" y="0"/>
+                      <a:ext cx="5731510" cy="1595755"/>
+                    </a:xfrm>
+                    <a:prstGeom prst="rect">
+                      <a:avLst/>
+                    </a:prstGeom>
+                  </pic:spPr>
+                </pic:pic>
+              </a:graphicData>
+            </a:graphic>
+          </wp:anchor>
+        </w:drawing>
+      </w:r>
+    </w:p>
     <w:p>
       <w:pPr>
         <w:pStyle w:val="ListParagraph"/>
@@ -9729,6 +10169,8 @@
           <w:numId w:val="6"/>
         </w:numPr>
         <w:rPr>
+          <w:b/>
+          <w:bCs/>
           <w:u w:val="single"/>
         </w:rPr>
       </w:pPr>
@@ -9738,23 +10180,333 @@
           <w:bCs/>
           <w:u w:val="single"/>
         </w:rPr>
-        <w:t xml:space="preserve">Queries on each fact </w:t>
-      </w:r>
-      <w:r>
+        <w:t>Screenshots of the deployed packages in SSIS with their schedule.</w:t>
+      </w:r>
+      <w:r>
+        <w:rPr>
+          <w:noProof/>
+        </w:rPr>
+        <w:drawing>
+          <wp:inline distT="0" distB="0" distL="0" distR="0" wp14:anchorId="437B9876" wp14:editId="7794C99F">
+            <wp:extent cx="2333951" cy="962159"/>
+            <wp:effectExtent l="0" t="0" r="9525" b="9525"/>
+            <wp:docPr id="904324886" name="Picture 1"/>
+            <wp:cNvGraphicFramePr>
+              <a:graphicFrameLocks xmlns:a="http://schemas.openxmlformats.org/drawingml/2006/main" noChangeAspect="1"/>
+            </wp:cNvGraphicFramePr>
+            <a:graphic xmlns:a="http://schemas.openxmlformats.org/drawingml/2006/main">
+              <a:graphicData uri="http://schemas.openxmlformats.org/drawingml/2006/picture">
+                <pic:pic xmlns:pic="http://schemas.openxmlformats.org/drawingml/2006/picture">
+                  <pic:nvPicPr>
+                    <pic:cNvPr id="904324886" name=""/>
+                    <pic:cNvPicPr/>
+                  </pic:nvPicPr>
+                  <pic:blipFill>
+                    <a:blip r:embed="rId40"/>
+                    <a:stretch>
+                      <a:fillRect/>
+                    </a:stretch>
+                  </pic:blipFill>
+                  <pic:spPr>
+                    <a:xfrm>
+                      <a:off x="0" y="0"/>
+                      <a:ext cx="2333951" cy="962159"/>
+                    </a:xfrm>
+                    <a:prstGeom prst="rect">
+                      <a:avLst/>
+                    </a:prstGeom>
+                  </pic:spPr>
+                </pic:pic>
+              </a:graphicData>
+            </a:graphic>
+          </wp:inline>
+        </w:drawing>
+      </w:r>
+    </w:p>
+    <w:p>
+      <w:pPr>
+        <w:pStyle w:val="ListParagraph"/>
+        <w:ind w:left="360"/>
         <w:rPr>
           <w:b/>
           <w:bCs/>
           <w:u w:val="single"/>
         </w:rPr>
-        <w:t>table</w:t>
-      </w:r>
-      <w:r>
-        <w:rPr>
-          <w:b/>
-          <w:bCs/>
+      </w:pPr>
+      <w:r>
+        <w:rPr>
+          <w:b/>
+          <w:bCs/>
+          <w:noProof/>
           <w:u w:val="single"/>
         </w:rPr>
-        <w:t xml:space="preserve"> </w:t>
+        <w:lastRenderedPageBreak/>
+        <w:drawing>
+          <wp:inline distT="0" distB="0" distL="0" distR="0" wp14:anchorId="68B5B992" wp14:editId="0367ECA4">
+            <wp:extent cx="5731510" cy="5356225"/>
+            <wp:effectExtent l="0" t="0" r="2540" b="0"/>
+            <wp:docPr id="1721654069" name="Picture 1"/>
+            <wp:cNvGraphicFramePr>
+              <a:graphicFrameLocks xmlns:a="http://schemas.openxmlformats.org/drawingml/2006/main" noChangeAspect="1"/>
+            </wp:cNvGraphicFramePr>
+            <a:graphic xmlns:a="http://schemas.openxmlformats.org/drawingml/2006/main">
+              <a:graphicData uri="http://schemas.openxmlformats.org/drawingml/2006/picture">
+                <pic:pic xmlns:pic="http://schemas.openxmlformats.org/drawingml/2006/picture">
+                  <pic:nvPicPr>
+                    <pic:cNvPr id="1721654069" name="Picture 1721654069"/>
+                    <pic:cNvPicPr/>
+                  </pic:nvPicPr>
+                  <pic:blipFill>
+                    <a:blip r:embed="rId41">
+                      <a:extLst>
+                        <a:ext uri="{28A0092B-C50C-407E-A947-70E740481C1C}">
+                          <a14:useLocalDpi xmlns:a14="http://schemas.microsoft.com/office/drawing/2010/main" val="0"/>
+                        </a:ext>
+                      </a:extLst>
+                    </a:blip>
+                    <a:stretch>
+                      <a:fillRect/>
+                    </a:stretch>
+                  </pic:blipFill>
+                  <pic:spPr>
+                    <a:xfrm>
+                      <a:off x="0" y="0"/>
+                      <a:ext cx="5731510" cy="5356225"/>
+                    </a:xfrm>
+                    <a:prstGeom prst="rect">
+                      <a:avLst/>
+                    </a:prstGeom>
+                  </pic:spPr>
+                </pic:pic>
+              </a:graphicData>
+            </a:graphic>
+          </wp:inline>
+        </w:drawing>
+      </w:r>
+    </w:p>
+    <w:p>
+      <w:pPr>
+        <w:pStyle w:val="ListParagraph"/>
+        <w:ind w:left="360"/>
+        <w:rPr>
+          <w:b/>
+          <w:bCs/>
+          <w:u w:val="single"/>
+        </w:rPr>
+      </w:pPr>
+      <w:r>
+        <w:rPr>
+          <w:b/>
+          <w:bCs/>
+          <w:noProof/>
+          <w:u w:val="single"/>
+        </w:rPr>
+        <w:lastRenderedPageBreak/>
+        <w:drawing>
+          <wp:inline distT="0" distB="0" distL="0" distR="0" wp14:anchorId="3D032DB6" wp14:editId="46DAA8B5">
+            <wp:extent cx="5731510" cy="6095365"/>
+            <wp:effectExtent l="0" t="0" r="2540" b="635"/>
+            <wp:docPr id="413737288" name="Picture 1"/>
+            <wp:cNvGraphicFramePr>
+              <a:graphicFrameLocks xmlns:a="http://schemas.openxmlformats.org/drawingml/2006/main" noChangeAspect="1"/>
+            </wp:cNvGraphicFramePr>
+            <a:graphic xmlns:a="http://schemas.openxmlformats.org/drawingml/2006/main">
+              <a:graphicData uri="http://schemas.openxmlformats.org/drawingml/2006/picture">
+                <pic:pic xmlns:pic="http://schemas.openxmlformats.org/drawingml/2006/picture">
+                  <pic:nvPicPr>
+                    <pic:cNvPr id="413737288" name=""/>
+                    <pic:cNvPicPr/>
+                  </pic:nvPicPr>
+                  <pic:blipFill>
+                    <a:blip r:embed="rId42"/>
+                    <a:stretch>
+                      <a:fillRect/>
+                    </a:stretch>
+                  </pic:blipFill>
+                  <pic:spPr>
+                    <a:xfrm>
+                      <a:off x="0" y="0"/>
+                      <a:ext cx="5731510" cy="6095365"/>
+                    </a:xfrm>
+                    <a:prstGeom prst="rect">
+                      <a:avLst/>
+                    </a:prstGeom>
+                  </pic:spPr>
+                </pic:pic>
+              </a:graphicData>
+            </a:graphic>
+          </wp:inline>
+        </w:drawing>
+      </w:r>
+    </w:p>
+    <w:p>
+      <w:pPr>
+        <w:pStyle w:val="ListParagraph"/>
+        <w:ind w:left="360"/>
+        <w:rPr>
+          <w:b/>
+          <w:bCs/>
+          <w:u w:val="single"/>
+        </w:rPr>
+      </w:pPr>
+      <w:r>
+        <w:rPr>
+          <w:b/>
+          <w:bCs/>
+          <w:noProof/>
+          <w:u w:val="single"/>
+        </w:rPr>
+        <w:lastRenderedPageBreak/>
+        <w:drawing>
+          <wp:inline distT="0" distB="0" distL="0" distR="0" wp14:anchorId="62AE334C" wp14:editId="6C5FC277">
+            <wp:extent cx="5731510" cy="6156325"/>
+            <wp:effectExtent l="0" t="0" r="2540" b="0"/>
+            <wp:docPr id="822791825" name="Picture 1"/>
+            <wp:cNvGraphicFramePr>
+              <a:graphicFrameLocks xmlns:a="http://schemas.openxmlformats.org/drawingml/2006/main" noChangeAspect="1"/>
+            </wp:cNvGraphicFramePr>
+            <a:graphic xmlns:a="http://schemas.openxmlformats.org/drawingml/2006/main">
+              <a:graphicData uri="http://schemas.openxmlformats.org/drawingml/2006/picture">
+                <pic:pic xmlns:pic="http://schemas.openxmlformats.org/drawingml/2006/picture">
+                  <pic:nvPicPr>
+                    <pic:cNvPr id="822791825" name=""/>
+                    <pic:cNvPicPr/>
+                  </pic:nvPicPr>
+                  <pic:blipFill>
+                    <a:blip r:embed="rId43"/>
+                    <a:stretch>
+                      <a:fillRect/>
+                    </a:stretch>
+                  </pic:blipFill>
+                  <pic:spPr>
+                    <a:xfrm>
+                      <a:off x="0" y="0"/>
+                      <a:ext cx="5731510" cy="6156325"/>
+                    </a:xfrm>
+                    <a:prstGeom prst="rect">
+                      <a:avLst/>
+                    </a:prstGeom>
+                  </pic:spPr>
+                </pic:pic>
+              </a:graphicData>
+            </a:graphic>
+          </wp:inline>
+        </w:drawing>
+      </w:r>
+    </w:p>
+    <w:p>
+      <w:pPr>
+        <w:pStyle w:val="ListParagraph"/>
+        <w:ind w:left="360"/>
+        <w:rPr>
+          <w:b/>
+          <w:bCs/>
+          <w:u w:val="single"/>
+        </w:rPr>
+      </w:pPr>
+      <w:r>
+        <w:rPr>
+          <w:b/>
+          <w:bCs/>
+          <w:noProof/>
+          <w:u w:val="single"/>
+        </w:rPr>
+        <w:lastRenderedPageBreak/>
+        <w:drawing>
+          <wp:inline distT="0" distB="0" distL="0" distR="0" wp14:anchorId="5AC2EFAD" wp14:editId="47F54DF5">
+            <wp:extent cx="5731510" cy="5177155"/>
+            <wp:effectExtent l="0" t="0" r="2540" b="4445"/>
+            <wp:docPr id="1313509683" name="Picture 2"/>
+            <wp:cNvGraphicFramePr>
+              <a:graphicFrameLocks xmlns:a="http://schemas.openxmlformats.org/drawingml/2006/main" noChangeAspect="1"/>
+            </wp:cNvGraphicFramePr>
+            <a:graphic xmlns:a="http://schemas.openxmlformats.org/drawingml/2006/main">
+              <a:graphicData uri="http://schemas.openxmlformats.org/drawingml/2006/picture">
+                <pic:pic xmlns:pic="http://schemas.openxmlformats.org/drawingml/2006/picture">
+                  <pic:nvPicPr>
+                    <pic:cNvPr id="1313509683" name="Picture 1313509683"/>
+                    <pic:cNvPicPr/>
+                  </pic:nvPicPr>
+                  <pic:blipFill>
+                    <a:blip r:embed="rId44">
+                      <a:extLst>
+                        <a:ext uri="{28A0092B-C50C-407E-A947-70E740481C1C}">
+                          <a14:useLocalDpi xmlns:a14="http://schemas.microsoft.com/office/drawing/2010/main" val="0"/>
+                        </a:ext>
+                      </a:extLst>
+                    </a:blip>
+                    <a:stretch>
+                      <a:fillRect/>
+                    </a:stretch>
+                  </pic:blipFill>
+                  <pic:spPr>
+                    <a:xfrm>
+                      <a:off x="0" y="0"/>
+                      <a:ext cx="5731510" cy="5177155"/>
+                    </a:xfrm>
+                    <a:prstGeom prst="rect">
+                      <a:avLst/>
+                    </a:prstGeom>
+                  </pic:spPr>
+                </pic:pic>
+              </a:graphicData>
+            </a:graphic>
+          </wp:inline>
+        </w:drawing>
+      </w:r>
+    </w:p>
+    <w:p>
+      <w:pPr>
+        <w:pStyle w:val="ListParagraph"/>
+        <w:ind w:left="360"/>
+        <w:rPr>
+          <w:b/>
+          <w:bCs/>
+          <w:u w:val="single"/>
+        </w:rPr>
+      </w:pPr>
+      <w:r>
+        <w:rPr>
+          <w:b/>
+          <w:bCs/>
+          <w:noProof/>
+          <w:u w:val="single"/>
+        </w:rPr>
+        <w:drawing>
+          <wp:inline distT="0" distB="0" distL="0" distR="0" wp14:anchorId="74FCB9E0" wp14:editId="74087281">
+            <wp:extent cx="5731510" cy="3503930"/>
+            <wp:effectExtent l="0" t="0" r="2540" b="1270"/>
+            <wp:docPr id="1615008018" name="Picture 1"/>
+            <wp:cNvGraphicFramePr>
+              <a:graphicFrameLocks xmlns:a="http://schemas.openxmlformats.org/drawingml/2006/main" noChangeAspect="1"/>
+            </wp:cNvGraphicFramePr>
+            <a:graphic xmlns:a="http://schemas.openxmlformats.org/drawingml/2006/main">
+              <a:graphicData uri="http://schemas.openxmlformats.org/drawingml/2006/picture">
+                <pic:pic xmlns:pic="http://schemas.openxmlformats.org/drawingml/2006/picture">
+                  <pic:nvPicPr>
+                    <pic:cNvPr id="1615008018" name=""/>
+                    <pic:cNvPicPr/>
+                  </pic:nvPicPr>
+                  <pic:blipFill>
+                    <a:blip r:embed="rId45"/>
+                    <a:stretch>
+                      <a:fillRect/>
+                    </a:stretch>
+                  </pic:blipFill>
+                  <pic:spPr>
+                    <a:xfrm>
+                      <a:off x="0" y="0"/>
+                      <a:ext cx="5731510" cy="3503930"/>
+                    </a:xfrm>
+                    <a:prstGeom prst="rect">
+                      <a:avLst/>
+                    </a:prstGeom>
+                  </pic:spPr>
+                </pic:pic>
+              </a:graphicData>
+            </a:graphic>
+          </wp:inline>
+        </w:drawing>
       </w:r>
     </w:p>
     <w:p>
@@ -9776,29 +10528,277 @@
           <w:bCs/>
           <w:u w:val="single"/>
         </w:rPr>
-        <w:t>Screenshots of the deployed packages in SSIS with their schedule.</w:t>
-      </w:r>
-    </w:p>
-    <w:p>
-      <w:pPr>
-        <w:pStyle w:val="ListParagraph"/>
-        <w:numPr>
-          <w:ilvl w:val="0"/>
-          <w:numId w:val="6"/>
-        </w:numPr>
-        <w:rPr>
-          <w:b/>
-          <w:bCs/>
-          <w:u w:val="single"/>
-        </w:rPr>
-      </w:pPr>
-      <w:r>
-        <w:rPr>
-          <w:b/>
-          <w:bCs/>
-          <w:u w:val="single"/>
-        </w:rPr>
+        <w:lastRenderedPageBreak/>
         <w:t xml:space="preserve">Build an interactive dashboard for the DWH </w:t>
+      </w:r>
+    </w:p>
+    <w:p>
+      <w:pPr>
+        <w:rPr>
+          <w:b/>
+          <w:bCs/>
+        </w:rPr>
+      </w:pPr>
+      <w:r>
+        <w:rPr>
+          <w:b/>
+          <w:bCs/>
+        </w:rPr>
+        <w:t xml:space="preserve">Sales Performance </w:t>
+      </w:r>
+      <w:r>
+        <w:rPr>
+          <w:b/>
+          <w:bCs/>
+        </w:rPr>
+        <w:t>P</w:t>
+      </w:r>
+      <w:r>
+        <w:rPr>
+          <w:b/>
+          <w:bCs/>
+        </w:rPr>
+        <w:t>age:</w:t>
+      </w:r>
+    </w:p>
+    <w:p>
+      <w:pPr>
+        <w:rPr>
+          <w:b/>
+          <w:bCs/>
+        </w:rPr>
+      </w:pPr>
+      <w:r>
+        <w:rPr>
+          <w:b/>
+          <w:bCs/>
+          <w:noProof/>
+        </w:rPr>
+        <w:drawing>
+          <wp:inline distT="0" distB="0" distL="0" distR="0" wp14:anchorId="031B082A" wp14:editId="4B2066CC">
+            <wp:extent cx="5731510" cy="3198495"/>
+            <wp:effectExtent l="0" t="0" r="2540" b="1905"/>
+            <wp:docPr id="1952970784" name="Picture 1"/>
+            <wp:cNvGraphicFramePr>
+              <a:graphicFrameLocks xmlns:a="http://schemas.openxmlformats.org/drawingml/2006/main" noChangeAspect="1"/>
+            </wp:cNvGraphicFramePr>
+            <a:graphic xmlns:a="http://schemas.openxmlformats.org/drawingml/2006/main">
+              <a:graphicData uri="http://schemas.openxmlformats.org/drawingml/2006/picture">
+                <pic:pic xmlns:pic="http://schemas.openxmlformats.org/drawingml/2006/picture">
+                  <pic:nvPicPr>
+                    <pic:cNvPr id="1952970784" name=""/>
+                    <pic:cNvPicPr/>
+                  </pic:nvPicPr>
+                  <pic:blipFill>
+                    <a:blip r:embed="rId46"/>
+                    <a:stretch>
+                      <a:fillRect/>
+                    </a:stretch>
+                  </pic:blipFill>
+                  <pic:spPr>
+                    <a:xfrm>
+                      <a:off x="0" y="0"/>
+                      <a:ext cx="5731510" cy="3198495"/>
+                    </a:xfrm>
+                    <a:prstGeom prst="rect">
+                      <a:avLst/>
+                    </a:prstGeom>
+                  </pic:spPr>
+                </pic:pic>
+              </a:graphicData>
+            </a:graphic>
+          </wp:inline>
+        </w:drawing>
+      </w:r>
+    </w:p>
+    <w:p>
+      <w:pPr>
+        <w:rPr>
+          <w:b/>
+          <w:bCs/>
+        </w:rPr>
+      </w:pPr>
+      <w:r>
+        <w:rPr>
+          <w:b/>
+          <w:bCs/>
+        </w:rPr>
+        <w:t xml:space="preserve">Shipping &amp; Logistics </w:t>
+      </w:r>
+      <w:r>
+        <w:rPr>
+          <w:b/>
+          <w:bCs/>
+        </w:rPr>
+        <w:t>P</w:t>
+      </w:r>
+      <w:r>
+        <w:rPr>
+          <w:b/>
+          <w:bCs/>
+        </w:rPr>
+        <w:t>age:</w:t>
+      </w:r>
+    </w:p>
+    <w:p>
+      <w:pPr>
+        <w:rPr>
+          <w:b/>
+          <w:bCs/>
+        </w:rPr>
+      </w:pPr>
+      <w:r>
+        <w:rPr>
+          <w:b/>
+          <w:bCs/>
+          <w:noProof/>
+        </w:rPr>
+        <w:drawing>
+          <wp:inline distT="0" distB="0" distL="0" distR="0" wp14:anchorId="2BAC352C" wp14:editId="1DC67A89">
+            <wp:extent cx="5731510" cy="3192145"/>
+            <wp:effectExtent l="0" t="0" r="2540" b="6350"/>
+            <wp:docPr id="2126222365" name="Picture 1"/>
+            <wp:cNvGraphicFramePr>
+              <a:graphicFrameLocks xmlns:a="http://schemas.openxmlformats.org/drawingml/2006/main" noChangeAspect="1"/>
+            </wp:cNvGraphicFramePr>
+            <a:graphic xmlns:a="http://schemas.openxmlformats.org/drawingml/2006/main">
+              <a:graphicData uri="http://schemas.openxmlformats.org/drawingml/2006/picture">
+                <pic:pic xmlns:pic="http://schemas.openxmlformats.org/drawingml/2006/picture">
+                  <pic:nvPicPr>
+                    <pic:cNvPr id="2126222365" name=""/>
+                    <pic:cNvPicPr/>
+                  </pic:nvPicPr>
+                  <pic:blipFill>
+                    <a:blip r:embed="rId47"/>
+                    <a:stretch>
+                      <a:fillRect/>
+                    </a:stretch>
+                  </pic:blipFill>
+                  <pic:spPr>
+                    <a:xfrm>
+                      <a:off x="0" y="0"/>
+                      <a:ext cx="5731510" cy="3192145"/>
+                    </a:xfrm>
+                    <a:prstGeom prst="rect">
+                      <a:avLst/>
+                    </a:prstGeom>
+                  </pic:spPr>
+                </pic:pic>
+              </a:graphicData>
+            </a:graphic>
+          </wp:inline>
+        </w:drawing>
+      </w:r>
+    </w:p>
+    <w:p>
+      <w:pPr>
+        <w:rPr>
+          <w:b/>
+          <w:bCs/>
+        </w:rPr>
+      </w:pPr>
+    </w:p>
+    <w:p>
+      <w:pPr>
+        <w:rPr>
+          <w:b/>
+          <w:bCs/>
+        </w:rPr>
+      </w:pPr>
+    </w:p>
+    <w:p>
+      <w:pPr>
+        <w:rPr>
+          <w:b/>
+          <w:bCs/>
+        </w:rPr>
+      </w:pPr>
+    </w:p>
+    <w:p>
+      <w:pPr>
+        <w:rPr>
+          <w:b/>
+          <w:bCs/>
+        </w:rPr>
+      </w:pPr>
+      <w:r>
+        <w:rPr>
+          <w:b/>
+          <w:bCs/>
+        </w:rPr>
+        <w:t xml:space="preserve">Order Management </w:t>
+      </w:r>
+      <w:r>
+        <w:rPr>
+          <w:b/>
+          <w:bCs/>
+        </w:rPr>
+        <w:t>P</w:t>
+      </w:r>
+      <w:r>
+        <w:rPr>
+          <w:b/>
+          <w:bCs/>
+        </w:rPr>
+        <w:t>age:</w:t>
+      </w:r>
+    </w:p>
+    <w:p>
+      <w:pPr>
+        <w:rPr>
+          <w:b/>
+          <w:bCs/>
+        </w:rPr>
+      </w:pPr>
+      <w:r>
+        <w:rPr>
+          <w:b/>
+          <w:bCs/>
+          <w:noProof/>
+        </w:rPr>
+        <w:lastRenderedPageBreak/>
+        <w:drawing>
+          <wp:inline distT="0" distB="0" distL="0" distR="0" wp14:anchorId="2910F539" wp14:editId="607DE291">
+            <wp:extent cx="5731510" cy="3224530"/>
+            <wp:effectExtent l="0" t="0" r="2540" b="0"/>
+            <wp:docPr id="1742411211" name="Picture 1"/>
+            <wp:cNvGraphicFramePr>
+              <a:graphicFrameLocks xmlns:a="http://schemas.openxmlformats.org/drawingml/2006/main" noChangeAspect="1"/>
+            </wp:cNvGraphicFramePr>
+            <a:graphic xmlns:a="http://schemas.openxmlformats.org/drawingml/2006/main">
+              <a:graphicData uri="http://schemas.openxmlformats.org/drawingml/2006/picture">
+                <pic:pic xmlns:pic="http://schemas.openxmlformats.org/drawingml/2006/picture">
+                  <pic:nvPicPr>
+                    <pic:cNvPr id="1742411211" name=""/>
+                    <pic:cNvPicPr/>
+                  </pic:nvPicPr>
+                  <pic:blipFill>
+                    <a:blip r:embed="rId48"/>
+                    <a:stretch>
+                      <a:fillRect/>
+                    </a:stretch>
+                  </pic:blipFill>
+                  <pic:spPr>
+                    <a:xfrm>
+                      <a:off x="0" y="0"/>
+                      <a:ext cx="5731510" cy="3224530"/>
+                    </a:xfrm>
+                    <a:prstGeom prst="rect">
+                      <a:avLst/>
+                    </a:prstGeom>
+                  </pic:spPr>
+                </pic:pic>
+              </a:graphicData>
+            </a:graphic>
+          </wp:inline>
+        </w:drawing>
+      </w:r>
+      <w:r>
+        <w:rPr>
+          <w:b/>
+          <w:bCs/>
+        </w:rPr>
+        <w:t xml:space="preserve"> </w:t>
       </w:r>
     </w:p>
     <w:sectPr>
@@ -10397,6 +11397,119 @@
     </w:lvl>
   </w:abstractNum>
   <w:abstractNum w:abstractNumId="4" w15:restartNumberingAfterBreak="0">
+    <w:nsid w:val="06A17472"/>
+    <w:multiLevelType w:val="hybridMultilevel"/>
+    <w:tmpl w:val="24ECCBDC"/>
+    <w:lvl w:ilvl="0" w:tplc="04090001">
+      <w:start w:val="1"/>
+      <w:numFmt w:val="bullet"/>
+      <w:lvlText w:val=""/>
+      <w:lvlJc w:val="left"/>
+      <w:pPr>
+        <w:ind w:left="1440" w:hanging="360"/>
+      </w:pPr>
+      <w:rPr>
+        <w:rFonts w:ascii="Symbol" w:hAnsi="Symbol" w:hint="default"/>
+      </w:rPr>
+    </w:lvl>
+    <w:lvl w:ilvl="1" w:tplc="04090003" w:tentative="1">
+      <w:start w:val="1"/>
+      <w:numFmt w:val="bullet"/>
+      <w:lvlText w:val="o"/>
+      <w:lvlJc w:val="left"/>
+      <w:pPr>
+        <w:ind w:left="2160" w:hanging="360"/>
+      </w:pPr>
+      <w:rPr>
+        <w:rFonts w:ascii="Courier New" w:hAnsi="Courier New" w:cs="Courier New" w:hint="default"/>
+      </w:rPr>
+    </w:lvl>
+    <w:lvl w:ilvl="2" w:tplc="04090005" w:tentative="1">
+      <w:start w:val="1"/>
+      <w:numFmt w:val="bullet"/>
+      <w:lvlText w:val=""/>
+      <w:lvlJc w:val="left"/>
+      <w:pPr>
+        <w:ind w:left="2880" w:hanging="360"/>
+      </w:pPr>
+      <w:rPr>
+        <w:rFonts w:ascii="Wingdings" w:hAnsi="Wingdings" w:hint="default"/>
+      </w:rPr>
+    </w:lvl>
+    <w:lvl w:ilvl="3" w:tplc="04090001" w:tentative="1">
+      <w:start w:val="1"/>
+      <w:numFmt w:val="bullet"/>
+      <w:lvlText w:val=""/>
+      <w:lvlJc w:val="left"/>
+      <w:pPr>
+        <w:ind w:left="3600" w:hanging="360"/>
+      </w:pPr>
+      <w:rPr>
+        <w:rFonts w:ascii="Symbol" w:hAnsi="Symbol" w:hint="default"/>
+      </w:rPr>
+    </w:lvl>
+    <w:lvl w:ilvl="4" w:tplc="04090003" w:tentative="1">
+      <w:start w:val="1"/>
+      <w:numFmt w:val="bullet"/>
+      <w:lvlText w:val="o"/>
+      <w:lvlJc w:val="left"/>
+      <w:pPr>
+        <w:ind w:left="4320" w:hanging="360"/>
+      </w:pPr>
+      <w:rPr>
+        <w:rFonts w:ascii="Courier New" w:hAnsi="Courier New" w:cs="Courier New" w:hint="default"/>
+      </w:rPr>
+    </w:lvl>
+    <w:lvl w:ilvl="5" w:tplc="04090005" w:tentative="1">
+      <w:start w:val="1"/>
+      <w:numFmt w:val="bullet"/>
+      <w:lvlText w:val=""/>
+      <w:lvlJc w:val="left"/>
+      <w:pPr>
+        <w:ind w:left="5040" w:hanging="360"/>
+      </w:pPr>
+      <w:rPr>
+        <w:rFonts w:ascii="Wingdings" w:hAnsi="Wingdings" w:hint="default"/>
+      </w:rPr>
+    </w:lvl>
+    <w:lvl w:ilvl="6" w:tplc="04090001" w:tentative="1">
+      <w:start w:val="1"/>
+      <w:numFmt w:val="bullet"/>
+      <w:lvlText w:val=""/>
+      <w:lvlJc w:val="left"/>
+      <w:pPr>
+        <w:ind w:left="5760" w:hanging="360"/>
+      </w:pPr>
+      <w:rPr>
+        <w:rFonts w:ascii="Symbol" w:hAnsi="Symbol" w:hint="default"/>
+      </w:rPr>
+    </w:lvl>
+    <w:lvl w:ilvl="7" w:tplc="04090003" w:tentative="1">
+      <w:start w:val="1"/>
+      <w:numFmt w:val="bullet"/>
+      <w:lvlText w:val="o"/>
+      <w:lvlJc w:val="left"/>
+      <w:pPr>
+        <w:ind w:left="6480" w:hanging="360"/>
+      </w:pPr>
+      <w:rPr>
+        <w:rFonts w:ascii="Courier New" w:hAnsi="Courier New" w:cs="Courier New" w:hint="default"/>
+      </w:rPr>
+    </w:lvl>
+    <w:lvl w:ilvl="8" w:tplc="04090005" w:tentative="1">
+      <w:start w:val="1"/>
+      <w:numFmt w:val="bullet"/>
+      <w:lvlText w:val=""/>
+      <w:lvlJc w:val="left"/>
+      <w:pPr>
+        <w:ind w:left="7200" w:hanging="360"/>
+      </w:pPr>
+      <w:rPr>
+        <w:rFonts w:ascii="Wingdings" w:hAnsi="Wingdings" w:hint="default"/>
+      </w:rPr>
+    </w:lvl>
+  </w:abstractNum>
+  <w:abstractNum w:abstractNumId="5" w15:restartNumberingAfterBreak="0">
     <w:nsid w:val="0D1639A5"/>
     <w:multiLevelType w:val="hybridMultilevel"/>
     <w:tmpl w:val="6606602E"/>
@@ -10487,7 +11600,120 @@
       </w:pPr>
     </w:lvl>
   </w:abstractNum>
-  <w:abstractNum w:abstractNumId="5" w15:restartNumberingAfterBreak="0">
+  <w:abstractNum w:abstractNumId="6" w15:restartNumberingAfterBreak="0">
+    <w:nsid w:val="16AE3CF4"/>
+    <w:multiLevelType w:val="hybridMultilevel"/>
+    <w:tmpl w:val="520AB69E"/>
+    <w:lvl w:ilvl="0" w:tplc="04090001">
+      <w:start w:val="1"/>
+      <w:numFmt w:val="bullet"/>
+      <w:lvlText w:val=""/>
+      <w:lvlJc w:val="left"/>
+      <w:pPr>
+        <w:ind w:left="1440" w:hanging="360"/>
+      </w:pPr>
+      <w:rPr>
+        <w:rFonts w:ascii="Symbol" w:hAnsi="Symbol" w:hint="default"/>
+      </w:rPr>
+    </w:lvl>
+    <w:lvl w:ilvl="1" w:tplc="04090003" w:tentative="1">
+      <w:start w:val="1"/>
+      <w:numFmt w:val="bullet"/>
+      <w:lvlText w:val="o"/>
+      <w:lvlJc w:val="left"/>
+      <w:pPr>
+        <w:ind w:left="2160" w:hanging="360"/>
+      </w:pPr>
+      <w:rPr>
+        <w:rFonts w:ascii="Courier New" w:hAnsi="Courier New" w:cs="Courier New" w:hint="default"/>
+      </w:rPr>
+    </w:lvl>
+    <w:lvl w:ilvl="2" w:tplc="04090005" w:tentative="1">
+      <w:start w:val="1"/>
+      <w:numFmt w:val="bullet"/>
+      <w:lvlText w:val=""/>
+      <w:lvlJc w:val="left"/>
+      <w:pPr>
+        <w:ind w:left="2880" w:hanging="360"/>
+      </w:pPr>
+      <w:rPr>
+        <w:rFonts w:ascii="Wingdings" w:hAnsi="Wingdings" w:hint="default"/>
+      </w:rPr>
+    </w:lvl>
+    <w:lvl w:ilvl="3" w:tplc="04090001" w:tentative="1">
+      <w:start w:val="1"/>
+      <w:numFmt w:val="bullet"/>
+      <w:lvlText w:val=""/>
+      <w:lvlJc w:val="left"/>
+      <w:pPr>
+        <w:ind w:left="3600" w:hanging="360"/>
+      </w:pPr>
+      <w:rPr>
+        <w:rFonts w:ascii="Symbol" w:hAnsi="Symbol" w:hint="default"/>
+      </w:rPr>
+    </w:lvl>
+    <w:lvl w:ilvl="4" w:tplc="04090003" w:tentative="1">
+      <w:start w:val="1"/>
+      <w:numFmt w:val="bullet"/>
+      <w:lvlText w:val="o"/>
+      <w:lvlJc w:val="left"/>
+      <w:pPr>
+        <w:ind w:left="4320" w:hanging="360"/>
+      </w:pPr>
+      <w:rPr>
+        <w:rFonts w:ascii="Courier New" w:hAnsi="Courier New" w:cs="Courier New" w:hint="default"/>
+      </w:rPr>
+    </w:lvl>
+    <w:lvl w:ilvl="5" w:tplc="04090005" w:tentative="1">
+      <w:start w:val="1"/>
+      <w:numFmt w:val="bullet"/>
+      <w:lvlText w:val=""/>
+      <w:lvlJc w:val="left"/>
+      <w:pPr>
+        <w:ind w:left="5040" w:hanging="360"/>
+      </w:pPr>
+      <w:rPr>
+        <w:rFonts w:ascii="Wingdings" w:hAnsi="Wingdings" w:hint="default"/>
+      </w:rPr>
+    </w:lvl>
+    <w:lvl w:ilvl="6" w:tplc="04090001" w:tentative="1">
+      <w:start w:val="1"/>
+      <w:numFmt w:val="bullet"/>
+      <w:lvlText w:val=""/>
+      <w:lvlJc w:val="left"/>
+      <w:pPr>
+        <w:ind w:left="5760" w:hanging="360"/>
+      </w:pPr>
+      <w:rPr>
+        <w:rFonts w:ascii="Symbol" w:hAnsi="Symbol" w:hint="default"/>
+      </w:rPr>
+    </w:lvl>
+    <w:lvl w:ilvl="7" w:tplc="04090003" w:tentative="1">
+      <w:start w:val="1"/>
+      <w:numFmt w:val="bullet"/>
+      <w:lvlText w:val="o"/>
+      <w:lvlJc w:val="left"/>
+      <w:pPr>
+        <w:ind w:left="6480" w:hanging="360"/>
+      </w:pPr>
+      <w:rPr>
+        <w:rFonts w:ascii="Courier New" w:hAnsi="Courier New" w:cs="Courier New" w:hint="default"/>
+      </w:rPr>
+    </w:lvl>
+    <w:lvl w:ilvl="8" w:tplc="04090005" w:tentative="1">
+      <w:start w:val="1"/>
+      <w:numFmt w:val="bullet"/>
+      <w:lvlText w:val=""/>
+      <w:lvlJc w:val="left"/>
+      <w:pPr>
+        <w:ind w:left="7200" w:hanging="360"/>
+      </w:pPr>
+      <w:rPr>
+        <w:rFonts w:ascii="Wingdings" w:hAnsi="Wingdings" w:hint="default"/>
+      </w:rPr>
+    </w:lvl>
+  </w:abstractNum>
+  <w:abstractNum w:abstractNumId="7" w15:restartNumberingAfterBreak="0">
     <w:nsid w:val="196D1979"/>
     <w:multiLevelType w:val="multilevel"/>
     <w:tmpl w:val="B5CA9F32"/>
@@ -10636,7 +11862,7 @@
       </w:rPr>
     </w:lvl>
   </w:abstractNum>
-  <w:abstractNum w:abstractNumId="6" w15:restartNumberingAfterBreak="0">
+  <w:abstractNum w:abstractNumId="8" w15:restartNumberingAfterBreak="0">
     <w:nsid w:val="19AF7CA3"/>
     <w:multiLevelType w:val="hybridMultilevel"/>
     <w:tmpl w:val="7E04BD7E"/>
@@ -10722,7 +11948,7 @@
       </w:pPr>
     </w:lvl>
   </w:abstractNum>
-  <w:abstractNum w:abstractNumId="7" w15:restartNumberingAfterBreak="0">
+  <w:abstractNum w:abstractNumId="9" w15:restartNumberingAfterBreak="0">
     <w:nsid w:val="1A5722CB"/>
     <w:multiLevelType w:val="multilevel"/>
     <w:tmpl w:val="D7768C3C"/>
@@ -10871,7 +12097,7 @@
       </w:rPr>
     </w:lvl>
   </w:abstractNum>
-  <w:abstractNum w:abstractNumId="8" w15:restartNumberingAfterBreak="0">
+  <w:abstractNum w:abstractNumId="10" w15:restartNumberingAfterBreak="0">
     <w:nsid w:val="1FCA3EA7"/>
     <w:multiLevelType w:val="hybridMultilevel"/>
     <w:tmpl w:val="919466B6"/>
@@ -10961,7 +12187,7 @@
       </w:pPr>
     </w:lvl>
   </w:abstractNum>
-  <w:abstractNum w:abstractNumId="9" w15:restartNumberingAfterBreak="0">
+  <w:abstractNum w:abstractNumId="11" w15:restartNumberingAfterBreak="0">
     <w:nsid w:val="22403269"/>
     <w:multiLevelType w:val="multilevel"/>
     <w:tmpl w:val="4E7C580E"/>
@@ -11110,7 +12336,7 @@
       </w:rPr>
     </w:lvl>
   </w:abstractNum>
-  <w:abstractNum w:abstractNumId="10" w15:restartNumberingAfterBreak="0">
+  <w:abstractNum w:abstractNumId="12" w15:restartNumberingAfterBreak="0">
     <w:nsid w:val="251F5732"/>
     <w:multiLevelType w:val="hybridMultilevel"/>
     <w:tmpl w:val="B6E61052"/>
@@ -11223,7 +12449,7 @@
       </w:rPr>
     </w:lvl>
   </w:abstractNum>
-  <w:abstractNum w:abstractNumId="11" w15:restartNumberingAfterBreak="0">
+  <w:abstractNum w:abstractNumId="13" w15:restartNumberingAfterBreak="0">
     <w:nsid w:val="27B03A9B"/>
     <w:multiLevelType w:val="multilevel"/>
     <w:tmpl w:val="0B2CDC66"/>
@@ -11372,7 +12598,7 @@
       </w:rPr>
     </w:lvl>
   </w:abstractNum>
-  <w:abstractNum w:abstractNumId="12" w15:restartNumberingAfterBreak="0">
+  <w:abstractNum w:abstractNumId="14" w15:restartNumberingAfterBreak="0">
     <w:nsid w:val="2B482A56"/>
     <w:multiLevelType w:val="multilevel"/>
     <w:tmpl w:val="7760141C"/>
@@ -11513,7 +12739,97 @@
       </w:rPr>
     </w:lvl>
   </w:abstractNum>
-  <w:abstractNum w:abstractNumId="13" w15:restartNumberingAfterBreak="0">
+  <w:abstractNum w:abstractNumId="15" w15:restartNumberingAfterBreak="0">
+    <w:nsid w:val="30AA18DC"/>
+    <w:multiLevelType w:val="hybridMultilevel"/>
+    <w:tmpl w:val="E7B0F52E"/>
+    <w:lvl w:ilvl="0" w:tplc="AD785F6A">
+      <w:start w:val="1"/>
+      <w:numFmt w:val="decimal"/>
+      <w:lvlText w:val="%1)"/>
+      <w:lvlJc w:val="left"/>
+      <w:pPr>
+        <w:ind w:left="1080" w:hanging="360"/>
+      </w:pPr>
+      <w:rPr>
+        <w:b/>
+        <w:bCs/>
+      </w:rPr>
+    </w:lvl>
+    <w:lvl w:ilvl="1" w:tplc="08090019" w:tentative="1">
+      <w:start w:val="1"/>
+      <w:numFmt w:val="lowerLetter"/>
+      <w:lvlText w:val="%2."/>
+      <w:lvlJc w:val="left"/>
+      <w:pPr>
+        <w:ind w:left="1800" w:hanging="360"/>
+      </w:pPr>
+    </w:lvl>
+    <w:lvl w:ilvl="2" w:tplc="0809001B" w:tentative="1">
+      <w:start w:val="1"/>
+      <w:numFmt w:val="lowerRoman"/>
+      <w:lvlText w:val="%3."/>
+      <w:lvlJc w:val="right"/>
+      <w:pPr>
+        <w:ind w:left="2520" w:hanging="180"/>
+      </w:pPr>
+    </w:lvl>
+    <w:lvl w:ilvl="3" w:tplc="0809000F" w:tentative="1">
+      <w:start w:val="1"/>
+      <w:numFmt w:val="decimal"/>
+      <w:lvlText w:val="%4."/>
+      <w:lvlJc w:val="left"/>
+      <w:pPr>
+        <w:ind w:left="3240" w:hanging="360"/>
+      </w:pPr>
+    </w:lvl>
+    <w:lvl w:ilvl="4" w:tplc="08090019" w:tentative="1">
+      <w:start w:val="1"/>
+      <w:numFmt w:val="lowerLetter"/>
+      <w:lvlText w:val="%5."/>
+      <w:lvlJc w:val="left"/>
+      <w:pPr>
+        <w:ind w:left="3960" w:hanging="360"/>
+      </w:pPr>
+    </w:lvl>
+    <w:lvl w:ilvl="5" w:tplc="0809001B" w:tentative="1">
+      <w:start w:val="1"/>
+      <w:numFmt w:val="lowerRoman"/>
+      <w:lvlText w:val="%6."/>
+      <w:lvlJc w:val="right"/>
+      <w:pPr>
+        <w:ind w:left="4680" w:hanging="180"/>
+      </w:pPr>
+    </w:lvl>
+    <w:lvl w:ilvl="6" w:tplc="0809000F" w:tentative="1">
+      <w:start w:val="1"/>
+      <w:numFmt w:val="decimal"/>
+      <w:lvlText w:val="%7."/>
+      <w:lvlJc w:val="left"/>
+      <w:pPr>
+        <w:ind w:left="5400" w:hanging="360"/>
+      </w:pPr>
+    </w:lvl>
+    <w:lvl w:ilvl="7" w:tplc="08090019" w:tentative="1">
+      <w:start w:val="1"/>
+      <w:numFmt w:val="lowerLetter"/>
+      <w:lvlText w:val="%8."/>
+      <w:lvlJc w:val="left"/>
+      <w:pPr>
+        <w:ind w:left="6120" w:hanging="360"/>
+      </w:pPr>
+    </w:lvl>
+    <w:lvl w:ilvl="8" w:tplc="0809001B" w:tentative="1">
+      <w:start w:val="1"/>
+      <w:numFmt w:val="lowerRoman"/>
+      <w:lvlText w:val="%9."/>
+      <w:lvlJc w:val="right"/>
+      <w:pPr>
+        <w:ind w:left="6840" w:hanging="180"/>
+      </w:pPr>
+    </w:lvl>
+  </w:abstractNum>
+  <w:abstractNum w:abstractNumId="16" w15:restartNumberingAfterBreak="0">
     <w:nsid w:val="350D231F"/>
     <w:multiLevelType w:val="hybridMultilevel"/>
     <w:tmpl w:val="71A41702"/>
@@ -11599,7 +12915,7 @@
       </w:pPr>
     </w:lvl>
   </w:abstractNum>
-  <w:abstractNum w:abstractNumId="14" w15:restartNumberingAfterBreak="0">
+  <w:abstractNum w:abstractNumId="17" w15:restartNumberingAfterBreak="0">
     <w:nsid w:val="37516C67"/>
     <w:multiLevelType w:val="hybridMultilevel"/>
     <w:tmpl w:val="002E5202"/>
@@ -11712,7 +13028,7 @@
       </w:rPr>
     </w:lvl>
   </w:abstractNum>
-  <w:abstractNum w:abstractNumId="15" w15:restartNumberingAfterBreak="0">
+  <w:abstractNum w:abstractNumId="18" w15:restartNumberingAfterBreak="0">
     <w:nsid w:val="388BADF8"/>
     <w:multiLevelType w:val="hybridMultilevel"/>
     <w:tmpl w:val="39782A66"/>
@@ -11825,7 +13141,7 @@
       </w:rPr>
     </w:lvl>
   </w:abstractNum>
-  <w:abstractNum w:abstractNumId="16" w15:restartNumberingAfterBreak="0">
+  <w:abstractNum w:abstractNumId="19" w15:restartNumberingAfterBreak="0">
     <w:nsid w:val="38BD9415"/>
     <w:multiLevelType w:val="hybridMultilevel"/>
     <w:tmpl w:val="34C03ABA"/>
@@ -11911,7 +13227,7 @@
       </w:pPr>
     </w:lvl>
   </w:abstractNum>
-  <w:abstractNum w:abstractNumId="17" w15:restartNumberingAfterBreak="0">
+  <w:abstractNum w:abstractNumId="20" w15:restartNumberingAfterBreak="0">
     <w:nsid w:val="415238DF"/>
     <w:multiLevelType w:val="multilevel"/>
     <w:tmpl w:val="F5F0B3CA"/>
@@ -11947,7 +13263,7 @@
         <w:sz w:val="20"/>
       </w:rPr>
     </w:lvl>
-    <w:lvl w:ilvl="2" w:tentative="1">
+    <w:lvl w:ilvl="2">
       <w:start w:val="1"/>
       <w:numFmt w:val="bullet"/>
       <w:lvlText w:val=""/>
@@ -12060,7 +13376,7 @@
       </w:rPr>
     </w:lvl>
   </w:abstractNum>
-  <w:abstractNum w:abstractNumId="18" w15:restartNumberingAfterBreak="0">
+  <w:abstractNum w:abstractNumId="21" w15:restartNumberingAfterBreak="0">
     <w:nsid w:val="427C6362"/>
     <w:multiLevelType w:val="hybridMultilevel"/>
     <w:tmpl w:val="8C087C4E"/>
@@ -12173,7 +13489,7 @@
       </w:rPr>
     </w:lvl>
   </w:abstractNum>
-  <w:abstractNum w:abstractNumId="19" w15:restartNumberingAfterBreak="0">
+  <w:abstractNum w:abstractNumId="22" w15:restartNumberingAfterBreak="0">
     <w:nsid w:val="4D7963FE"/>
     <w:multiLevelType w:val="multilevel"/>
     <w:tmpl w:val="BFB64326"/>
@@ -12322,7 +13638,120 @@
       </w:rPr>
     </w:lvl>
   </w:abstractNum>
-  <w:abstractNum w:abstractNumId="20" w15:restartNumberingAfterBreak="0">
+  <w:abstractNum w:abstractNumId="23" w15:restartNumberingAfterBreak="0">
+    <w:nsid w:val="4FC34037"/>
+    <w:multiLevelType w:val="hybridMultilevel"/>
+    <w:tmpl w:val="8E6EB5A8"/>
+    <w:lvl w:ilvl="0" w:tplc="04090001">
+      <w:start w:val="1"/>
+      <w:numFmt w:val="bullet"/>
+      <w:lvlText w:val=""/>
+      <w:lvlJc w:val="left"/>
+      <w:pPr>
+        <w:ind w:left="1440" w:hanging="360"/>
+      </w:pPr>
+      <w:rPr>
+        <w:rFonts w:ascii="Symbol" w:hAnsi="Symbol" w:hint="default"/>
+      </w:rPr>
+    </w:lvl>
+    <w:lvl w:ilvl="1" w:tplc="04090003" w:tentative="1">
+      <w:start w:val="1"/>
+      <w:numFmt w:val="bullet"/>
+      <w:lvlText w:val="o"/>
+      <w:lvlJc w:val="left"/>
+      <w:pPr>
+        <w:ind w:left="2160" w:hanging="360"/>
+      </w:pPr>
+      <w:rPr>
+        <w:rFonts w:ascii="Courier New" w:hAnsi="Courier New" w:cs="Courier New" w:hint="default"/>
+      </w:rPr>
+    </w:lvl>
+    <w:lvl w:ilvl="2" w:tplc="04090005" w:tentative="1">
+      <w:start w:val="1"/>
+      <w:numFmt w:val="bullet"/>
+      <w:lvlText w:val=""/>
+      <w:lvlJc w:val="left"/>
+      <w:pPr>
+        <w:ind w:left="2880" w:hanging="360"/>
+      </w:pPr>
+      <w:rPr>
+        <w:rFonts w:ascii="Wingdings" w:hAnsi="Wingdings" w:hint="default"/>
+      </w:rPr>
+    </w:lvl>
+    <w:lvl w:ilvl="3" w:tplc="04090001" w:tentative="1">
+      <w:start w:val="1"/>
+      <w:numFmt w:val="bullet"/>
+      <w:lvlText w:val=""/>
+      <w:lvlJc w:val="left"/>
+      <w:pPr>
+        <w:ind w:left="3600" w:hanging="360"/>
+      </w:pPr>
+      <w:rPr>
+        <w:rFonts w:ascii="Symbol" w:hAnsi="Symbol" w:hint="default"/>
+      </w:rPr>
+    </w:lvl>
+    <w:lvl w:ilvl="4" w:tplc="04090003" w:tentative="1">
+      <w:start w:val="1"/>
+      <w:numFmt w:val="bullet"/>
+      <w:lvlText w:val="o"/>
+      <w:lvlJc w:val="left"/>
+      <w:pPr>
+        <w:ind w:left="4320" w:hanging="360"/>
+      </w:pPr>
+      <w:rPr>
+        <w:rFonts w:ascii="Courier New" w:hAnsi="Courier New" w:cs="Courier New" w:hint="default"/>
+      </w:rPr>
+    </w:lvl>
+    <w:lvl w:ilvl="5" w:tplc="04090005" w:tentative="1">
+      <w:start w:val="1"/>
+      <w:numFmt w:val="bullet"/>
+      <w:lvlText w:val=""/>
+      <w:lvlJc w:val="left"/>
+      <w:pPr>
+        <w:ind w:left="5040" w:hanging="360"/>
+      </w:pPr>
+      <w:rPr>
+        <w:rFonts w:ascii="Wingdings" w:hAnsi="Wingdings" w:hint="default"/>
+      </w:rPr>
+    </w:lvl>
+    <w:lvl w:ilvl="6" w:tplc="04090001" w:tentative="1">
+      <w:start w:val="1"/>
+      <w:numFmt w:val="bullet"/>
+      <w:lvlText w:val=""/>
+      <w:lvlJc w:val="left"/>
+      <w:pPr>
+        <w:ind w:left="5760" w:hanging="360"/>
+      </w:pPr>
+      <w:rPr>
+        <w:rFonts w:ascii="Symbol" w:hAnsi="Symbol" w:hint="default"/>
+      </w:rPr>
+    </w:lvl>
+    <w:lvl w:ilvl="7" w:tplc="04090003" w:tentative="1">
+      <w:start w:val="1"/>
+      <w:numFmt w:val="bullet"/>
+      <w:lvlText w:val="o"/>
+      <w:lvlJc w:val="left"/>
+      <w:pPr>
+        <w:ind w:left="6480" w:hanging="360"/>
+      </w:pPr>
+      <w:rPr>
+        <w:rFonts w:ascii="Courier New" w:hAnsi="Courier New" w:cs="Courier New" w:hint="default"/>
+      </w:rPr>
+    </w:lvl>
+    <w:lvl w:ilvl="8" w:tplc="04090005" w:tentative="1">
+      <w:start w:val="1"/>
+      <w:numFmt w:val="bullet"/>
+      <w:lvlText w:val=""/>
+      <w:lvlJc w:val="left"/>
+      <w:pPr>
+        <w:ind w:left="7200" w:hanging="360"/>
+      </w:pPr>
+      <w:rPr>
+        <w:rFonts w:ascii="Wingdings" w:hAnsi="Wingdings" w:hint="default"/>
+      </w:rPr>
+    </w:lvl>
+  </w:abstractNum>
+  <w:abstractNum w:abstractNumId="24" w15:restartNumberingAfterBreak="0">
     <w:nsid w:val="507A161F"/>
     <w:multiLevelType w:val="multilevel"/>
     <w:tmpl w:val="9FE0CCDE"/>
@@ -12471,7 +13900,120 @@
       </w:rPr>
     </w:lvl>
   </w:abstractNum>
-  <w:abstractNum w:abstractNumId="21" w15:restartNumberingAfterBreak="0">
+  <w:abstractNum w:abstractNumId="25" w15:restartNumberingAfterBreak="0">
+    <w:nsid w:val="547E1BE6"/>
+    <w:multiLevelType w:val="hybridMultilevel"/>
+    <w:tmpl w:val="F93AAABC"/>
+    <w:lvl w:ilvl="0" w:tplc="04090001">
+      <w:start w:val="1"/>
+      <w:numFmt w:val="bullet"/>
+      <w:lvlText w:val=""/>
+      <w:lvlJc w:val="left"/>
+      <w:pPr>
+        <w:ind w:left="1440" w:hanging="360"/>
+      </w:pPr>
+      <w:rPr>
+        <w:rFonts w:ascii="Symbol" w:hAnsi="Symbol" w:hint="default"/>
+      </w:rPr>
+    </w:lvl>
+    <w:lvl w:ilvl="1" w:tplc="04090003" w:tentative="1">
+      <w:start w:val="1"/>
+      <w:numFmt w:val="bullet"/>
+      <w:lvlText w:val="o"/>
+      <w:lvlJc w:val="left"/>
+      <w:pPr>
+        <w:ind w:left="2160" w:hanging="360"/>
+      </w:pPr>
+      <w:rPr>
+        <w:rFonts w:ascii="Courier New" w:hAnsi="Courier New" w:cs="Courier New" w:hint="default"/>
+      </w:rPr>
+    </w:lvl>
+    <w:lvl w:ilvl="2" w:tplc="04090005" w:tentative="1">
+      <w:start w:val="1"/>
+      <w:numFmt w:val="bullet"/>
+      <w:lvlText w:val=""/>
+      <w:lvlJc w:val="left"/>
+      <w:pPr>
+        <w:ind w:left="2880" w:hanging="360"/>
+      </w:pPr>
+      <w:rPr>
+        <w:rFonts w:ascii="Wingdings" w:hAnsi="Wingdings" w:hint="default"/>
+      </w:rPr>
+    </w:lvl>
+    <w:lvl w:ilvl="3" w:tplc="04090001" w:tentative="1">
+      <w:start w:val="1"/>
+      <w:numFmt w:val="bullet"/>
+      <w:lvlText w:val=""/>
+      <w:lvlJc w:val="left"/>
+      <w:pPr>
+        <w:ind w:left="3600" w:hanging="360"/>
+      </w:pPr>
+      <w:rPr>
+        <w:rFonts w:ascii="Symbol" w:hAnsi="Symbol" w:hint="default"/>
+      </w:rPr>
+    </w:lvl>
+    <w:lvl w:ilvl="4" w:tplc="04090003" w:tentative="1">
+      <w:start w:val="1"/>
+      <w:numFmt w:val="bullet"/>
+      <w:lvlText w:val="o"/>
+      <w:lvlJc w:val="left"/>
+      <w:pPr>
+        <w:ind w:left="4320" w:hanging="360"/>
+      </w:pPr>
+      <w:rPr>
+        <w:rFonts w:ascii="Courier New" w:hAnsi="Courier New" w:cs="Courier New" w:hint="default"/>
+      </w:rPr>
+    </w:lvl>
+    <w:lvl w:ilvl="5" w:tplc="04090005" w:tentative="1">
+      <w:start w:val="1"/>
+      <w:numFmt w:val="bullet"/>
+      <w:lvlText w:val=""/>
+      <w:lvlJc w:val="left"/>
+      <w:pPr>
+        <w:ind w:left="5040" w:hanging="360"/>
+      </w:pPr>
+      <w:rPr>
+        <w:rFonts w:ascii="Wingdings" w:hAnsi="Wingdings" w:hint="default"/>
+      </w:rPr>
+    </w:lvl>
+    <w:lvl w:ilvl="6" w:tplc="04090001" w:tentative="1">
+      <w:start w:val="1"/>
+      <w:numFmt w:val="bullet"/>
+      <w:lvlText w:val=""/>
+      <w:lvlJc w:val="left"/>
+      <w:pPr>
+        <w:ind w:left="5760" w:hanging="360"/>
+      </w:pPr>
+      <w:rPr>
+        <w:rFonts w:ascii="Symbol" w:hAnsi="Symbol" w:hint="default"/>
+      </w:rPr>
+    </w:lvl>
+    <w:lvl w:ilvl="7" w:tplc="04090003" w:tentative="1">
+      <w:start w:val="1"/>
+      <w:numFmt w:val="bullet"/>
+      <w:lvlText w:val="o"/>
+      <w:lvlJc w:val="left"/>
+      <w:pPr>
+        <w:ind w:left="6480" w:hanging="360"/>
+      </w:pPr>
+      <w:rPr>
+        <w:rFonts w:ascii="Courier New" w:hAnsi="Courier New" w:cs="Courier New" w:hint="default"/>
+      </w:rPr>
+    </w:lvl>
+    <w:lvl w:ilvl="8" w:tplc="04090005" w:tentative="1">
+      <w:start w:val="1"/>
+      <w:numFmt w:val="bullet"/>
+      <w:lvlText w:val=""/>
+      <w:lvlJc w:val="left"/>
+      <w:pPr>
+        <w:ind w:left="7200" w:hanging="360"/>
+      </w:pPr>
+      <w:rPr>
+        <w:rFonts w:ascii="Wingdings" w:hAnsi="Wingdings" w:hint="default"/>
+      </w:rPr>
+    </w:lvl>
+  </w:abstractNum>
+  <w:abstractNum w:abstractNumId="26" w15:restartNumberingAfterBreak="0">
     <w:nsid w:val="56233F0A"/>
     <w:multiLevelType w:val="hybridMultilevel"/>
     <w:tmpl w:val="DE668BC8"/>
@@ -12584,7 +14126,7 @@
       </w:rPr>
     </w:lvl>
   </w:abstractNum>
-  <w:abstractNum w:abstractNumId="22" w15:restartNumberingAfterBreak="0">
+  <w:abstractNum w:abstractNumId="27" w15:restartNumberingAfterBreak="0">
     <w:nsid w:val="570C3A45"/>
     <w:multiLevelType w:val="hybridMultilevel"/>
     <w:tmpl w:val="5EFEC6C0"/>
@@ -12670,7 +14212,7 @@
       </w:pPr>
     </w:lvl>
   </w:abstractNum>
-  <w:abstractNum w:abstractNumId="23" w15:restartNumberingAfterBreak="0">
+  <w:abstractNum w:abstractNumId="28" w15:restartNumberingAfterBreak="0">
     <w:nsid w:val="596F4AFA"/>
     <w:multiLevelType w:val="hybridMultilevel"/>
     <w:tmpl w:val="2488C0C6"/>
@@ -12762,7 +14304,7 @@
       </w:pPr>
     </w:lvl>
   </w:abstractNum>
-  <w:abstractNum w:abstractNumId="24" w15:restartNumberingAfterBreak="0">
+  <w:abstractNum w:abstractNumId="29" w15:restartNumberingAfterBreak="0">
     <w:nsid w:val="5F660FFF"/>
     <w:multiLevelType w:val="hybridMultilevel"/>
     <w:tmpl w:val="21B8D678"/>
@@ -12852,7 +14394,7 @@
       </w:pPr>
     </w:lvl>
   </w:abstractNum>
-  <w:abstractNum w:abstractNumId="25" w15:restartNumberingAfterBreak="0">
+  <w:abstractNum w:abstractNumId="30" w15:restartNumberingAfterBreak="0">
     <w:nsid w:val="6033512A"/>
     <w:multiLevelType w:val="hybridMultilevel"/>
     <w:tmpl w:val="E92CE7BA"/>
@@ -12944,7 +14486,7 @@
       </w:pPr>
     </w:lvl>
   </w:abstractNum>
-  <w:abstractNum w:abstractNumId="26" w15:restartNumberingAfterBreak="0">
+  <w:abstractNum w:abstractNumId="31" w15:restartNumberingAfterBreak="0">
     <w:nsid w:val="603C1860"/>
     <w:multiLevelType w:val="multilevel"/>
     <w:tmpl w:val="B622E404"/>
@@ -13093,10 +14635,10 @@
       </w:rPr>
     </w:lvl>
   </w:abstractNum>
-  <w:abstractNum w:abstractNumId="27" w15:restartNumberingAfterBreak="0">
+  <w:abstractNum w:abstractNumId="32" w15:restartNumberingAfterBreak="0">
     <w:nsid w:val="61F41166"/>
     <w:multiLevelType w:val="multilevel"/>
-    <w:tmpl w:val="2CF06A5E"/>
+    <w:tmpl w:val="8B2812E8"/>
     <w:lvl w:ilvl="0">
       <w:start w:val="1"/>
       <w:numFmt w:val="bullet"/>
@@ -13126,120 +14668,116 @@
         <w:b/>
       </w:rPr>
     </w:lvl>
-    <w:lvl w:ilvl="2" w:tentative="1">
+    <w:lvl w:ilvl="2">
+      <w:start w:val="1"/>
+      <w:numFmt w:val="decimal"/>
+      <w:lvlText w:val="%3)"/>
+      <w:lvlJc w:val="left"/>
+      <w:pPr>
+        <w:ind w:left="2520" w:hanging="360"/>
+      </w:pPr>
+      <w:rPr>
+        <w:rFonts w:hint="default"/>
+      </w:rPr>
+    </w:lvl>
+    <w:lvl w:ilvl="3" w:tentative="1">
       <w:start w:val="1"/>
       <w:numFmt w:val="bullet"/>
       <w:lvlText w:val=""/>
       <w:lvlJc w:val="left"/>
       <w:pPr>
         <w:tabs>
-          <w:tab w:val="num" w:pos="2520"/>
-        </w:tabs>
-        <w:ind w:left="2520" w:hanging="360"/>
+          <w:tab w:val="num" w:pos="3240"/>
+        </w:tabs>
+        <w:ind w:left="3240" w:hanging="360"/>
       </w:pPr>
       <w:rPr>
         <w:rFonts w:ascii="Wingdings" w:hAnsi="Wingdings" w:hint="default"/>
         <w:sz w:val="20"/>
       </w:rPr>
     </w:lvl>
-    <w:lvl w:ilvl="3" w:tentative="1">
+    <w:lvl w:ilvl="4" w:tentative="1">
       <w:start w:val="1"/>
       <w:numFmt w:val="bullet"/>
       <w:lvlText w:val=""/>
       <w:lvlJc w:val="left"/>
       <w:pPr>
         <w:tabs>
-          <w:tab w:val="num" w:pos="3240"/>
-        </w:tabs>
-        <w:ind w:left="3240" w:hanging="360"/>
+          <w:tab w:val="num" w:pos="3960"/>
+        </w:tabs>
+        <w:ind w:left="3960" w:hanging="360"/>
       </w:pPr>
       <w:rPr>
         <w:rFonts w:ascii="Wingdings" w:hAnsi="Wingdings" w:hint="default"/>
         <w:sz w:val="20"/>
       </w:rPr>
     </w:lvl>
-    <w:lvl w:ilvl="4" w:tentative="1">
+    <w:lvl w:ilvl="5" w:tentative="1">
       <w:start w:val="1"/>
       <w:numFmt w:val="bullet"/>
       <w:lvlText w:val=""/>
       <w:lvlJc w:val="left"/>
       <w:pPr>
         <w:tabs>
-          <w:tab w:val="num" w:pos="3960"/>
-        </w:tabs>
-        <w:ind w:left="3960" w:hanging="360"/>
+          <w:tab w:val="num" w:pos="4680"/>
+        </w:tabs>
+        <w:ind w:left="4680" w:hanging="360"/>
       </w:pPr>
       <w:rPr>
         <w:rFonts w:ascii="Wingdings" w:hAnsi="Wingdings" w:hint="default"/>
         <w:sz w:val="20"/>
       </w:rPr>
     </w:lvl>
-    <w:lvl w:ilvl="5" w:tentative="1">
+    <w:lvl w:ilvl="6" w:tentative="1">
       <w:start w:val="1"/>
       <w:numFmt w:val="bullet"/>
       <w:lvlText w:val=""/>
       <w:lvlJc w:val="left"/>
       <w:pPr>
         <w:tabs>
-          <w:tab w:val="num" w:pos="4680"/>
-        </w:tabs>
-        <w:ind w:left="4680" w:hanging="360"/>
+          <w:tab w:val="num" w:pos="5400"/>
+        </w:tabs>
+        <w:ind w:left="5400" w:hanging="360"/>
       </w:pPr>
       <w:rPr>
         <w:rFonts w:ascii="Wingdings" w:hAnsi="Wingdings" w:hint="default"/>
         <w:sz w:val="20"/>
       </w:rPr>
     </w:lvl>
-    <w:lvl w:ilvl="6" w:tentative="1">
+    <w:lvl w:ilvl="7" w:tentative="1">
       <w:start w:val="1"/>
       <w:numFmt w:val="bullet"/>
       <w:lvlText w:val=""/>
       <w:lvlJc w:val="left"/>
       <w:pPr>
         <w:tabs>
-          <w:tab w:val="num" w:pos="5400"/>
-        </w:tabs>
-        <w:ind w:left="5400" w:hanging="360"/>
+          <w:tab w:val="num" w:pos="6120"/>
+        </w:tabs>
+        <w:ind w:left="6120" w:hanging="360"/>
       </w:pPr>
       <w:rPr>
         <w:rFonts w:ascii="Wingdings" w:hAnsi="Wingdings" w:hint="default"/>
         <w:sz w:val="20"/>
       </w:rPr>
     </w:lvl>
-    <w:lvl w:ilvl="7" w:tentative="1">
+    <w:lvl w:ilvl="8" w:tentative="1">
       <w:start w:val="1"/>
       <w:numFmt w:val="bullet"/>
       <w:lvlText w:val=""/>
       <w:lvlJc w:val="left"/>
       <w:pPr>
         <w:tabs>
-          <w:tab w:val="num" w:pos="6120"/>
-        </w:tabs>
-        <w:ind w:left="6120" w:hanging="360"/>
+          <w:tab w:val="num" w:pos="6840"/>
+        </w:tabs>
+        <w:ind w:left="6840" w:hanging="360"/>
       </w:pPr>
       <w:rPr>
         <w:rFonts w:ascii="Wingdings" w:hAnsi="Wingdings" w:hint="default"/>
         <w:sz w:val="20"/>
       </w:rPr>
     </w:lvl>
-    <w:lvl w:ilvl="8" w:tentative="1">
-      <w:start w:val="1"/>
-      <w:numFmt w:val="bullet"/>
-      <w:lvlText w:val=""/>
-      <w:lvlJc w:val="left"/>
-      <w:pPr>
-        <w:tabs>
-          <w:tab w:val="num" w:pos="6840"/>
-        </w:tabs>
-        <w:ind w:left="6840" w:hanging="360"/>
-      </w:pPr>
-      <w:rPr>
-        <w:rFonts w:ascii="Wingdings" w:hAnsi="Wingdings" w:hint="default"/>
-        <w:sz w:val="20"/>
-      </w:rPr>
-    </w:lvl>
   </w:abstractNum>
-  <w:abstractNum w:abstractNumId="28" w15:restartNumberingAfterBreak="0">
+  <w:abstractNum w:abstractNumId="33" w15:restartNumberingAfterBreak="0">
     <w:nsid w:val="6200602F"/>
     <w:multiLevelType w:val="multilevel"/>
     <w:tmpl w:val="6EF418F8"/>
@@ -13388,7 +14926,7 @@
       </w:rPr>
     </w:lvl>
   </w:abstractNum>
-  <w:abstractNum w:abstractNumId="29" w15:restartNumberingAfterBreak="0">
+  <w:abstractNum w:abstractNumId="34" w15:restartNumberingAfterBreak="0">
     <w:nsid w:val="680B3E20"/>
     <w:multiLevelType w:val="multilevel"/>
     <w:tmpl w:val="3C0630AE"/>
@@ -13537,7 +15075,120 @@
       </w:rPr>
     </w:lvl>
   </w:abstractNum>
-  <w:abstractNum w:abstractNumId="30" w15:restartNumberingAfterBreak="0">
+  <w:abstractNum w:abstractNumId="35" w15:restartNumberingAfterBreak="0">
+    <w:nsid w:val="6B45127C"/>
+    <w:multiLevelType w:val="hybridMultilevel"/>
+    <w:tmpl w:val="389E53FA"/>
+    <w:lvl w:ilvl="0" w:tplc="04090001">
+      <w:start w:val="1"/>
+      <w:numFmt w:val="bullet"/>
+      <w:lvlText w:val=""/>
+      <w:lvlJc w:val="left"/>
+      <w:pPr>
+        <w:ind w:left="1440" w:hanging="360"/>
+      </w:pPr>
+      <w:rPr>
+        <w:rFonts w:ascii="Symbol" w:hAnsi="Symbol" w:hint="default"/>
+      </w:rPr>
+    </w:lvl>
+    <w:lvl w:ilvl="1" w:tplc="04090003" w:tentative="1">
+      <w:start w:val="1"/>
+      <w:numFmt w:val="bullet"/>
+      <w:lvlText w:val="o"/>
+      <w:lvlJc w:val="left"/>
+      <w:pPr>
+        <w:ind w:left="2160" w:hanging="360"/>
+      </w:pPr>
+      <w:rPr>
+        <w:rFonts w:ascii="Courier New" w:hAnsi="Courier New" w:cs="Courier New" w:hint="default"/>
+      </w:rPr>
+    </w:lvl>
+    <w:lvl w:ilvl="2" w:tplc="04090005" w:tentative="1">
+      <w:start w:val="1"/>
+      <w:numFmt w:val="bullet"/>
+      <w:lvlText w:val=""/>
+      <w:lvlJc w:val="left"/>
+      <w:pPr>
+        <w:ind w:left="2880" w:hanging="360"/>
+      </w:pPr>
+      <w:rPr>
+        <w:rFonts w:ascii="Wingdings" w:hAnsi="Wingdings" w:hint="default"/>
+      </w:rPr>
+    </w:lvl>
+    <w:lvl w:ilvl="3" w:tplc="04090001" w:tentative="1">
+      <w:start w:val="1"/>
+      <w:numFmt w:val="bullet"/>
+      <w:lvlText w:val=""/>
+      <w:lvlJc w:val="left"/>
+      <w:pPr>
+        <w:ind w:left="3600" w:hanging="360"/>
+      </w:pPr>
+      <w:rPr>
+        <w:rFonts w:ascii="Symbol" w:hAnsi="Symbol" w:hint="default"/>
+      </w:rPr>
+    </w:lvl>
+    <w:lvl w:ilvl="4" w:tplc="04090003" w:tentative="1">
+      <w:start w:val="1"/>
+      <w:numFmt w:val="bullet"/>
+      <w:lvlText w:val="o"/>
+      <w:lvlJc w:val="left"/>
+      <w:pPr>
+        <w:ind w:left="4320" w:hanging="360"/>
+      </w:pPr>
+      <w:rPr>
+        <w:rFonts w:ascii="Courier New" w:hAnsi="Courier New" w:cs="Courier New" w:hint="default"/>
+      </w:rPr>
+    </w:lvl>
+    <w:lvl w:ilvl="5" w:tplc="04090005" w:tentative="1">
+      <w:start w:val="1"/>
+      <w:numFmt w:val="bullet"/>
+      <w:lvlText w:val=""/>
+      <w:lvlJc w:val="left"/>
+      <w:pPr>
+        <w:ind w:left="5040" w:hanging="360"/>
+      </w:pPr>
+      <w:rPr>
+        <w:rFonts w:ascii="Wingdings" w:hAnsi="Wingdings" w:hint="default"/>
+      </w:rPr>
+    </w:lvl>
+    <w:lvl w:ilvl="6" w:tplc="04090001" w:tentative="1">
+      <w:start w:val="1"/>
+      <w:numFmt w:val="bullet"/>
+      <w:lvlText w:val=""/>
+      <w:lvlJc w:val="left"/>
+      <w:pPr>
+        <w:ind w:left="5760" w:hanging="360"/>
+      </w:pPr>
+      <w:rPr>
+        <w:rFonts w:ascii="Symbol" w:hAnsi="Symbol" w:hint="default"/>
+      </w:rPr>
+    </w:lvl>
+    <w:lvl w:ilvl="7" w:tplc="04090003" w:tentative="1">
+      <w:start w:val="1"/>
+      <w:numFmt w:val="bullet"/>
+      <w:lvlText w:val="o"/>
+      <w:lvlJc w:val="left"/>
+      <w:pPr>
+        <w:ind w:left="6480" w:hanging="360"/>
+      </w:pPr>
+      <w:rPr>
+        <w:rFonts w:ascii="Courier New" w:hAnsi="Courier New" w:cs="Courier New" w:hint="default"/>
+      </w:rPr>
+    </w:lvl>
+    <w:lvl w:ilvl="8" w:tplc="04090005" w:tentative="1">
+      <w:start w:val="1"/>
+      <w:numFmt w:val="bullet"/>
+      <w:lvlText w:val=""/>
+      <w:lvlJc w:val="left"/>
+      <w:pPr>
+        <w:ind w:left="7200" w:hanging="360"/>
+      </w:pPr>
+      <w:rPr>
+        <w:rFonts w:ascii="Wingdings" w:hAnsi="Wingdings" w:hint="default"/>
+      </w:rPr>
+    </w:lvl>
+  </w:abstractNum>
+  <w:abstractNum w:abstractNumId="36" w15:restartNumberingAfterBreak="0">
     <w:nsid w:val="71B15660"/>
     <w:multiLevelType w:val="multilevel"/>
     <w:tmpl w:val="E2D001CE"/>
@@ -13686,7 +15337,7 @@
       </w:rPr>
     </w:lvl>
   </w:abstractNum>
-  <w:abstractNum w:abstractNumId="31" w15:restartNumberingAfterBreak="0">
+  <w:abstractNum w:abstractNumId="37" w15:restartNumberingAfterBreak="0">
     <w:nsid w:val="72CE2009"/>
     <w:multiLevelType w:val="multilevel"/>
     <w:tmpl w:val="505AF05A"/>
@@ -13835,7 +15486,7 @@
       </w:rPr>
     </w:lvl>
   </w:abstractNum>
-  <w:abstractNum w:abstractNumId="32" w15:restartNumberingAfterBreak="0">
+  <w:abstractNum w:abstractNumId="38" w15:restartNumberingAfterBreak="0">
     <w:nsid w:val="7A043F69"/>
     <w:multiLevelType w:val="hybridMultilevel"/>
     <w:tmpl w:val="749A93D2"/>
@@ -13948,7 +15599,7 @@
       </w:rPr>
     </w:lvl>
   </w:abstractNum>
-  <w:abstractNum w:abstractNumId="33" w15:restartNumberingAfterBreak="0">
+  <w:abstractNum w:abstractNumId="39" w15:restartNumberingAfterBreak="0">
     <w:nsid w:val="7BC61B92"/>
     <w:multiLevelType w:val="hybridMultilevel"/>
     <w:tmpl w:val="983011EE"/>
@@ -14062,7 +15713,7 @@
       </w:rPr>
     </w:lvl>
   </w:abstractNum>
-  <w:abstractNum w:abstractNumId="34" w15:restartNumberingAfterBreak="0">
+  <w:abstractNum w:abstractNumId="40" w15:restartNumberingAfterBreak="0">
     <w:nsid w:val="7DE7481C"/>
     <w:multiLevelType w:val="multilevel"/>
     <w:tmpl w:val="569C2638"/>
@@ -14211,7 +15862,7 @@
       </w:rPr>
     </w:lvl>
   </w:abstractNum>
-  <w:abstractNum w:abstractNumId="35" w15:restartNumberingAfterBreak="0">
+  <w:abstractNum w:abstractNumId="41" w15:restartNumberingAfterBreak="0">
     <w:nsid w:val="7DF1F76B"/>
     <w:multiLevelType w:val="hybridMultilevel"/>
     <w:tmpl w:val="8B2CA670"/>
@@ -14297,7 +15948,7 @@
       </w:pPr>
     </w:lvl>
   </w:abstractNum>
-  <w:abstractNum w:abstractNumId="36" w15:restartNumberingAfterBreak="0">
+  <w:abstractNum w:abstractNumId="42" w15:restartNumberingAfterBreak="0">
     <w:nsid w:val="7FD611FE"/>
     <w:multiLevelType w:val="multilevel"/>
     <w:tmpl w:val="D7FA0DD0"/>
@@ -14446,7 +16097,7 @@
       </w:rPr>
     </w:lvl>
   </w:abstractNum>
-  <w:abstractNum w:abstractNumId="37" w15:restartNumberingAfterBreak="0">
+  <w:abstractNum w:abstractNumId="43" w15:restartNumberingAfterBreak="0">
     <w:nsid w:val="7FF819AE"/>
     <w:multiLevelType w:val="hybridMultilevel"/>
     <w:tmpl w:val="B0C27B58"/>
@@ -14541,115 +16192,133 @@
     <w:abstractNumId w:val="1"/>
   </w:num>
   <w:num w:numId="2" w16cid:durableId="1940749181">
-    <w:abstractNumId w:val="35"/>
+    <w:abstractNumId w:val="41"/>
   </w:num>
   <w:num w:numId="3" w16cid:durableId="848980572">
+    <w:abstractNumId w:val="16"/>
+  </w:num>
+  <w:num w:numId="4" w16cid:durableId="1084843252">
+    <w:abstractNumId w:val="19"/>
+  </w:num>
+  <w:num w:numId="5" w16cid:durableId="909079717">
+    <w:abstractNumId w:val="18"/>
+  </w:num>
+  <w:num w:numId="6" w16cid:durableId="1624967594">
+    <w:abstractNumId w:val="5"/>
+  </w:num>
+  <w:num w:numId="7" w16cid:durableId="1112432977">
+    <w:abstractNumId w:val="36"/>
+  </w:num>
+  <w:num w:numId="8" w16cid:durableId="310059570">
+    <w:abstractNumId w:val="32"/>
+  </w:num>
+  <w:num w:numId="9" w16cid:durableId="107430897">
+    <w:abstractNumId w:val="17"/>
+  </w:num>
+  <w:num w:numId="10" w16cid:durableId="2008239561">
+    <w:abstractNumId w:val="29"/>
+  </w:num>
+  <w:num w:numId="11" w16cid:durableId="1656493068">
+    <w:abstractNumId w:val="27"/>
+  </w:num>
+  <w:num w:numId="12" w16cid:durableId="324169437">
+    <w:abstractNumId w:val="33"/>
+  </w:num>
+  <w:num w:numId="13" w16cid:durableId="787159385">
+    <w:abstractNumId w:val="37"/>
+  </w:num>
+  <w:num w:numId="14" w16cid:durableId="710344807">
+    <w:abstractNumId w:val="9"/>
+  </w:num>
+  <w:num w:numId="15" w16cid:durableId="1472602177">
     <w:abstractNumId w:val="13"/>
   </w:num>
-  <w:num w:numId="4" w16cid:durableId="1084843252">
-    <w:abstractNumId w:val="16"/>
-  </w:num>
-  <w:num w:numId="5" w16cid:durableId="909079717">
-    <w:abstractNumId w:val="15"/>
-  </w:num>
-  <w:num w:numId="6" w16cid:durableId="1624967594">
-    <w:abstractNumId w:val="4"/>
-  </w:num>
-  <w:num w:numId="7" w16cid:durableId="1112432977">
-    <w:abstractNumId w:val="30"/>
-  </w:num>
-  <w:num w:numId="8" w16cid:durableId="310059570">
-    <w:abstractNumId w:val="27"/>
-  </w:num>
-  <w:num w:numId="9" w16cid:durableId="107430897">
-    <w:abstractNumId w:val="14"/>
-  </w:num>
-  <w:num w:numId="10" w16cid:durableId="2008239561">
-    <w:abstractNumId w:val="24"/>
-  </w:num>
-  <w:num w:numId="11" w16cid:durableId="1656493068">
-    <w:abstractNumId w:val="22"/>
-  </w:num>
-  <w:num w:numId="12" w16cid:durableId="324169437">
-    <w:abstractNumId w:val="28"/>
-  </w:num>
-  <w:num w:numId="13" w16cid:durableId="787159385">
-    <w:abstractNumId w:val="31"/>
-  </w:num>
-  <w:num w:numId="14" w16cid:durableId="710344807">
+  <w:num w:numId="16" w16cid:durableId="1565411833">
     <w:abstractNumId w:val="7"/>
   </w:num>
-  <w:num w:numId="15" w16cid:durableId="1472602177">
-    <w:abstractNumId w:val="11"/>
-  </w:num>
-  <w:num w:numId="16" w16cid:durableId="1565411833">
-    <w:abstractNumId w:val="5"/>
-  </w:num>
   <w:num w:numId="17" w16cid:durableId="2127966757">
-    <w:abstractNumId w:val="8"/>
+    <w:abstractNumId w:val="10"/>
   </w:num>
   <w:num w:numId="18" w16cid:durableId="130441640">
-    <w:abstractNumId w:val="18"/>
+    <w:abstractNumId w:val="21"/>
   </w:num>
   <w:num w:numId="19" w16cid:durableId="1814902503">
-    <w:abstractNumId w:val="17"/>
+    <w:abstractNumId w:val="20"/>
   </w:num>
   <w:num w:numId="20" w16cid:durableId="324166563">
     <w:abstractNumId w:val="3"/>
   </w:num>
   <w:num w:numId="21" w16cid:durableId="519783717">
-    <w:abstractNumId w:val="12"/>
+    <w:abstractNumId w:val="14"/>
   </w:num>
   <w:num w:numId="22" w16cid:durableId="790124702">
-    <w:abstractNumId w:val="36"/>
+    <w:abstractNumId w:val="42"/>
   </w:num>
   <w:num w:numId="23" w16cid:durableId="155658132">
-    <w:abstractNumId w:val="29"/>
+    <w:abstractNumId w:val="34"/>
   </w:num>
   <w:num w:numId="24" w16cid:durableId="1197738980">
-    <w:abstractNumId w:val="9"/>
+    <w:abstractNumId w:val="11"/>
   </w:num>
   <w:num w:numId="25" w16cid:durableId="840855979">
-    <w:abstractNumId w:val="19"/>
+    <w:abstractNumId w:val="22"/>
   </w:num>
   <w:num w:numId="26" w16cid:durableId="2029943098">
     <w:abstractNumId w:val="0"/>
   </w:num>
   <w:num w:numId="27" w16cid:durableId="1117796591">
-    <w:abstractNumId w:val="34"/>
+    <w:abstractNumId w:val="40"/>
   </w:num>
   <w:num w:numId="28" w16cid:durableId="131752309">
-    <w:abstractNumId w:val="26"/>
+    <w:abstractNumId w:val="31"/>
   </w:num>
   <w:num w:numId="29" w16cid:durableId="1250313899">
     <w:abstractNumId w:val="2"/>
   </w:num>
   <w:num w:numId="30" w16cid:durableId="116801603">
-    <w:abstractNumId w:val="20"/>
+    <w:abstractNumId w:val="24"/>
   </w:num>
   <w:num w:numId="31" w16cid:durableId="1523595511">
+    <w:abstractNumId w:val="8"/>
+  </w:num>
+  <w:num w:numId="32" w16cid:durableId="826094029">
+    <w:abstractNumId w:val="26"/>
+  </w:num>
+  <w:num w:numId="33" w16cid:durableId="1154420430">
+    <w:abstractNumId w:val="12"/>
+  </w:num>
+  <w:num w:numId="34" w16cid:durableId="1460492606">
+    <w:abstractNumId w:val="38"/>
+  </w:num>
+  <w:num w:numId="35" w16cid:durableId="320625779">
+    <w:abstractNumId w:val="39"/>
+  </w:num>
+  <w:num w:numId="36" w16cid:durableId="721174699">
+    <w:abstractNumId w:val="28"/>
+  </w:num>
+  <w:num w:numId="37" w16cid:durableId="1469861721">
+    <w:abstractNumId w:val="43"/>
+  </w:num>
+  <w:num w:numId="38" w16cid:durableId="212426123">
+    <w:abstractNumId w:val="30"/>
+  </w:num>
+  <w:num w:numId="39" w16cid:durableId="1328555422">
+    <w:abstractNumId w:val="25"/>
+  </w:num>
+  <w:num w:numId="40" w16cid:durableId="127482917">
+    <w:abstractNumId w:val="4"/>
+  </w:num>
+  <w:num w:numId="41" w16cid:durableId="475296332">
     <w:abstractNumId w:val="6"/>
   </w:num>
-  <w:num w:numId="32" w16cid:durableId="826094029">
-    <w:abstractNumId w:val="21"/>
-  </w:num>
-  <w:num w:numId="33" w16cid:durableId="1154420430">
-    <w:abstractNumId w:val="10"/>
-  </w:num>
-  <w:num w:numId="34" w16cid:durableId="1460492606">
-    <w:abstractNumId w:val="32"/>
-  </w:num>
-  <w:num w:numId="35" w16cid:durableId="320625779">
-    <w:abstractNumId w:val="33"/>
-  </w:num>
-  <w:num w:numId="36" w16cid:durableId="721174699">
+  <w:num w:numId="42" w16cid:durableId="230775442">
     <w:abstractNumId w:val="23"/>
   </w:num>
-  <w:num w:numId="37" w16cid:durableId="1469861721">
-    <w:abstractNumId w:val="37"/>
+  <w:num w:numId="43" w16cid:durableId="191262936">
+    <w:abstractNumId w:val="35"/>
   </w:num>
-  <w:num w:numId="38" w16cid:durableId="212426123">
-    <w:abstractNumId w:val="25"/>
+  <w:num w:numId="44" w16cid:durableId="1626279313">
+    <w:abstractNumId w:val="15"/>
   </w:num>
 </w:numbering>
 </file>
@@ -16186,25 +17855,12 @@
 </file>
 
 <file path=customXml/item1.xml><?xml version="1.0" encoding="utf-8"?>
-<b:Sources xmlns:b="http://schemas.openxmlformats.org/officeDocument/2006/bibliography" xmlns="http://schemas.openxmlformats.org/officeDocument/2006/bibliography" SelectedStyle="\APASixthEditionOfficeOnline.xsl" StyleName="APA" Version="6"/>
-</file>
-
-<file path=customXml/item2.xml><?xml version="1.0" encoding="utf-8"?>
 <p:properties xmlns:p="http://schemas.microsoft.com/office/2006/metadata/properties" xmlns:xsi="http://www.w3.org/2001/XMLSchema-instance" xmlns:pc="http://schemas.microsoft.com/office/infopath/2007/PartnerControls">
   <documentManagement/>
 </p:properties>
 </file>
 
-<file path=customXml/item3.xml><?xml version="1.0" encoding="utf-8"?>
-<?mso-contentType ?>
-<FormTemplates xmlns="http://schemas.microsoft.com/sharepoint/v3/contenttype/forms">
-  <Display>DocumentLibraryForm</Display>
-  <Edit>DocumentLibraryForm</Edit>
-  <New>DocumentLibraryForm</New>
-</FormTemplates>
-</file>
-
-<file path=customXml/item4.xml><?xml version="1.0" encoding="utf-8"?>
+<file path=customXml/item2.xml><?xml version="1.0" encoding="utf-8"?>
 <ct:contentTypeSchema xmlns:ct="http://schemas.microsoft.com/office/2006/metadata/contentType" xmlns:ma="http://schemas.microsoft.com/office/2006/metadata/properties/metaAttributes" ct:_="" ma:_="" ma:contentTypeName="Document" ma:contentTypeID="0x010100DD324CF696ABE44096995EA6E9653397" ma:contentTypeVersion="4" ma:contentTypeDescription="Create a new document." ma:contentTypeScope="" ma:versionID="94601065dd9065098b3e6c9965c38eba">
   <xsd:schema xmlns:xsd="http://www.w3.org/2001/XMLSchema" xmlns:xs="http://www.w3.org/2001/XMLSchema" xmlns:p="http://schemas.microsoft.com/office/2006/metadata/properties" xmlns:ns3="9ffdf6cc-3978-4601-a405-42bc48eb9bd2" targetNamespace="http://schemas.microsoft.com/office/2006/metadata/properties" ma:root="true" ma:fieldsID="862a5dd496b6ef1a8a7a086dd2f98e79" ns3:_="">
     <xsd:import namespace="9ffdf6cc-3978-4601-a405-42bc48eb9bd2"/>
@@ -16348,15 +18004,20 @@
 </ct:contentTypeSchema>
 </file>
 
-<file path=customXml/itemProps1.xml><?xml version="1.0" encoding="utf-8"?>
-<ds:datastoreItem xmlns:ds="http://schemas.openxmlformats.org/officeDocument/2006/customXml" ds:itemID="{A81FC163-2753-497E-BE40-93305BF420E8}">
-  <ds:schemaRefs>
-    <ds:schemaRef ds:uri="http://schemas.openxmlformats.org/officeDocument/2006/bibliography"/>
-  </ds:schemaRefs>
-</ds:datastoreItem>
+<file path=customXml/item3.xml><?xml version="1.0" encoding="utf-8"?>
+<b:Sources xmlns:b="http://schemas.openxmlformats.org/officeDocument/2006/bibliography" xmlns="http://schemas.openxmlformats.org/officeDocument/2006/bibliography" SelectedStyle="\APASixthEditionOfficeOnline.xsl" StyleName="APA" Version="6"/>
 </file>
 
-<file path=customXml/itemProps2.xml><?xml version="1.0" encoding="utf-8"?>
+<file path=customXml/item4.xml><?xml version="1.0" encoding="utf-8"?>
+<?mso-contentType ?>
+<FormTemplates xmlns="http://schemas.microsoft.com/sharepoint/v3/contenttype/forms">
+  <Display>DocumentLibraryForm</Display>
+  <Edit>DocumentLibraryForm</Edit>
+  <New>DocumentLibraryForm</New>
+</FormTemplates>
+</file>
+
+<file path=customXml/itemProps1.xml><?xml version="1.0" encoding="utf-8"?>
 <ds:datastoreItem xmlns:ds="http://schemas.openxmlformats.org/officeDocument/2006/customXml" ds:itemID="{0F66B206-0738-481D-9B6B-BC126CF019A4}">
   <ds:schemaRefs>
     <ds:schemaRef ds:uri="http://schemas.microsoft.com/office/2006/metadata/properties"/>
@@ -16365,15 +18026,7 @@
 </ds:datastoreItem>
 </file>
 
-<file path=customXml/itemProps3.xml><?xml version="1.0" encoding="utf-8"?>
-<ds:datastoreItem xmlns:ds="http://schemas.openxmlformats.org/officeDocument/2006/customXml" ds:itemID="{148FC632-1085-4E72-BB08-D59641C1AF1C}">
-  <ds:schemaRefs>
-    <ds:schemaRef ds:uri="http://schemas.microsoft.com/sharepoint/v3/contenttype/forms"/>
-  </ds:schemaRefs>
-</ds:datastoreItem>
-</file>
-
-<file path=customXml/itemProps4.xml><?xml version="1.0" encoding="utf-8"?>
+<file path=customXml/itemProps2.xml><?xml version="1.0" encoding="utf-8"?>
 <ds:datastoreItem xmlns:ds="http://schemas.openxmlformats.org/officeDocument/2006/customXml" ds:itemID="{0C7CAC1E-855F-4C3F-B3F4-E580E230E92B}">
   <ds:schemaRefs>
     <ds:schemaRef ds:uri="http://schemas.microsoft.com/office/2006/metadata/contentType"/>
@@ -16389,4 +18042,20 @@
     <ds:schemaRef ds:uri="http://schemas.microsoft.com/internal/obd"/>
   </ds:schemaRefs>
 </ds:datastoreItem>
+</file>
+
+<file path=customXml/itemProps3.xml><?xml version="1.0" encoding="utf-8"?>
+<ds:datastoreItem xmlns:ds="http://schemas.openxmlformats.org/officeDocument/2006/customXml" ds:itemID="{A81FC163-2753-497E-BE40-93305BF420E8}">
+  <ds:schemaRefs>
+    <ds:schemaRef ds:uri="http://schemas.openxmlformats.org/officeDocument/2006/bibliography"/>
+  </ds:schemaRefs>
+</ds:datastoreItem>
+</file>
+
+<file path=customXml/itemProps4.xml><?xml version="1.0" encoding="utf-8"?>
+<ds:datastoreItem xmlns:ds="http://schemas.openxmlformats.org/officeDocument/2006/customXml" ds:itemID="{148FC632-1085-4E72-BB08-D59641C1AF1C}">
+  <ds:schemaRefs>
+    <ds:schemaRef ds:uri="http://schemas.microsoft.com/sharepoint/v3/contenttype/forms"/>
+  </ds:schemaRefs>
+</ds:datastoreItem>
 </file>
</xml_diff>

<commit_message>
deliverable document as pdf
</commit_message>
<xml_diff>
--- a/WorkProgress/DWH_Project _20230560_20230119_20230092_20231182_20230045.docx
+++ b/WorkProgress/DWH_Project _20230560_20230119_20230092_20231182_20230045.docx
@@ -842,23 +842,13 @@
           <w:lang w:val="en-GB"/>
         </w:rPr>
       </w:pPr>
-      <w:proofErr w:type="spellStart"/>
       <w:r>
         <w:rPr>
           <w:b/>
           <w:bCs/>
           <w:lang w:val="en-GB"/>
         </w:rPr>
-        <w:t>STG_Brands</w:t>
-      </w:r>
-      <w:proofErr w:type="spellEnd"/>
-      <w:r>
-        <w:rPr>
-          <w:b/>
-          <w:bCs/>
-          <w:lang w:val="en-GB"/>
-        </w:rPr>
-        <w:t>:</w:t>
+        <w:t>STG_Brands:</w:t>
       </w:r>
       <w:r>
         <w:rPr>
@@ -879,30 +869,8 @@
         <w:rPr>
           <w:lang w:val="en-GB"/>
         </w:rPr>
-        <w:t xml:space="preserve">Columns: </w:t>
-      </w:r>
-      <w:proofErr w:type="spellStart"/>
-      <w:r>
-        <w:rPr>
-          <w:lang w:val="en-GB"/>
-        </w:rPr>
-        <w:t>brand_id</w:t>
-      </w:r>
-      <w:proofErr w:type="spellEnd"/>
-      <w:r>
-        <w:rPr>
-          <w:lang w:val="en-GB"/>
-        </w:rPr>
-        <w:t xml:space="preserve">, </w:t>
-      </w:r>
-      <w:proofErr w:type="spellStart"/>
-      <w:r>
-        <w:rPr>
-          <w:lang w:val="en-GB"/>
-        </w:rPr>
-        <w:t>brand_name</w:t>
-      </w:r>
-      <w:proofErr w:type="spellEnd"/>
+        <w:t>Columns: brand_id, brand_name</w:t>
+      </w:r>
     </w:p>
     <w:p>
       <w:pPr>
@@ -921,23 +889,13 @@
         </w:rPr>
         <w:t xml:space="preserve"> </w:t>
       </w:r>
-      <w:proofErr w:type="spellStart"/>
       <w:r>
         <w:rPr>
           <w:b/>
           <w:bCs/>
           <w:lang w:val="en-GB"/>
         </w:rPr>
-        <w:t>STG_Categories</w:t>
-      </w:r>
-      <w:proofErr w:type="spellEnd"/>
-      <w:r>
-        <w:rPr>
-          <w:b/>
-          <w:bCs/>
-          <w:lang w:val="en-GB"/>
-        </w:rPr>
-        <w:t>:</w:t>
+        <w:t>STG_Categories:</w:t>
       </w:r>
       <w:r>
         <w:rPr>
@@ -958,30 +916,8 @@
         <w:rPr>
           <w:lang w:val="en-GB"/>
         </w:rPr>
-        <w:t xml:space="preserve">Columns: </w:t>
-      </w:r>
-      <w:proofErr w:type="spellStart"/>
-      <w:r>
-        <w:rPr>
-          <w:lang w:val="en-GB"/>
-        </w:rPr>
-        <w:t>category_id</w:t>
-      </w:r>
-      <w:proofErr w:type="spellEnd"/>
-      <w:r>
-        <w:rPr>
-          <w:lang w:val="en-GB"/>
-        </w:rPr>
-        <w:t xml:space="preserve">, </w:t>
-      </w:r>
-      <w:proofErr w:type="spellStart"/>
-      <w:r>
-        <w:rPr>
-          <w:lang w:val="en-GB"/>
-        </w:rPr>
-        <w:t>category_name</w:t>
-      </w:r>
-      <w:proofErr w:type="spellEnd"/>
+        <w:t>Columns: category_id, category_name</w:t>
+      </w:r>
     </w:p>
     <w:p>
       <w:pPr>
@@ -1003,7 +939,6 @@
           <w:lang w:val="en-GB"/>
         </w:rPr>
       </w:pPr>
-      <w:proofErr w:type="spellStart"/>
       <w:r>
         <w:rPr>
           <w:b/>
@@ -1011,16 +946,7 @@
           <w:lang w:val="en-GB"/>
         </w:rPr>
         <w:lastRenderedPageBreak/>
-        <w:t>STG_Customers</w:t>
-      </w:r>
-      <w:proofErr w:type="spellEnd"/>
-      <w:r>
-        <w:rPr>
-          <w:b/>
-          <w:bCs/>
-          <w:lang w:val="en-GB"/>
-        </w:rPr>
-        <w:t>:</w:t>
+        <w:t>STG_Customers:</w:t>
       </w:r>
       <w:r>
         <w:rPr>
@@ -1041,70 +967,20 @@
         <w:rPr>
           <w:lang w:val="en-GB"/>
         </w:rPr>
-        <w:t xml:space="preserve">Columns: </w:t>
-      </w:r>
-      <w:proofErr w:type="spellStart"/>
+        <w:t>Columns: customer_id, first_name, last_name, phone, email, street, city,</w:t>
+      </w:r>
       <w:r>
         <w:rPr>
           <w:lang w:val="en-GB"/>
         </w:rPr>
-        <w:t>customer_id</w:t>
-      </w:r>
-      <w:proofErr w:type="spellEnd"/>
+        <w:t xml:space="preserve"> </w:t>
+      </w:r>
       <w:r>
         <w:rPr>
           <w:lang w:val="en-GB"/>
         </w:rPr>
-        <w:t xml:space="preserve">, </w:t>
-      </w:r>
-      <w:proofErr w:type="spellStart"/>
-      <w:r>
-        <w:rPr>
-          <w:lang w:val="en-GB"/>
-        </w:rPr>
-        <w:t>first_name</w:t>
-      </w:r>
-      <w:proofErr w:type="spellEnd"/>
-      <w:r>
-        <w:rPr>
-          <w:lang w:val="en-GB"/>
-        </w:rPr>
-        <w:t xml:space="preserve">, </w:t>
-      </w:r>
-      <w:proofErr w:type="spellStart"/>
-      <w:r>
-        <w:rPr>
-          <w:lang w:val="en-GB"/>
-        </w:rPr>
-        <w:t>last_name</w:t>
-      </w:r>
-      <w:proofErr w:type="spellEnd"/>
-      <w:r>
-        <w:rPr>
-          <w:lang w:val="en-GB"/>
-        </w:rPr>
-        <w:t>, phone, email, street, city,</w:t>
-      </w:r>
-      <w:r>
-        <w:rPr>
-          <w:lang w:val="en-GB"/>
-        </w:rPr>
-        <w:t xml:space="preserve"> </w:t>
-      </w:r>
-      <w:r>
-        <w:rPr>
-          <w:lang w:val="en-GB"/>
-        </w:rPr>
-        <w:t xml:space="preserve">state, </w:t>
-      </w:r>
-      <w:proofErr w:type="spellStart"/>
-      <w:r>
-        <w:rPr>
-          <w:lang w:val="en-GB"/>
-        </w:rPr>
-        <w:t>zip_code</w:t>
-      </w:r>
-      <w:proofErr w:type="spellEnd"/>
+        <w:t>state, zip_code</w:t>
+      </w:r>
     </w:p>
     <w:p>
       <w:pPr>
@@ -1117,23 +993,13 @@
           <w:lang w:val="en-GB"/>
         </w:rPr>
       </w:pPr>
-      <w:proofErr w:type="spellStart"/>
       <w:r>
         <w:rPr>
           <w:b/>
           <w:bCs/>
           <w:lang w:val="en-GB"/>
         </w:rPr>
-        <w:t>STG_Order_Items</w:t>
-      </w:r>
-      <w:proofErr w:type="spellEnd"/>
-      <w:r>
-        <w:rPr>
-          <w:b/>
-          <w:bCs/>
-          <w:lang w:val="en-GB"/>
-        </w:rPr>
-        <w:t>:</w:t>
+        <w:t>STG_Order_Items:</w:t>
       </w:r>
       <w:r>
         <w:rPr>
@@ -1154,63 +1020,7 @@
         <w:rPr>
           <w:lang w:val="en-GB"/>
         </w:rPr>
-        <w:t xml:space="preserve">Columns: </w:t>
-      </w:r>
-      <w:proofErr w:type="spellStart"/>
-      <w:r>
-        <w:rPr>
-          <w:lang w:val="en-GB"/>
-        </w:rPr>
-        <w:t>order_id</w:t>
-      </w:r>
-      <w:proofErr w:type="spellEnd"/>
-      <w:r>
-        <w:rPr>
-          <w:lang w:val="en-GB"/>
-        </w:rPr>
-        <w:t xml:space="preserve">, </w:t>
-      </w:r>
-      <w:proofErr w:type="spellStart"/>
-      <w:r>
-        <w:rPr>
-          <w:lang w:val="en-GB"/>
-        </w:rPr>
-        <w:t>item_id</w:t>
-      </w:r>
-      <w:proofErr w:type="spellEnd"/>
-      <w:r>
-        <w:rPr>
-          <w:lang w:val="en-GB"/>
-        </w:rPr>
-        <w:t xml:space="preserve">, </w:t>
-      </w:r>
-      <w:proofErr w:type="spellStart"/>
-      <w:r>
-        <w:rPr>
-          <w:lang w:val="en-GB"/>
-        </w:rPr>
-        <w:t>product_id</w:t>
-      </w:r>
-      <w:proofErr w:type="spellEnd"/>
-      <w:r>
-        <w:rPr>
-          <w:lang w:val="en-GB"/>
-        </w:rPr>
-        <w:t xml:space="preserve">, quantity, </w:t>
-      </w:r>
-      <w:proofErr w:type="spellStart"/>
-      <w:r>
-        <w:rPr>
-          <w:lang w:val="en-GB"/>
-        </w:rPr>
-        <w:t>list_price</w:t>
-      </w:r>
-      <w:proofErr w:type="spellEnd"/>
-      <w:r>
-        <w:rPr>
-          <w:lang w:val="en-GB"/>
-        </w:rPr>
-        <w:t>, discount</w:t>
+        <w:t>Columns: order_id, item_id, product_id, quantity, list_price, discount</w:t>
       </w:r>
     </w:p>
     <w:p>
@@ -1224,43 +1034,19 @@
           <w:lang w:val="en-GB"/>
         </w:rPr>
       </w:pPr>
-      <w:proofErr w:type="spellStart"/>
       <w:r>
         <w:rPr>
           <w:b/>
           <w:bCs/>
           <w:lang w:val="en-GB"/>
         </w:rPr>
-        <w:t>STG_Orders</w:t>
-      </w:r>
-      <w:proofErr w:type="spellEnd"/>
-      <w:r>
-        <w:rPr>
-          <w:b/>
-          <w:bCs/>
+        <w:t>STG_Orders:</w:t>
+      </w:r>
+      <w:r>
+        <w:rPr>
           <w:lang w:val="en-GB"/>
         </w:rPr>
-        <w:t>:</w:t>
-      </w:r>
-      <w:r>
-        <w:rPr>
-          <w:lang w:val="en-GB"/>
-        </w:rPr>
-        <w:t xml:space="preserve"> Tracks the header-level details including order status and key </w:t>
-      </w:r>
-      <w:proofErr w:type="spellStart"/>
-      <w:r>
-        <w:rPr>
-          <w:lang w:val="en-GB"/>
-        </w:rPr>
-        <w:t>fulfillment</w:t>
-      </w:r>
-      <w:proofErr w:type="spellEnd"/>
-      <w:r>
-        <w:rPr>
-          <w:lang w:val="en-GB"/>
-        </w:rPr>
-        <w:t xml:space="preserve"> dates.</w:t>
+        <w:t xml:space="preserve"> Tracks the header-level details including order status and key fulfillment dates.</w:t>
       </w:r>
     </w:p>
     <w:p>
@@ -1275,114 +1061,8 @@
         <w:rPr>
           <w:lang w:val="en-GB"/>
         </w:rPr>
-        <w:t xml:space="preserve">Columns: </w:t>
-      </w:r>
-      <w:proofErr w:type="spellStart"/>
-      <w:r>
-        <w:rPr>
-          <w:lang w:val="en-GB"/>
-        </w:rPr>
-        <w:t>order_id</w:t>
-      </w:r>
-      <w:proofErr w:type="spellEnd"/>
-      <w:r>
-        <w:rPr>
-          <w:lang w:val="en-GB"/>
-        </w:rPr>
-        <w:t xml:space="preserve">, </w:t>
-      </w:r>
-      <w:proofErr w:type="spellStart"/>
-      <w:r>
-        <w:rPr>
-          <w:lang w:val="en-GB"/>
-        </w:rPr>
-        <w:t>customer_id</w:t>
-      </w:r>
-      <w:proofErr w:type="spellEnd"/>
-      <w:r>
-        <w:rPr>
-          <w:lang w:val="en-GB"/>
-        </w:rPr>
-        <w:t xml:space="preserve">, </w:t>
-      </w:r>
-      <w:proofErr w:type="spellStart"/>
-      <w:r>
-        <w:rPr>
-          <w:lang w:val="en-GB"/>
-        </w:rPr>
-        <w:t>order_status</w:t>
-      </w:r>
-      <w:proofErr w:type="spellEnd"/>
-      <w:r>
-        <w:rPr>
-          <w:lang w:val="en-GB"/>
-        </w:rPr>
-        <w:t xml:space="preserve">, </w:t>
-      </w:r>
-      <w:proofErr w:type="spellStart"/>
-      <w:r>
-        <w:rPr>
-          <w:lang w:val="en-GB"/>
-        </w:rPr>
-        <w:t>order_date</w:t>
-      </w:r>
-      <w:proofErr w:type="spellEnd"/>
-      <w:r>
-        <w:rPr>
-          <w:lang w:val="en-GB"/>
-        </w:rPr>
-        <w:t xml:space="preserve">, </w:t>
-      </w:r>
-      <w:proofErr w:type="spellStart"/>
-      <w:r>
-        <w:rPr>
-          <w:lang w:val="en-GB"/>
-        </w:rPr>
-        <w:t>required_date</w:t>
-      </w:r>
-      <w:proofErr w:type="spellEnd"/>
-      <w:r>
-        <w:rPr>
-          <w:lang w:val="en-GB"/>
-        </w:rPr>
-        <w:t xml:space="preserve">, </w:t>
-      </w:r>
-      <w:proofErr w:type="spellStart"/>
-      <w:r>
-        <w:rPr>
-          <w:lang w:val="en-GB"/>
-        </w:rPr>
-        <w:t>shipped_date</w:t>
-      </w:r>
-      <w:proofErr w:type="spellEnd"/>
-      <w:r>
-        <w:rPr>
-          <w:lang w:val="en-GB"/>
-        </w:rPr>
-        <w:t xml:space="preserve">, </w:t>
-      </w:r>
-      <w:proofErr w:type="spellStart"/>
-      <w:r>
-        <w:rPr>
-          <w:lang w:val="en-GB"/>
-        </w:rPr>
-        <w:t>store_id</w:t>
-      </w:r>
-      <w:proofErr w:type="spellEnd"/>
-      <w:r>
-        <w:rPr>
-          <w:lang w:val="en-GB"/>
-        </w:rPr>
-        <w:t xml:space="preserve">, </w:t>
-      </w:r>
-      <w:proofErr w:type="spellStart"/>
-      <w:r>
-        <w:rPr>
-          <w:lang w:val="en-GB"/>
-        </w:rPr>
-        <w:t>staff_id</w:t>
-      </w:r>
-      <w:proofErr w:type="spellEnd"/>
+        <w:t>Columns: order_id, customer_id, order_status, order_date, required_date, shipped_date, store_id, staff_id</w:t>
+      </w:r>
     </w:p>
     <w:p>
       <w:pPr>
@@ -1407,21 +1087,7 @@
         <w:rPr>
           <w:lang w:val="en-GB"/>
         </w:rPr>
-        <w:t xml:space="preserve">: Serves as the master </w:t>
-      </w:r>
-      <w:proofErr w:type="spellStart"/>
-      <w:r>
-        <w:rPr>
-          <w:lang w:val="en-GB"/>
-        </w:rPr>
-        <w:t>catalog</w:t>
-      </w:r>
-      <w:proofErr w:type="spellEnd"/>
-      <w:r>
-        <w:rPr>
-          <w:lang w:val="en-GB"/>
-        </w:rPr>
-        <w:t xml:space="preserve"> for all bicycle models and their specifications.</w:t>
+        <w:t>: Serves as the master catalog for all bicycle models and their specifications.</w:t>
       </w:r>
     </w:p>
     <w:p>
@@ -1436,86 +1102,8 @@
         <w:rPr>
           <w:lang w:val="en-GB"/>
         </w:rPr>
-        <w:t xml:space="preserve">Columns: </w:t>
-      </w:r>
-      <w:proofErr w:type="spellStart"/>
-      <w:r>
-        <w:rPr>
-          <w:lang w:val="en-GB"/>
-        </w:rPr>
-        <w:t>product_id</w:t>
-      </w:r>
-      <w:proofErr w:type="spellEnd"/>
-      <w:r>
-        <w:rPr>
-          <w:lang w:val="en-GB"/>
-        </w:rPr>
-        <w:t xml:space="preserve">, </w:t>
-      </w:r>
-      <w:proofErr w:type="spellStart"/>
-      <w:r>
-        <w:rPr>
-          <w:lang w:val="en-GB"/>
-        </w:rPr>
-        <w:t>product_name</w:t>
-      </w:r>
-      <w:proofErr w:type="spellEnd"/>
-      <w:r>
-        <w:rPr>
-          <w:lang w:val="en-GB"/>
-        </w:rPr>
-        <w:t xml:space="preserve">, </w:t>
-      </w:r>
-      <w:proofErr w:type="spellStart"/>
-      <w:r>
-        <w:rPr>
-          <w:lang w:val="en-GB"/>
-        </w:rPr>
-        <w:t>brand_id</w:t>
-      </w:r>
-      <w:proofErr w:type="spellEnd"/>
-      <w:r>
-        <w:rPr>
-          <w:lang w:val="en-GB"/>
-        </w:rPr>
-        <w:t xml:space="preserve">, </w:t>
-      </w:r>
-      <w:proofErr w:type="spellStart"/>
-      <w:r>
-        <w:rPr>
-          <w:lang w:val="en-GB"/>
-        </w:rPr>
-        <w:t>category_id</w:t>
-      </w:r>
-      <w:proofErr w:type="spellEnd"/>
-      <w:r>
-        <w:rPr>
-          <w:lang w:val="en-GB"/>
-        </w:rPr>
-        <w:t xml:space="preserve">, </w:t>
-      </w:r>
-      <w:proofErr w:type="spellStart"/>
-      <w:r>
-        <w:rPr>
-          <w:lang w:val="en-GB"/>
-        </w:rPr>
-        <w:t>model_year</w:t>
-      </w:r>
-      <w:proofErr w:type="spellEnd"/>
-      <w:r>
-        <w:rPr>
-          <w:lang w:val="en-GB"/>
-        </w:rPr>
-        <w:t xml:space="preserve">, </w:t>
-      </w:r>
-      <w:proofErr w:type="spellStart"/>
-      <w:r>
-        <w:rPr>
-          <w:lang w:val="en-GB"/>
-        </w:rPr>
-        <w:t>list_price</w:t>
-      </w:r>
-      <w:proofErr w:type="spellEnd"/>
+        <w:t>Columns: product_id, product_name, brand_id, category_id, model_year, list_price</w:t>
+      </w:r>
     </w:p>
     <w:p>
       <w:pPr>
@@ -1528,23 +1116,13 @@
           <w:lang w:val="en-GB"/>
         </w:rPr>
       </w:pPr>
-      <w:proofErr w:type="spellStart"/>
       <w:r>
         <w:rPr>
           <w:b/>
           <w:bCs/>
           <w:lang w:val="en-GB"/>
         </w:rPr>
-        <w:t>STG_Staffs</w:t>
-      </w:r>
-      <w:proofErr w:type="spellEnd"/>
-      <w:r>
-        <w:rPr>
-          <w:b/>
-          <w:bCs/>
-          <w:lang w:val="en-GB"/>
-        </w:rPr>
-        <w:t>:</w:t>
+        <w:t>STG_Staffs:</w:t>
       </w:r>
       <w:r>
         <w:rPr>
@@ -1565,72 +1143,8 @@
         <w:rPr>
           <w:lang w:val="en-GB"/>
         </w:rPr>
-        <w:t xml:space="preserve">Columns: </w:t>
-      </w:r>
-      <w:proofErr w:type="spellStart"/>
-      <w:r>
-        <w:rPr>
-          <w:lang w:val="en-GB"/>
-        </w:rPr>
-        <w:t>staff_id</w:t>
-      </w:r>
-      <w:proofErr w:type="spellEnd"/>
-      <w:r>
-        <w:rPr>
-          <w:lang w:val="en-GB"/>
-        </w:rPr>
-        <w:t xml:space="preserve">, </w:t>
-      </w:r>
-      <w:proofErr w:type="spellStart"/>
-      <w:r>
-        <w:rPr>
-          <w:lang w:val="en-GB"/>
-        </w:rPr>
-        <w:t>first_name</w:t>
-      </w:r>
-      <w:proofErr w:type="spellEnd"/>
-      <w:r>
-        <w:rPr>
-          <w:lang w:val="en-GB"/>
-        </w:rPr>
-        <w:t xml:space="preserve">, </w:t>
-      </w:r>
-      <w:proofErr w:type="spellStart"/>
-      <w:r>
-        <w:rPr>
-          <w:lang w:val="en-GB"/>
-        </w:rPr>
-        <w:t>last_name</w:t>
-      </w:r>
-      <w:proofErr w:type="spellEnd"/>
-      <w:r>
-        <w:rPr>
-          <w:lang w:val="en-GB"/>
-        </w:rPr>
-        <w:t xml:space="preserve">, email, phone, active, </w:t>
-      </w:r>
-      <w:proofErr w:type="spellStart"/>
-      <w:r>
-        <w:rPr>
-          <w:lang w:val="en-GB"/>
-        </w:rPr>
-        <w:t>store_id</w:t>
-      </w:r>
-      <w:proofErr w:type="spellEnd"/>
-      <w:r>
-        <w:rPr>
-          <w:lang w:val="en-GB"/>
-        </w:rPr>
-        <w:t xml:space="preserve">, </w:t>
-      </w:r>
-      <w:proofErr w:type="spellStart"/>
-      <w:r>
-        <w:rPr>
-          <w:lang w:val="en-GB"/>
-        </w:rPr>
-        <w:t>manager_id</w:t>
-      </w:r>
-      <w:proofErr w:type="spellEnd"/>
+        <w:t>Columns: staff_id, first_name, last_name, email, phone, active, store_id, manager_id</w:t>
+      </w:r>
     </w:p>
     <w:p>
       <w:pPr>
@@ -1643,23 +1157,13 @@
           <w:lang w:val="en-GB"/>
         </w:rPr>
       </w:pPr>
-      <w:proofErr w:type="spellStart"/>
       <w:r>
         <w:rPr>
           <w:b/>
           <w:bCs/>
           <w:lang w:val="en-GB"/>
         </w:rPr>
-        <w:t>STG_Stocks</w:t>
-      </w:r>
-      <w:proofErr w:type="spellEnd"/>
-      <w:r>
-        <w:rPr>
-          <w:b/>
-          <w:bCs/>
-          <w:lang w:val="en-GB"/>
-        </w:rPr>
-        <w:t>:</w:t>
+        <w:t>STG_Stocks:</w:t>
       </w:r>
       <w:r>
         <w:rPr>
@@ -1680,35 +1184,7 @@
         <w:rPr>
           <w:lang w:val="en-GB"/>
         </w:rPr>
-        <w:t xml:space="preserve">Columns: </w:t>
-      </w:r>
-      <w:proofErr w:type="spellStart"/>
-      <w:r>
-        <w:rPr>
-          <w:lang w:val="en-GB"/>
-        </w:rPr>
-        <w:t>store_id</w:t>
-      </w:r>
-      <w:proofErr w:type="spellEnd"/>
-      <w:r>
-        <w:rPr>
-          <w:lang w:val="en-GB"/>
-        </w:rPr>
-        <w:t xml:space="preserve">, </w:t>
-      </w:r>
-      <w:proofErr w:type="spellStart"/>
-      <w:r>
-        <w:rPr>
-          <w:lang w:val="en-GB"/>
-        </w:rPr>
-        <w:t>product_id</w:t>
-      </w:r>
-      <w:proofErr w:type="spellEnd"/>
-      <w:r>
-        <w:rPr>
-          <w:lang w:val="en-GB"/>
-        </w:rPr>
-        <w:t>, quantity</w:t>
+        <w:t>Columns: store_id, product_id, quantity</w:t>
       </w:r>
     </w:p>
     <w:p>
@@ -1749,44 +1225,8 @@
         <w:rPr>
           <w:lang w:val="en-GB"/>
         </w:rPr>
-        <w:t xml:space="preserve">Columns: </w:t>
-      </w:r>
-      <w:proofErr w:type="spellStart"/>
-      <w:r>
-        <w:rPr>
-          <w:lang w:val="en-GB"/>
-        </w:rPr>
-        <w:t>store_id</w:t>
-      </w:r>
-      <w:proofErr w:type="spellEnd"/>
-      <w:r>
-        <w:rPr>
-          <w:lang w:val="en-GB"/>
-        </w:rPr>
-        <w:t xml:space="preserve">, </w:t>
-      </w:r>
-      <w:proofErr w:type="spellStart"/>
-      <w:r>
-        <w:rPr>
-          <w:lang w:val="en-GB"/>
-        </w:rPr>
-        <w:t>store_name</w:t>
-      </w:r>
-      <w:proofErr w:type="spellEnd"/>
-      <w:r>
-        <w:rPr>
-          <w:lang w:val="en-GB"/>
-        </w:rPr>
-        <w:t xml:space="preserve">, phone, email, street, city, state, </w:t>
-      </w:r>
-      <w:proofErr w:type="spellStart"/>
-      <w:r>
-        <w:rPr>
-          <w:lang w:val="en-GB"/>
-        </w:rPr>
-        <w:t>zip_code</w:t>
-      </w:r>
-      <w:proofErr w:type="spellEnd"/>
+        <w:t>Columns: store_id, store_name, phone, email, street, city, state, zip_code</w:t>
+      </w:r>
     </w:p>
     <w:p>
       <w:pPr>
@@ -1909,21 +1349,7 @@
         <w:rPr>
           <w:lang w:val="en-GB"/>
         </w:rPr>
-        <w:t xml:space="preserve">sing </w:t>
-      </w:r>
-      <w:proofErr w:type="spellStart"/>
-      <w:r>
-        <w:rPr>
-          <w:lang w:val="en-GB"/>
-        </w:rPr>
-        <w:t>list_price</w:t>
-      </w:r>
-      <w:proofErr w:type="spellEnd"/>
-      <w:r>
-        <w:rPr>
-          <w:lang w:val="en-GB"/>
-        </w:rPr>
-        <w:t xml:space="preserve"> and discount from order_items.csv.</w:t>
+        <w:t>sing list_price and discount from order_items.csv.</w:t>
       </w:r>
     </w:p>
     <w:p>
@@ -1965,35 +1391,7 @@
         <w:rPr>
           <w:lang w:val="en-GB"/>
         </w:rPr>
-        <w:t xml:space="preserve">performance by comparing </w:t>
-      </w:r>
-      <w:proofErr w:type="spellStart"/>
-      <w:r>
-        <w:rPr>
-          <w:lang w:val="en-GB"/>
-        </w:rPr>
-        <w:t>required_date</w:t>
-      </w:r>
-      <w:proofErr w:type="spellEnd"/>
-      <w:r>
-        <w:rPr>
-          <w:lang w:val="en-GB"/>
-        </w:rPr>
-        <w:t xml:space="preserve"> and </w:t>
-      </w:r>
-      <w:proofErr w:type="spellStart"/>
-      <w:r>
-        <w:rPr>
-          <w:lang w:val="en-GB"/>
-        </w:rPr>
-        <w:t>shipped_date</w:t>
-      </w:r>
-      <w:proofErr w:type="spellEnd"/>
-      <w:r>
-        <w:rPr>
-          <w:lang w:val="en-GB"/>
-        </w:rPr>
-        <w:t xml:space="preserve"> from the orders.csv file</w:t>
+        <w:t>performance by comparing required_date and shipped_date from the orders.csv file</w:t>
       </w:r>
       <w:r>
         <w:rPr>
@@ -2029,49 +1427,7 @@
         <w:rPr>
           <w:lang w:val="en-GB"/>
         </w:rPr>
-        <w:t xml:space="preserve">: </w:t>
-      </w:r>
-      <w:proofErr w:type="spellStart"/>
-      <w:r>
-        <w:rPr>
-          <w:lang w:val="en-GB"/>
-        </w:rPr>
-        <w:t>Analyzing</w:t>
-      </w:r>
-      <w:proofErr w:type="spellEnd"/>
-      <w:r>
-        <w:rPr>
-          <w:lang w:val="en-GB"/>
-        </w:rPr>
-        <w:t xml:space="preserve"> order success and store-level performance using </w:t>
-      </w:r>
-      <w:proofErr w:type="spellStart"/>
-      <w:r>
-        <w:rPr>
-          <w:lang w:val="en-GB"/>
-        </w:rPr>
-        <w:t>order_status</w:t>
-      </w:r>
-      <w:proofErr w:type="spellEnd"/>
-      <w:r>
-        <w:rPr>
-          <w:lang w:val="en-GB"/>
-        </w:rPr>
-        <w:t xml:space="preserve"> and </w:t>
-      </w:r>
-      <w:proofErr w:type="spellStart"/>
-      <w:r>
-        <w:rPr>
-          <w:lang w:val="en-GB"/>
-        </w:rPr>
-        <w:t>store_id</w:t>
-      </w:r>
-      <w:proofErr w:type="spellEnd"/>
-      <w:r>
-        <w:rPr>
-          <w:lang w:val="en-GB"/>
-        </w:rPr>
-        <w:t>.</w:t>
+        <w:t>: Analyzing order success and store-level performance using order_status and store_id.</w:t>
       </w:r>
       <w:r>
         <w:rPr>
@@ -2232,7 +1588,6 @@
           <w:bCs/>
         </w:rPr>
       </w:pPr>
-      <w:proofErr w:type="spellStart"/>
       <w:r>
         <w:rPr>
           <w:b/>
@@ -2241,7 +1596,6 @@
         </w:rPr>
         <w:t>Fact_Sales</w:t>
       </w:r>
-      <w:proofErr w:type="spellEnd"/>
     </w:p>
     <w:p>
       <w:pPr>
@@ -2365,21 +1719,7 @@
         <w:rPr>
           <w:lang w:val="en-GB"/>
         </w:rPr>
-        <w:t xml:space="preserve">: The sum of </w:t>
-      </w:r>
-      <w:proofErr w:type="spellStart"/>
-      <w:r>
-        <w:rPr>
-          <w:lang w:val="en-GB"/>
-        </w:rPr>
-        <w:t>SalesAmount</w:t>
-      </w:r>
-      <w:proofErr w:type="spellEnd"/>
-      <w:r>
-        <w:rPr>
-          <w:lang w:val="en-GB"/>
-        </w:rPr>
-        <w:t xml:space="preserve"> minus Discount to show actual earnings</w:t>
+        <w:t>: The sum of SalesAmount minus Discount to show actual earnings</w:t>
       </w:r>
       <w:r>
         <w:rPr>
@@ -2421,21 +1761,7 @@
         <w:rPr>
           <w:lang w:val="en-GB"/>
         </w:rPr>
-        <w:t xml:space="preserve">: The total discount value divided by total </w:t>
-      </w:r>
-      <w:proofErr w:type="spellStart"/>
-      <w:r>
-        <w:rPr>
-          <w:lang w:val="en-GB"/>
-        </w:rPr>
-        <w:t>SalesAmount</w:t>
-      </w:r>
-      <w:proofErr w:type="spellEnd"/>
-      <w:r>
-        <w:rPr>
-          <w:lang w:val="en-GB"/>
-        </w:rPr>
-        <w:t xml:space="preserve"> to monitor price reductions.</w:t>
+        <w:t>: The total discount value divided by total SalesAmount to monitor price reductions.</w:t>
       </w:r>
     </w:p>
     <w:p>
@@ -2526,7 +1852,6 @@
           <w:lang w:val="en-GB"/>
         </w:rPr>
       </w:pPr>
-      <w:proofErr w:type="spellStart"/>
       <w:r>
         <w:rPr>
           <w:b/>
@@ -2535,7 +1860,6 @@
         </w:rPr>
         <w:t>Fact_Shipping</w:t>
       </w:r>
-      <w:proofErr w:type="spellEnd"/>
     </w:p>
     <w:p>
       <w:pPr>
@@ -2707,25 +2031,7 @@
           <w:bCs/>
           <w:lang w:val="en-GB"/>
         </w:rPr>
-        <w:t xml:space="preserve">Average </w:t>
-      </w:r>
-      <w:proofErr w:type="spellStart"/>
-      <w:r>
-        <w:rPr>
-          <w:b/>
-          <w:bCs/>
-          <w:lang w:val="en-GB"/>
-        </w:rPr>
-        <w:t>Fulfillment</w:t>
-      </w:r>
-      <w:proofErr w:type="spellEnd"/>
-      <w:r>
-        <w:rPr>
-          <w:b/>
-          <w:bCs/>
-          <w:lang w:val="en-GB"/>
-        </w:rPr>
-        <w:t xml:space="preserve"> Time</w:t>
+        <w:t>Average Fulfillment Time</w:t>
       </w:r>
       <w:r>
         <w:rPr>
@@ -2766,7 +2072,6 @@
           <w:lang w:val="en-GB"/>
         </w:rPr>
       </w:pPr>
-      <w:proofErr w:type="spellStart"/>
       <w:r>
         <w:rPr>
           <w:b/>
@@ -2776,7 +2081,6 @@
         <w:lastRenderedPageBreak/>
         <w:t>Fact_Orders</w:t>
       </w:r>
-      <w:proofErr w:type="spellEnd"/>
     </w:p>
     <w:p>
       <w:pPr>
@@ -3025,15 +2329,7 @@
         </w:rPr>
       </w:pPr>
       <w:r>
-        <w:t xml:space="preserve">We implemented 6 Dimension tables using an SCD Type </w:t>
-      </w:r>
-      <w:proofErr w:type="gramStart"/>
-      <w:r>
-        <w:t>1 ,</w:t>
-      </w:r>
-      <w:proofErr w:type="gramEnd"/>
-      <w:r>
-        <w:t xml:space="preserve"> SCD Type 0(Slowly Changing Dimension) and Static strategy</w:t>
+        <w:t>We implemented 6 Dimension tables using an SCD Type 1 , SCD Type 0(Slowly Changing Dimension) and Static strategy</w:t>
       </w:r>
       <w:r>
         <w:t xml:space="preserve">. </w:t>
@@ -3127,11 +2423,9 @@
                 <w:bCs w:val="0"/>
               </w:rPr>
             </w:pPr>
-            <w:proofErr w:type="spellStart"/>
             <w:r>
               <w:t>Dim_Date</w:t>
             </w:r>
-            <w:proofErr w:type="spellEnd"/>
           </w:p>
         </w:tc>
         <w:tc>
@@ -3175,31 +2469,7 @@
               <w:t xml:space="preserve">time dimension </w:t>
             </w:r>
             <w:r>
-              <w:t xml:space="preserve">based on the </w:t>
-            </w:r>
-            <w:proofErr w:type="spellStart"/>
-            <w:r>
-              <w:t>order_date</w:t>
-            </w:r>
-            <w:proofErr w:type="spellEnd"/>
-            <w:r>
-              <w:t xml:space="preserve">, </w:t>
-            </w:r>
-            <w:proofErr w:type="spellStart"/>
-            <w:r>
-              <w:t>required_date</w:t>
-            </w:r>
-            <w:proofErr w:type="spellEnd"/>
-            <w:r>
-              <w:t xml:space="preserve"> and </w:t>
-            </w:r>
-            <w:proofErr w:type="spellStart"/>
-            <w:r>
-              <w:t>shipped_date</w:t>
-            </w:r>
-            <w:proofErr w:type="spellEnd"/>
-            <w:r>
-              <w:t xml:space="preserve"> </w:t>
+              <w:t xml:space="preserve">based on the order_date, required_date and shipped_date </w:t>
             </w:r>
             <w:r>
               <w:t>covering years 201</w:t>
@@ -3233,11 +2503,9 @@
                 <w:bCs w:val="0"/>
               </w:rPr>
             </w:pPr>
-            <w:proofErr w:type="spellStart"/>
             <w:r>
               <w:t>Dim_Customer</w:t>
             </w:r>
-            <w:proofErr w:type="spellEnd"/>
           </w:p>
         </w:tc>
         <w:tc>
@@ -3297,11 +2565,9 @@
                 <w:bCs w:val="0"/>
               </w:rPr>
             </w:pPr>
-            <w:proofErr w:type="spellStart"/>
             <w:r>
               <w:t>Dim_Product</w:t>
             </w:r>
-            <w:proofErr w:type="spellEnd"/>
           </w:p>
         </w:tc>
         <w:tc>
@@ -3364,11 +2630,9 @@
                 <w:bCs w:val="0"/>
               </w:rPr>
             </w:pPr>
-            <w:proofErr w:type="spellStart"/>
             <w:r>
               <w:t>Dim_Geography</w:t>
             </w:r>
-            <w:proofErr w:type="spellEnd"/>
           </w:p>
         </w:tc>
         <w:tc>
@@ -3428,11 +2692,9 @@
                 <w:bCs w:val="0"/>
               </w:rPr>
             </w:pPr>
-            <w:proofErr w:type="spellStart"/>
             <w:r>
               <w:t>Dim_Staff</w:t>
             </w:r>
-            <w:proofErr w:type="spellEnd"/>
           </w:p>
         </w:tc>
         <w:tc>
@@ -3492,14 +2754,12 @@
                 <w:bCs w:val="0"/>
               </w:rPr>
             </w:pPr>
-            <w:proofErr w:type="spellStart"/>
             <w:r>
               <w:t>Dim_Order_</w:t>
             </w:r>
             <w:r>
               <w:t>Status</w:t>
             </w:r>
-            <w:proofErr w:type="spellEnd"/>
           </w:p>
         </w:tc>
         <w:tc>
@@ -3724,7 +2984,6 @@
                 <w14:ligatures w14:val="none"/>
               </w:rPr>
             </w:pPr>
-            <w:proofErr w:type="spellStart"/>
             <w:r>
               <w:rPr>
                 <w:rFonts w:ascii="Arial" w:eastAsia="Times New Roman" w:hAnsi="Arial" w:cs="Arial"/>
@@ -3735,7 +2994,6 @@
               </w:rPr>
               <w:t>SalesAmount</w:t>
             </w:r>
-            <w:proofErr w:type="spellEnd"/>
           </w:p>
         </w:tc>
         <w:tc>
@@ -3752,23 +3010,13 @@
                 <w14:ligatures w14:val="none"/>
               </w:rPr>
             </w:pPr>
-            <w:proofErr w:type="gramStart"/>
             <w:r>
               <w:rPr>
                 <w:rFonts w:ascii="Arial" w:eastAsia="Times New Roman" w:hAnsi="Arial" w:cs="Arial"/>
                 <w:kern w:val="0"/>
                 <w14:ligatures w14:val="none"/>
               </w:rPr>
-              <w:t>Decimal(</w:t>
-            </w:r>
-            <w:proofErr w:type="gramEnd"/>
-            <w:r>
-              <w:rPr>
-                <w:rFonts w:ascii="Arial" w:eastAsia="Times New Roman" w:hAnsi="Arial" w:cs="Arial"/>
-                <w:kern w:val="0"/>
-                <w14:ligatures w14:val="none"/>
-              </w:rPr>
-              <w:t>18,2)</w:t>
+              <w:t>Decimal(18,2)</w:t>
             </w:r>
           </w:p>
         </w:tc>
@@ -3810,18 +3058,8 @@
                 <w:kern w:val="0"/>
                 <w14:ligatures w14:val="none"/>
               </w:rPr>
-              <w:t xml:space="preserve">Quantity * </w:t>
+              <w:t>Quantity * list_price</w:t>
             </w:r>
-            <w:proofErr w:type="spellStart"/>
-            <w:r>
-              <w:rPr>
-                <w:rFonts w:ascii="Arial" w:eastAsia="Times New Roman" w:hAnsi="Arial" w:cs="Arial"/>
-                <w:kern w:val="0"/>
-                <w14:ligatures w14:val="none"/>
-              </w:rPr>
-              <w:t>list_price</w:t>
-            </w:r>
-            <w:proofErr w:type="spellEnd"/>
             <w:r>
               <w:rPr>
                 <w:rFonts w:ascii="Arial" w:eastAsia="Times New Roman" w:hAnsi="Arial" w:cs="Arial"/>
@@ -4001,23 +3239,13 @@
                 <w14:ligatures w14:val="none"/>
               </w:rPr>
             </w:pPr>
-            <w:proofErr w:type="gramStart"/>
             <w:r>
               <w:rPr>
                 <w:rFonts w:ascii="Arial" w:eastAsia="Times New Roman" w:hAnsi="Arial" w:cs="Arial"/>
                 <w:kern w:val="0"/>
                 <w14:ligatures w14:val="none"/>
               </w:rPr>
-              <w:t>Decimal(</w:t>
-            </w:r>
-            <w:proofErr w:type="gramEnd"/>
-            <w:r>
-              <w:rPr>
-                <w:rFonts w:ascii="Arial" w:eastAsia="Times New Roman" w:hAnsi="Arial" w:cs="Arial"/>
-                <w:kern w:val="0"/>
-                <w14:ligatures w14:val="none"/>
-              </w:rPr>
-              <w:t>18,2)</w:t>
+              <w:t>Decimal(18,2)</w:t>
             </w:r>
           </w:p>
         </w:tc>
@@ -4149,36 +3377,8 @@
                 <w:kern w:val="0"/>
                 <w14:ligatures w14:val="none"/>
               </w:rPr>
-              <w:t xml:space="preserve">Difference between </w:t>
+              <w:t>Difference between shipped_date and order_date</w:t>
             </w:r>
-            <w:proofErr w:type="spellStart"/>
-            <w:r>
-              <w:rPr>
-                <w:rFonts w:ascii="Arial" w:eastAsia="Times New Roman" w:hAnsi="Arial" w:cs="Arial"/>
-                <w:kern w:val="0"/>
-                <w14:ligatures w14:val="none"/>
-              </w:rPr>
-              <w:t>shipped_date</w:t>
-            </w:r>
-            <w:proofErr w:type="spellEnd"/>
-            <w:r>
-              <w:rPr>
-                <w:rFonts w:ascii="Arial" w:eastAsia="Times New Roman" w:hAnsi="Arial" w:cs="Arial"/>
-                <w:kern w:val="0"/>
-                <w14:ligatures w14:val="none"/>
-              </w:rPr>
-              <w:t xml:space="preserve"> and </w:t>
-            </w:r>
-            <w:proofErr w:type="spellStart"/>
-            <w:r>
-              <w:rPr>
-                <w:rFonts w:ascii="Arial" w:eastAsia="Times New Roman" w:hAnsi="Arial" w:cs="Arial"/>
-                <w:kern w:val="0"/>
-                <w14:ligatures w14:val="none"/>
-              </w:rPr>
-              <w:t>order_date</w:t>
-            </w:r>
-            <w:proofErr w:type="spellEnd"/>
           </w:p>
         </w:tc>
       </w:tr>
@@ -4224,7 +3424,6 @@
                 <w14:ligatures w14:val="none"/>
               </w:rPr>
             </w:pPr>
-            <w:proofErr w:type="spellStart"/>
             <w:r>
               <w:rPr>
                 <w:rFonts w:ascii="Arial" w:eastAsia="Times New Roman" w:hAnsi="Arial" w:cs="Arial"/>
@@ -4235,7 +3434,6 @@
               </w:rPr>
               <w:t>ScheduledDays</w:t>
             </w:r>
-            <w:proofErr w:type="spellEnd"/>
           </w:p>
         </w:tc>
         <w:tc>
@@ -4294,34 +3492,14 @@
                 <w14:ligatures w14:val="none"/>
               </w:rPr>
             </w:pPr>
-            <w:proofErr w:type="spellStart"/>
             <w:r>
               <w:rPr>
                 <w:rFonts w:ascii="Arial" w:eastAsia="Times New Roman" w:hAnsi="Arial" w:cs="Arial"/>
                 <w:kern w:val="0"/>
                 <w14:ligatures w14:val="none"/>
               </w:rPr>
-              <w:t>Orderdate</w:t>
+              <w:t>Orderdate – requireddate</w:t>
             </w:r>
-            <w:proofErr w:type="spellEnd"/>
-            <w:r>
-              <w:rPr>
-                <w:rFonts w:ascii="Arial" w:eastAsia="Times New Roman" w:hAnsi="Arial" w:cs="Arial"/>
-                <w:kern w:val="0"/>
-                <w14:ligatures w14:val="none"/>
-              </w:rPr>
-              <w:t xml:space="preserve"> – </w:t>
-            </w:r>
-            <w:proofErr w:type="spellStart"/>
-            <w:r>
-              <w:rPr>
-                <w:rFonts w:ascii="Arial" w:eastAsia="Times New Roman" w:hAnsi="Arial" w:cs="Arial"/>
-                <w:kern w:val="0"/>
-                <w14:ligatures w14:val="none"/>
-              </w:rPr>
-              <w:t>requireddate</w:t>
-            </w:r>
-            <w:proofErr w:type="spellEnd"/>
           </w:p>
         </w:tc>
       </w:tr>
@@ -4364,7 +3542,6 @@
                 <w14:ligatures w14:val="none"/>
               </w:rPr>
             </w:pPr>
-            <w:proofErr w:type="spellStart"/>
             <w:r>
               <w:rPr>
                 <w:rFonts w:ascii="Arial" w:eastAsia="Times New Roman" w:hAnsi="Arial" w:cs="Arial"/>
@@ -4375,7 +3552,6 @@
               </w:rPr>
               <w:t>LateRiskFlag</w:t>
             </w:r>
-            <w:proofErr w:type="spellEnd"/>
           </w:p>
         </w:tc>
         <w:tc>
@@ -4440,36 +3616,8 @@
                 <w:kern w:val="0"/>
                 <w14:ligatures w14:val="none"/>
               </w:rPr>
-              <w:t xml:space="preserve">If </w:t>
+              <w:t>If shippeddate&gt;requireddate</w:t>
             </w:r>
-            <w:proofErr w:type="spellStart"/>
-            <w:r>
-              <w:rPr>
-                <w:rFonts w:ascii="Arial" w:eastAsia="Times New Roman" w:hAnsi="Arial" w:cs="Arial"/>
-                <w:kern w:val="0"/>
-                <w14:ligatures w14:val="none"/>
-              </w:rPr>
-              <w:t>shippeddate</w:t>
-            </w:r>
-            <w:proofErr w:type="spellEnd"/>
-            <w:r>
-              <w:rPr>
-                <w:rFonts w:ascii="Arial" w:eastAsia="Times New Roman" w:hAnsi="Arial" w:cs="Arial"/>
-                <w:kern w:val="0"/>
-                <w14:ligatures w14:val="none"/>
-              </w:rPr>
-              <w:t>&gt;</w:t>
-            </w:r>
-            <w:proofErr w:type="spellStart"/>
-            <w:r>
-              <w:rPr>
-                <w:rFonts w:ascii="Arial" w:eastAsia="Times New Roman" w:hAnsi="Arial" w:cs="Arial"/>
-                <w:kern w:val="0"/>
-                <w14:ligatures w14:val="none"/>
-              </w:rPr>
-              <w:t>requireddate</w:t>
-            </w:r>
-            <w:proofErr w:type="spellEnd"/>
           </w:p>
         </w:tc>
       </w:tr>
@@ -4543,23 +3691,13 @@
                 <w14:ligatures w14:val="none"/>
               </w:rPr>
             </w:pPr>
-            <w:proofErr w:type="gramStart"/>
             <w:r>
               <w:rPr>
                 <w:rFonts w:ascii="Arial" w:eastAsia="Times New Roman" w:hAnsi="Arial" w:cs="Arial"/>
                 <w:kern w:val="0"/>
                 <w14:ligatures w14:val="none"/>
               </w:rPr>
-              <w:t>Decimal(</w:t>
-            </w:r>
-            <w:proofErr w:type="gramEnd"/>
-            <w:r>
-              <w:rPr>
-                <w:rFonts w:ascii="Arial" w:eastAsia="Times New Roman" w:hAnsi="Arial" w:cs="Arial"/>
-                <w:kern w:val="0"/>
-                <w14:ligatures w14:val="none"/>
-              </w:rPr>
-              <w:t>18,2)</w:t>
+              <w:t>Decimal(18,2)</w:t>
             </w:r>
           </w:p>
         </w:tc>
@@ -4681,18 +3819,8 @@
                 <w:kern w:val="0"/>
                 <w14:ligatures w14:val="none"/>
               </w:rPr>
-              <w:t xml:space="preserve">It counts the number of unique items within a single </w:t>
+              <w:t>It counts the number of unique items within a single order_id</w:t>
             </w:r>
-            <w:proofErr w:type="spellStart"/>
-            <w:r>
-              <w:rPr>
-                <w:rFonts w:ascii="Arial" w:eastAsia="Times New Roman" w:hAnsi="Arial" w:cs="Arial"/>
-                <w:kern w:val="0"/>
-                <w14:ligatures w14:val="none"/>
-              </w:rPr>
-              <w:t>order_id</w:t>
-            </w:r>
-            <w:proofErr w:type="spellEnd"/>
           </w:p>
         </w:tc>
       </w:tr>
@@ -4899,7 +4027,6 @@
           <w:bCs/>
         </w:rPr>
       </w:pPr>
-      <w:proofErr w:type="spellStart"/>
       <w:r>
         <w:rPr>
           <w:b/>
@@ -4907,7 +4034,6 @@
         </w:rPr>
         <w:t>Bike_Store_STG</w:t>
       </w:r>
-      <w:proofErr w:type="spellEnd"/>
       <w:r>
         <w:rPr>
           <w:b/>
@@ -5076,7 +4202,6 @@
           <w:bCs/>
         </w:rPr>
       </w:pPr>
-      <w:proofErr w:type="spellStart"/>
       <w:r>
         <w:rPr>
           <w:b/>
@@ -5096,15 +4221,7 @@
           <w:b/>
           <w:bCs/>
         </w:rPr>
-        <w:t>G</w:t>
-      </w:r>
-      <w:proofErr w:type="spellEnd"/>
-      <w:r>
-        <w:rPr>
-          <w:b/>
-          <w:bCs/>
-        </w:rPr>
-        <w:t>:</w:t>
+        <w:t>G:</w:t>
       </w:r>
     </w:p>
     <w:p>
@@ -5130,7 +4247,7 @@
         <w:t>:</w:t>
       </w:r>
       <w:r>
-        <w:t xml:space="preserve"> is </w:t>
+        <w:t xml:space="preserve"> </w:t>
       </w:r>
       <w:r>
         <w:t>Data</w:t>
@@ -5260,15 +4377,7 @@
         <w:t xml:space="preserve">them </w:t>
       </w:r>
       <w:r>
-        <w:t xml:space="preserve">in the </w:t>
-      </w:r>
-      <w:proofErr w:type="spellStart"/>
-      <w:r>
-        <w:t>BikeStore_STG</w:t>
-      </w:r>
-      <w:proofErr w:type="spellEnd"/>
-      <w:r>
-        <w:t xml:space="preserve"> database</w:t>
+        <w:t>in the BikeStore_STG database</w:t>
       </w:r>
     </w:p>
     <w:p>
@@ -5289,7 +4398,6 @@
           <w:bCs/>
         </w:rPr>
       </w:pPr>
-      <w:proofErr w:type="spellStart"/>
       <w:r>
         <w:rPr>
           <w:b/>
@@ -5303,15 +4411,7 @@
           <w:b/>
           <w:bCs/>
         </w:rPr>
-        <w:t>x</w:t>
-      </w:r>
-      <w:proofErr w:type="spellEnd"/>
-      <w:r>
-        <w:rPr>
-          <w:b/>
-          <w:bCs/>
-        </w:rPr>
-        <w:t>:</w:t>
+        <w:t>x:</w:t>
       </w:r>
     </w:p>
     <w:p>
@@ -5355,13 +4455,8 @@
         </w:rPr>
         <w:t xml:space="preserve">Title: </w:t>
       </w:r>
-      <w:proofErr w:type="spellStart"/>
-      <w:r>
-        <w:t>Dim_Date</w:t>
-      </w:r>
-      <w:proofErr w:type="spellEnd"/>
-      <w:r>
-        <w:t xml:space="preserve"> — Execute SQL Task to Populate Date Dimension</w:t>
+      <w:r>
+        <w:t>Dim_Date — Execute SQL Task to Populate Date Dimension</w:t>
       </w:r>
     </w:p>
     <w:p>
@@ -5511,87 +4606,7 @@
           <w:rFonts w:eastAsia="Arial" w:cs="Arial"/>
           <w:color w:val="222222"/>
         </w:rPr>
-        <w:t xml:space="preserve">-12-31. Populates </w:t>
-      </w:r>
-      <w:proofErr w:type="spellStart"/>
-      <w:r>
-        <w:rPr>
-          <w:rFonts w:eastAsia="Arial" w:cs="Arial"/>
-          <w:color w:val="222222"/>
-        </w:rPr>
-        <w:t>DateKey</w:t>
-      </w:r>
-      <w:proofErr w:type="spellEnd"/>
-      <w:r>
-        <w:rPr>
-          <w:rFonts w:eastAsia="Arial" w:cs="Arial"/>
-          <w:color w:val="222222"/>
-        </w:rPr>
-        <w:t xml:space="preserve"> (int), </w:t>
-      </w:r>
-      <w:proofErr w:type="spellStart"/>
-      <w:r>
-        <w:rPr>
-          <w:rFonts w:eastAsia="Arial" w:cs="Arial"/>
-          <w:color w:val="222222"/>
-        </w:rPr>
-        <w:t>FullDate</w:t>
-      </w:r>
-      <w:proofErr w:type="spellEnd"/>
-      <w:r>
-        <w:rPr>
-          <w:rFonts w:eastAsia="Arial" w:cs="Arial"/>
-          <w:color w:val="222222"/>
-        </w:rPr>
-        <w:t xml:space="preserve">, Year, Quarter, Month, </w:t>
-      </w:r>
-      <w:proofErr w:type="spellStart"/>
-      <w:r>
-        <w:rPr>
-          <w:rFonts w:eastAsia="Arial" w:cs="Arial"/>
-          <w:color w:val="222222"/>
-        </w:rPr>
-        <w:t>MonthName</w:t>
-      </w:r>
-      <w:proofErr w:type="spellEnd"/>
-      <w:r>
-        <w:rPr>
-          <w:rFonts w:eastAsia="Arial" w:cs="Arial"/>
-          <w:color w:val="222222"/>
-        </w:rPr>
-        <w:t xml:space="preserve">, Day, </w:t>
-      </w:r>
-      <w:proofErr w:type="spellStart"/>
-      <w:r>
-        <w:rPr>
-          <w:rFonts w:eastAsia="Arial" w:cs="Arial"/>
-          <w:color w:val="222222"/>
-        </w:rPr>
-        <w:t>DayOfWeekName</w:t>
-      </w:r>
-      <w:proofErr w:type="spellEnd"/>
-      <w:r>
-        <w:rPr>
-          <w:rFonts w:eastAsia="Arial" w:cs="Arial"/>
-          <w:color w:val="222222"/>
-        </w:rPr>
-        <w:t xml:space="preserve">, </w:t>
-      </w:r>
-      <w:proofErr w:type="spellStart"/>
-      <w:r>
-        <w:rPr>
-          <w:rFonts w:eastAsia="Arial" w:cs="Arial"/>
-          <w:color w:val="222222"/>
-        </w:rPr>
-        <w:t>IsWeekend</w:t>
-      </w:r>
-      <w:proofErr w:type="spellEnd"/>
-      <w:r>
-        <w:rPr>
-          <w:rFonts w:eastAsia="Arial" w:cs="Arial"/>
-          <w:color w:val="222222"/>
-        </w:rPr>
-        <w:t>. No SSIS Data Flow needed</w:t>
+        <w:t>-12-31. Populates DateKey (int), FullDate, Year, Quarter, Month, MonthName, Day, DayOfWeekName, IsWeekend. No SSIS Data Flow needed</w:t>
       </w:r>
       <w:r>
         <w:rPr>
@@ -5627,7 +4642,6 @@
           <w:bCs/>
         </w:rPr>
       </w:pPr>
-      <w:proofErr w:type="spellStart"/>
       <w:r>
         <w:rPr>
           <w:b/>
@@ -5635,7 +4649,6 @@
         </w:rPr>
         <w:t>Dim_Customer.dtsx</w:t>
       </w:r>
-      <w:proofErr w:type="spellEnd"/>
     </w:p>
     <w:p>
       <w:pPr>
@@ -5755,13 +4768,8 @@
         </w:rPr>
         <w:t xml:space="preserve">Title: </w:t>
       </w:r>
-      <w:proofErr w:type="spellStart"/>
-      <w:r>
-        <w:t>Dim_Customer</w:t>
-      </w:r>
-      <w:proofErr w:type="spellEnd"/>
-      <w:r>
-        <w:t xml:space="preserve"> — Control Flow Overview</w:t>
+      <w:r>
+        <w:t>Dim_Customer — Control Flow Overview</w:t>
       </w:r>
     </w:p>
     <w:p>
@@ -5782,7 +4790,6 @@
           <w:bCs/>
         </w:rPr>
       </w:pPr>
-      <w:proofErr w:type="spellStart"/>
       <w:r>
         <w:rPr>
           <w:b/>
@@ -5790,7 +4797,6 @@
         </w:rPr>
         <w:t>Dim_Customer.dtsx</w:t>
       </w:r>
-      <w:proofErr w:type="spellEnd"/>
       <w:r>
         <w:rPr>
           <w:b/>
@@ -5822,7 +4828,7 @@
         <w:t>:</w:t>
       </w:r>
       <w:r>
-        <w:t xml:space="preserve"> is Data Flow</w:t>
+        <w:t xml:space="preserve"> Data Flow</w:t>
       </w:r>
     </w:p>
     <w:p>
@@ -5845,13 +4851,8 @@
         </w:rPr>
         <w:t xml:space="preserve">Title: </w:t>
       </w:r>
-      <w:proofErr w:type="spellStart"/>
-      <w:r>
-        <w:t>Dim_Customer</w:t>
-      </w:r>
-      <w:proofErr w:type="spellEnd"/>
-      <w:r>
-        <w:t xml:space="preserve"> — SCD Type 1: Insert New Customers Only</w:t>
+      <w:r>
+        <w:t>Dim_Customer — SCD Type 1: Insert New Customers Only</w:t>
       </w:r>
     </w:p>
     <w:p>
@@ -5971,87 +4972,7 @@
           <w:rFonts w:eastAsia="Arial" w:cs="Arial"/>
           <w:color w:val="222222"/>
         </w:rPr>
-        <w:t xml:space="preserve"> </w:t>
-      </w:r>
-      <w:proofErr w:type="spellStart"/>
-      <w:r>
-        <w:rPr>
-          <w:rFonts w:eastAsia="Arial" w:cs="Arial"/>
-          <w:color w:val="222222"/>
-        </w:rPr>
-        <w:t>STG_customers</w:t>
-      </w:r>
-      <w:proofErr w:type="spellEnd"/>
-      <w:r>
-        <w:rPr>
-          <w:rFonts w:eastAsia="Arial" w:cs="Arial"/>
-          <w:color w:val="222222"/>
-        </w:rPr>
-        <w:t xml:space="preserve"> (</w:t>
-      </w:r>
-      <w:proofErr w:type="spellStart"/>
-      <w:r>
-        <w:rPr>
-          <w:rFonts w:eastAsia="Arial" w:cs="Arial"/>
-          <w:color w:val="222222"/>
-        </w:rPr>
-        <w:t>customer_id</w:t>
-      </w:r>
-      <w:proofErr w:type="spellEnd"/>
-      <w:r>
-        <w:rPr>
-          <w:rFonts w:eastAsia="Arial" w:cs="Arial"/>
-          <w:color w:val="222222"/>
-        </w:rPr>
-        <w:t xml:space="preserve">, </w:t>
-      </w:r>
-      <w:proofErr w:type="spellStart"/>
-      <w:r>
-        <w:rPr>
-          <w:rFonts w:eastAsia="Arial" w:cs="Arial"/>
-          <w:color w:val="222222"/>
-        </w:rPr>
-        <w:t>first_name</w:t>
-      </w:r>
-      <w:proofErr w:type="spellEnd"/>
-      <w:r>
-        <w:rPr>
-          <w:rFonts w:eastAsia="Arial" w:cs="Arial"/>
-          <w:color w:val="222222"/>
-        </w:rPr>
-        <w:t xml:space="preserve">, </w:t>
-      </w:r>
-      <w:proofErr w:type="spellStart"/>
-      <w:r>
-        <w:rPr>
-          <w:rFonts w:eastAsia="Arial" w:cs="Arial"/>
-          <w:color w:val="222222"/>
-        </w:rPr>
-        <w:t>last_name</w:t>
-      </w:r>
-      <w:proofErr w:type="spellEnd"/>
-      <w:r>
-        <w:rPr>
-          <w:rFonts w:eastAsia="Arial" w:cs="Arial"/>
-          <w:color w:val="222222"/>
-        </w:rPr>
-        <w:t xml:space="preserve">, email, phone). Lookup matches on </w:t>
-      </w:r>
-      <w:proofErr w:type="spellStart"/>
-      <w:r>
-        <w:rPr>
-          <w:rFonts w:eastAsia="Arial" w:cs="Arial"/>
-          <w:color w:val="222222"/>
-        </w:rPr>
-        <w:t>Customer_Source_ID</w:t>
-      </w:r>
-      <w:proofErr w:type="spellEnd"/>
-      <w:r>
-        <w:rPr>
-          <w:rFonts w:eastAsia="Arial" w:cs="Arial"/>
-          <w:color w:val="222222"/>
-        </w:rPr>
-        <w:t>. Only the No Match Output is routed</w:t>
+        <w:t xml:space="preserve"> STG_customers (customer_id, first_name, last_name, email, phone). Lookup matches on Customer_Source_ID. Only the No Match Output is routed</w:t>
       </w:r>
       <w:r>
         <w:rPr>
@@ -6118,7 +5039,6 @@
           <w:bCs/>
         </w:rPr>
       </w:pPr>
-      <w:proofErr w:type="spellStart"/>
       <w:r>
         <w:rPr>
           <w:b/>
@@ -6131,15 +5051,7 @@
           <w:b/>
           <w:bCs/>
         </w:rPr>
-        <w:t>x</w:t>
-      </w:r>
-      <w:proofErr w:type="spellEnd"/>
-      <w:r>
-        <w:rPr>
-          <w:b/>
-          <w:bCs/>
-        </w:rPr>
-        <w:t>:</w:t>
+        <w:t>x:</w:t>
       </w:r>
     </w:p>
     <w:p>
@@ -6274,13 +5186,8 @@
         </w:rPr>
         <w:t xml:space="preserve">Title: </w:t>
       </w:r>
-      <w:proofErr w:type="spellStart"/>
-      <w:r>
-        <w:t>Dim_Geography</w:t>
-      </w:r>
-      <w:proofErr w:type="spellEnd"/>
-      <w:r>
-        <w:t xml:space="preserve"> — Control Flow Overview</w:t>
+      <w:r>
+        <w:t>Dim_Geography — Control Flow Overview</w:t>
       </w:r>
     </w:p>
     <w:p>
@@ -6303,7 +5210,6 @@
           <w:bCs/>
         </w:rPr>
       </w:pPr>
-      <w:proofErr w:type="spellStart"/>
       <w:r>
         <w:rPr>
           <w:b/>
@@ -6312,7 +5218,6 @@
         <w:lastRenderedPageBreak/>
         <w:t>Dim_Geography.dtsx</w:t>
       </w:r>
-      <w:proofErr w:type="spellEnd"/>
       <w:r>
         <w:rPr>
           <w:rFonts w:eastAsia="Wingdings" w:cs="Wingdings"/>
@@ -6371,13 +5276,8 @@
         </w:rPr>
         <w:t xml:space="preserve">Title: </w:t>
       </w:r>
-      <w:proofErr w:type="spellStart"/>
-      <w:r>
-        <w:t>Dim_Geography</w:t>
-      </w:r>
-      <w:proofErr w:type="spellEnd"/>
-      <w:r>
-        <w:t xml:space="preserve"> — SCD Type 1: Insert New Stores Only</w:t>
+      <w:r>
+        <w:t>Dim_Geography — SCD Type 1: Insert New Stores Only</w:t>
       </w:r>
     </w:p>
     <w:p>
@@ -6509,131 +5409,35 @@
           <w:rFonts w:eastAsia="Arial" w:cs="Arial"/>
           <w:color w:val="222222"/>
         </w:rPr>
-        <w:t xml:space="preserve"> </w:t>
-      </w:r>
-      <w:proofErr w:type="spellStart"/>
+        <w:t xml:space="preserve"> STG_stores (store_id, store_name, city, state, zip_code). Lookup matches on Store_Source_ID. Only</w:t>
+      </w:r>
       <w:r>
         <w:rPr>
           <w:rFonts w:eastAsia="Arial" w:cs="Arial"/>
           <w:color w:val="222222"/>
         </w:rPr>
-        <w:t>STG_stores</w:t>
-      </w:r>
-      <w:proofErr w:type="spellEnd"/>
+        <w:t xml:space="preserve"> the</w:t>
+      </w:r>
       <w:r>
         <w:rPr>
           <w:rFonts w:eastAsia="Arial" w:cs="Arial"/>
           <w:color w:val="222222"/>
         </w:rPr>
-        <w:t xml:space="preserve"> (</w:t>
-      </w:r>
-      <w:proofErr w:type="spellStart"/>
+        <w:t xml:space="preserve"> No Match Output</w:t>
+      </w:r>
       <w:r>
         <w:rPr>
           <w:rFonts w:eastAsia="Arial" w:cs="Arial"/>
           <w:color w:val="222222"/>
         </w:rPr>
-        <w:t>store_id</w:t>
-      </w:r>
-      <w:proofErr w:type="spellEnd"/>
+        <w:t xml:space="preserve"> records are</w:t>
+      </w:r>
       <w:r>
         <w:rPr>
           <w:rFonts w:eastAsia="Arial" w:cs="Arial"/>
           <w:color w:val="222222"/>
         </w:rPr>
-        <w:t xml:space="preserve">, </w:t>
-      </w:r>
-      <w:proofErr w:type="spellStart"/>
-      <w:r>
-        <w:rPr>
-          <w:rFonts w:eastAsia="Arial" w:cs="Arial"/>
-          <w:color w:val="222222"/>
-        </w:rPr>
-        <w:t>store_name</w:t>
-      </w:r>
-      <w:proofErr w:type="spellEnd"/>
-      <w:r>
-        <w:rPr>
-          <w:rFonts w:eastAsia="Arial" w:cs="Arial"/>
-          <w:color w:val="222222"/>
-        </w:rPr>
-        <w:t xml:space="preserve">, city, state, </w:t>
-      </w:r>
-      <w:proofErr w:type="spellStart"/>
-      <w:r>
-        <w:rPr>
-          <w:rFonts w:eastAsia="Arial" w:cs="Arial"/>
-          <w:color w:val="222222"/>
-        </w:rPr>
-        <w:t>zip_code</w:t>
-      </w:r>
-      <w:proofErr w:type="spellEnd"/>
-      <w:r>
-        <w:rPr>
-          <w:rFonts w:eastAsia="Arial" w:cs="Arial"/>
-          <w:color w:val="222222"/>
-        </w:rPr>
-        <w:t xml:space="preserve">). Lookup matches on </w:t>
-      </w:r>
-      <w:proofErr w:type="spellStart"/>
-      <w:r>
-        <w:rPr>
-          <w:rFonts w:eastAsia="Arial" w:cs="Arial"/>
-          <w:color w:val="222222"/>
-        </w:rPr>
-        <w:t>Store_Source_ID</w:t>
-      </w:r>
-      <w:proofErr w:type="spellEnd"/>
-      <w:r>
-        <w:rPr>
-          <w:rFonts w:eastAsia="Arial" w:cs="Arial"/>
-          <w:color w:val="222222"/>
-        </w:rPr>
-        <w:t>. Only</w:t>
-      </w:r>
-      <w:r>
-        <w:rPr>
-          <w:rFonts w:eastAsia="Arial" w:cs="Arial"/>
-          <w:color w:val="222222"/>
-        </w:rPr>
-        <w:t xml:space="preserve"> the</w:t>
-      </w:r>
-      <w:r>
-        <w:rPr>
-          <w:rFonts w:eastAsia="Arial" w:cs="Arial"/>
-          <w:color w:val="222222"/>
-        </w:rPr>
-        <w:t xml:space="preserve"> No Match Output</w:t>
-      </w:r>
-      <w:r>
-        <w:rPr>
-          <w:rFonts w:eastAsia="Arial" w:cs="Arial"/>
-          <w:color w:val="222222"/>
-        </w:rPr>
-        <w:t xml:space="preserve"> records are</w:t>
-      </w:r>
-      <w:r>
-        <w:rPr>
-          <w:rFonts w:eastAsia="Arial" w:cs="Arial"/>
-          <w:color w:val="222222"/>
-        </w:rPr>
-        <w:t xml:space="preserve"> routed to destination. Store location data is static in the </w:t>
-      </w:r>
-      <w:proofErr w:type="spellStart"/>
-      <w:r>
-        <w:rPr>
-          <w:rFonts w:eastAsia="Arial" w:cs="Arial"/>
-          <w:color w:val="222222"/>
-        </w:rPr>
-        <w:t>BikeStore</w:t>
-      </w:r>
-      <w:proofErr w:type="spellEnd"/>
-      <w:r>
-        <w:rPr>
-          <w:rFonts w:eastAsia="Arial" w:cs="Arial"/>
-          <w:color w:val="222222"/>
-        </w:rPr>
-        <w:t xml:space="preserve"> dataset </w:t>
+        <w:t xml:space="preserve"> routed to destination. Store location data is static in the BikeStore dataset </w:t>
       </w:r>
       <w:r>
         <w:rPr>
@@ -6688,7 +5492,6 @@
           <w:bCs/>
         </w:rPr>
       </w:pPr>
-      <w:proofErr w:type="spellStart"/>
       <w:r>
         <w:rPr>
           <w:b/>
@@ -6696,7 +5499,6 @@
         </w:rPr>
         <w:t>Dim_Order_Status.dtsx</w:t>
       </w:r>
-      <w:proofErr w:type="spellEnd"/>
       <w:r>
         <w:rPr>
           <w:b/>
@@ -6725,7 +5527,10 @@
         <w:t>Flow Type</w:t>
       </w:r>
       <w:r>
-        <w:t xml:space="preserve"> is </w:t>
+        <w:t>:</w:t>
+      </w:r>
+      <w:r>
+        <w:t xml:space="preserve"> </w:t>
       </w:r>
       <w:r>
         <w:t>Control Flow</w:t>
@@ -6826,13 +5631,8 @@
         </w:rPr>
         <w:t xml:space="preserve">Title: </w:t>
       </w:r>
-      <w:proofErr w:type="spellStart"/>
-      <w:r>
-        <w:t>Dim_Order_Status</w:t>
-      </w:r>
-      <w:proofErr w:type="spellEnd"/>
-      <w:r>
-        <w:t xml:space="preserve"> — Control Flow Overview</w:t>
+      <w:r>
+        <w:t>Dim_Order_Status — Control Flow Overview</w:t>
       </w:r>
     </w:p>
     <w:p>
@@ -6864,7 +5664,6 @@
           <w:bCs/>
         </w:rPr>
       </w:pPr>
-      <w:proofErr w:type="spellStart"/>
       <w:r>
         <w:rPr>
           <w:b/>
@@ -6878,15 +5677,7 @@
           <w:b/>
           <w:bCs/>
         </w:rPr>
-        <w:t>x</w:t>
-      </w:r>
-      <w:proofErr w:type="spellEnd"/>
-      <w:r>
-        <w:rPr>
-          <w:b/>
-          <w:bCs/>
-        </w:rPr>
-        <w:t>:</w:t>
+        <w:t>x:</w:t>
       </w:r>
     </w:p>
     <w:p>
@@ -6930,13 +5721,8 @@
         </w:rPr>
         <w:t xml:space="preserve">Title: </w:t>
       </w:r>
-      <w:proofErr w:type="spellStart"/>
-      <w:r>
-        <w:t>Dim_Order_Status</w:t>
-      </w:r>
-      <w:proofErr w:type="spellEnd"/>
-      <w:r>
-        <w:t xml:space="preserve"> — Static Load with Derived Status Descriptions</w:t>
+      <w:r>
+        <w:t>Dim_Order_Status — Static Load with Derived Status Descriptions</w:t>
       </w:r>
     </w:p>
     <w:p>
@@ -7074,113 +5860,49 @@
           <w:rFonts w:eastAsia="Arial" w:cs="Arial"/>
           <w:color w:val="222222"/>
         </w:rPr>
-        <w:t xml:space="preserve"> </w:t>
-      </w:r>
-      <w:proofErr w:type="spellStart"/>
+        <w:t xml:space="preserve"> order_status values from STG_orders. Derived Column maps </w:t>
+      </w:r>
       <w:r>
         <w:rPr>
           <w:rFonts w:eastAsia="Arial" w:cs="Arial"/>
           <w:color w:val="222222"/>
         </w:rPr>
-        <w:t>order_status</w:t>
-      </w:r>
-      <w:proofErr w:type="spellEnd"/>
+        <w:t xml:space="preserve">the </w:t>
+      </w:r>
       <w:r>
         <w:rPr>
           <w:rFonts w:eastAsia="Arial" w:cs="Arial"/>
           <w:color w:val="222222"/>
         </w:rPr>
-        <w:t xml:space="preserve"> values from </w:t>
-      </w:r>
-      <w:proofErr w:type="spellStart"/>
+        <w:t>integer codes to text descriptions: 1→"Pending", 2→"Processing", 3→"Rejected", else→"Completed"</w:t>
+      </w:r>
       <w:r>
         <w:rPr>
           <w:rFonts w:eastAsia="Arial" w:cs="Arial"/>
           <w:color w:val="222222"/>
         </w:rPr>
-        <w:t>STG_orders</w:t>
-      </w:r>
-      <w:proofErr w:type="spellEnd"/>
+        <w:t xml:space="preserve"> and this</w:t>
+      </w:r>
       <w:r>
         <w:rPr>
           <w:rFonts w:eastAsia="Arial" w:cs="Arial"/>
           <w:color w:val="222222"/>
         </w:rPr>
-        <w:t xml:space="preserve">. Derived Column maps </w:t>
+        <w:t xml:space="preserve"> </w:t>
       </w:r>
       <w:r>
         <w:rPr>
           <w:rFonts w:eastAsia="Arial" w:cs="Arial"/>
           <w:color w:val="222222"/>
         </w:rPr>
-        <w:t xml:space="preserve">the </w:t>
+        <w:t>p</w:t>
       </w:r>
       <w:r>
         <w:rPr>
           <w:rFonts w:eastAsia="Arial" w:cs="Arial"/>
           <w:color w:val="222222"/>
         </w:rPr>
-        <w:t xml:space="preserve">integer codes to text descriptions: 1→"Pending", 2→"Processing", 3→"Rejected", </w:t>
-      </w:r>
-      <w:proofErr w:type="spellStart"/>
-      <w:r>
-        <w:rPr>
-          <w:rFonts w:eastAsia="Arial" w:cs="Arial"/>
-          <w:color w:val="222222"/>
-        </w:rPr>
-        <w:t>else→"Completed</w:t>
-      </w:r>
-      <w:proofErr w:type="spellEnd"/>
-      <w:r>
-        <w:rPr>
-          <w:rFonts w:eastAsia="Arial" w:cs="Arial"/>
-          <w:color w:val="222222"/>
-        </w:rPr>
-        <w:t>"</w:t>
-      </w:r>
-      <w:r>
-        <w:rPr>
-          <w:rFonts w:eastAsia="Arial" w:cs="Arial"/>
-          <w:color w:val="222222"/>
-        </w:rPr>
-        <w:t xml:space="preserve"> and this</w:t>
-      </w:r>
-      <w:r>
-        <w:rPr>
-          <w:rFonts w:eastAsia="Arial" w:cs="Arial"/>
-          <w:color w:val="222222"/>
-        </w:rPr>
-        <w:t xml:space="preserve"> </w:t>
-      </w:r>
-      <w:r>
-        <w:rPr>
-          <w:rFonts w:eastAsia="Arial" w:cs="Arial"/>
-          <w:color w:val="222222"/>
-        </w:rPr>
-        <w:t>p</w:t>
-      </w:r>
-      <w:r>
-        <w:rPr>
-          <w:rFonts w:eastAsia="Arial" w:cs="Arial"/>
-          <w:color w:val="222222"/>
-        </w:rPr>
-        <w:t xml:space="preserve">roduces </w:t>
-      </w:r>
-      <w:proofErr w:type="spellStart"/>
-      <w:r>
-        <w:rPr>
-          <w:rFonts w:eastAsia="Arial" w:cs="Arial"/>
-          <w:color w:val="222222"/>
-        </w:rPr>
-        <w:t>Status_Description</w:t>
-      </w:r>
-      <w:proofErr w:type="spellEnd"/>
-      <w:r>
-        <w:rPr>
-          <w:rFonts w:eastAsia="Arial" w:cs="Arial"/>
-          <w:color w:val="222222"/>
-        </w:rPr>
-        <w:t xml:space="preserve"> column. Static lookup table — no versioning needed.</w:t>
+        <w:t>roduces Status_Description column. Static lookup table — no versioning needed.</w:t>
       </w:r>
     </w:p>
     <w:p>
@@ -7195,7 +5917,6 @@
           <w:bCs/>
         </w:rPr>
       </w:pPr>
-      <w:proofErr w:type="spellStart"/>
       <w:r>
         <w:rPr>
           <w:b/>
@@ -7208,15 +5929,7 @@
           <w:b/>
           <w:bCs/>
         </w:rPr>
-        <w:t>x</w:t>
-      </w:r>
-      <w:proofErr w:type="spellEnd"/>
-      <w:r>
-        <w:rPr>
-          <w:b/>
-          <w:bCs/>
-        </w:rPr>
-        <w:t>:</w:t>
+        <w:t>x:</w:t>
       </w:r>
     </w:p>
     <w:p>
@@ -7333,13 +6046,8 @@
         </w:rPr>
         <w:t xml:space="preserve">Title: </w:t>
       </w:r>
-      <w:proofErr w:type="spellStart"/>
-      <w:r>
-        <w:t>Dim_Product</w:t>
-      </w:r>
-      <w:proofErr w:type="spellEnd"/>
-      <w:r>
-        <w:t xml:space="preserve"> — Control Flow Overview</w:t>
+      <w:r>
+        <w:t>Dim_Product — Control Flow Overview</w:t>
       </w:r>
     </w:p>
     <w:p>
@@ -7362,7 +6070,6 @@
           <w:bCs/>
         </w:rPr>
       </w:pPr>
-      <w:proofErr w:type="spellStart"/>
       <w:r>
         <w:rPr>
           <w:b/>
@@ -7371,7 +6078,6 @@
         <w:lastRenderedPageBreak/>
         <w:t>Dim_Product.dtsx</w:t>
       </w:r>
-      <w:proofErr w:type="spellEnd"/>
       <w:r>
         <w:rPr>
           <w:b/>
@@ -7432,13 +6138,8 @@
         </w:rPr>
         <w:t xml:space="preserve">Title: </w:t>
       </w:r>
-      <w:proofErr w:type="spellStart"/>
-      <w:r>
-        <w:t>Dim_Product</w:t>
-      </w:r>
-      <w:proofErr w:type="spellEnd"/>
-      <w:r>
-        <w:t xml:space="preserve"> — SCD Type 2: Full Version Tracking</w:t>
+      <w:r>
+        <w:t>Dim_Product — SCD Type 2: Full Version Tracking</w:t>
       </w:r>
     </w:p>
     <w:p>
@@ -7461,7 +6162,7 @@
           <w:noProof/>
         </w:rPr>
         <w:drawing>
-          <wp:anchor distT="0" distB="0" distL="114300" distR="114300" simplePos="0" relativeHeight="251675136" behindDoc="0" locked="0" layoutInCell="1" allowOverlap="1" wp14:anchorId="0BF863E1" wp14:editId="22AAA483">
+          <wp:anchor distT="0" distB="0" distL="114300" distR="114300" simplePos="0" relativeHeight="251675136" behindDoc="0" locked="0" layoutInCell="1" allowOverlap="1" wp14:anchorId="0BF863E1" wp14:editId="2C7B8D4A">
             <wp:simplePos x="0" y="0"/>
             <wp:positionH relativeFrom="margin">
               <wp:posOffset>228600</wp:posOffset>
@@ -7543,417 +6244,161 @@
           <w:rFonts w:eastAsia="Arial" w:cs="Arial"/>
           <w:color w:val="222222"/>
         </w:rPr>
-        <w:t xml:space="preserve"> </w:t>
-      </w:r>
-      <w:proofErr w:type="spellStart"/>
+        <w:t xml:space="preserve"> STG_products JOIN STG_categories JOIN STG_brands. Lookup matches on Product_Source_ID. </w:t>
+      </w:r>
       <w:r>
         <w:rPr>
           <w:rFonts w:eastAsia="Arial" w:cs="Arial"/>
           <w:color w:val="222222"/>
         </w:rPr>
-        <w:t>STG_products</w:t>
-      </w:r>
-      <w:proofErr w:type="spellEnd"/>
+        <w:t>If there is</w:t>
+      </w:r>
       <w:r>
         <w:rPr>
           <w:rFonts w:eastAsia="Arial" w:cs="Arial"/>
           <w:color w:val="222222"/>
         </w:rPr>
-        <w:t xml:space="preserve"> JOIN </w:t>
-      </w:r>
-      <w:proofErr w:type="spellStart"/>
+        <w:t xml:space="preserve"> </w:t>
+      </w:r>
       <w:r>
         <w:rPr>
           <w:rFonts w:eastAsia="Arial" w:cs="Arial"/>
           <w:color w:val="222222"/>
         </w:rPr>
-        <w:t>STG_categories</w:t>
-      </w:r>
-      <w:proofErr w:type="spellEnd"/>
+        <w:t>n</w:t>
+      </w:r>
       <w:r>
         <w:rPr>
           <w:rFonts w:eastAsia="Arial" w:cs="Arial"/>
           <w:color w:val="222222"/>
         </w:rPr>
-        <w:t xml:space="preserve"> JOIN </w:t>
-      </w:r>
-      <w:proofErr w:type="spellStart"/>
+        <w:t>o Match</w:t>
+      </w:r>
       <w:r>
         <w:rPr>
           <w:rFonts w:eastAsia="Arial" w:cs="Arial"/>
           <w:color w:val="222222"/>
         </w:rPr>
-        <w:t>STG_brands</w:t>
-      </w:r>
-      <w:proofErr w:type="spellEnd"/>
+        <w:t xml:space="preserve"> then </w:t>
+      </w:r>
       <w:r>
         <w:rPr>
           <w:rFonts w:eastAsia="Arial" w:cs="Arial"/>
           <w:color w:val="222222"/>
         </w:rPr>
-        <w:t xml:space="preserve">. Lookup matches on </w:t>
-      </w:r>
-      <w:proofErr w:type="spellStart"/>
+        <w:t xml:space="preserve">insert new row (new product). </w:t>
+      </w:r>
       <w:r>
         <w:rPr>
           <w:rFonts w:eastAsia="Arial" w:cs="Arial"/>
           <w:color w:val="222222"/>
         </w:rPr>
-        <w:t>Product_Source_ID</w:t>
-      </w:r>
-      <w:proofErr w:type="spellEnd"/>
+        <w:t>Else if there is a m</w:t>
+      </w:r>
       <w:r>
         <w:rPr>
           <w:rFonts w:eastAsia="Arial" w:cs="Arial"/>
           <w:color w:val="222222"/>
         </w:rPr>
-        <w:t xml:space="preserve">. </w:t>
+        <w:t xml:space="preserve">atch </w:t>
       </w:r>
       <w:r>
         <w:rPr>
           <w:rFonts w:eastAsia="Arial" w:cs="Arial"/>
           <w:color w:val="222222"/>
         </w:rPr>
-        <w:t>If there is</w:t>
+        <w:t>and something c</w:t>
       </w:r>
       <w:r>
         <w:rPr>
           <w:rFonts w:eastAsia="Arial" w:cs="Arial"/>
           <w:color w:val="222222"/>
         </w:rPr>
-        <w:t xml:space="preserve"> </w:t>
+        <w:t xml:space="preserve">hanged (product_name OR category_name OR brand_name OR model_year) </w:t>
       </w:r>
       <w:r>
         <w:rPr>
           <w:rFonts w:eastAsia="Arial" w:cs="Arial"/>
           <w:color w:val="222222"/>
         </w:rPr>
-        <w:t>n</w:t>
+        <w:t xml:space="preserve">then the </w:t>
       </w:r>
       <w:r>
         <w:rPr>
           <w:rFonts w:eastAsia="Arial" w:cs="Arial"/>
           <w:color w:val="222222"/>
         </w:rPr>
-        <w:t>o Match</w:t>
+        <w:t xml:space="preserve">OLE DB Command runs UPDATE to expire old row (EndDate=GETDATE(), IsCurrent=0), then new row inserted with IsCurrent=1. </w:t>
       </w:r>
       <w:r>
         <w:rPr>
           <w:rFonts w:eastAsia="Arial" w:cs="Arial"/>
           <w:color w:val="222222"/>
         </w:rPr>
-        <w:t xml:space="preserve"> then </w:t>
+        <w:t>Else if there is a m</w:t>
       </w:r>
       <w:r>
         <w:rPr>
           <w:rFonts w:eastAsia="Arial" w:cs="Arial"/>
           <w:color w:val="222222"/>
         </w:rPr>
-        <w:t xml:space="preserve">insert new row (new product). </w:t>
+        <w:t>atch</w:t>
       </w:r>
       <w:r>
         <w:rPr>
           <w:rFonts w:eastAsia="Arial" w:cs="Arial"/>
           <w:color w:val="222222"/>
         </w:rPr>
-        <w:t>Else if there is a m</w:t>
+        <w:t xml:space="preserve"> and</w:t>
       </w:r>
       <w:r>
         <w:rPr>
           <w:rFonts w:eastAsia="Arial" w:cs="Arial"/>
           <w:color w:val="222222"/>
         </w:rPr>
-        <w:t xml:space="preserve">atch </w:t>
+        <w:t xml:space="preserve"> </w:t>
       </w:r>
       <w:r>
         <w:rPr>
           <w:rFonts w:eastAsia="Arial" w:cs="Arial"/>
           <w:color w:val="222222"/>
         </w:rPr>
-        <w:t>and something c</w:t>
+        <w:t xml:space="preserve">no </w:t>
       </w:r>
       <w:r>
         <w:rPr>
           <w:rFonts w:eastAsia="Arial" w:cs="Arial"/>
           <w:color w:val="222222"/>
         </w:rPr>
-        <w:t>hanged (</w:t>
-      </w:r>
-      <w:proofErr w:type="spellStart"/>
+        <w:t>change</w:t>
+      </w:r>
       <w:r>
         <w:rPr>
           <w:rFonts w:eastAsia="Arial" w:cs="Arial"/>
           <w:color w:val="222222"/>
         </w:rPr>
-        <w:t>product_name</w:t>
-      </w:r>
-      <w:proofErr w:type="spellEnd"/>
+        <w:t xml:space="preserve"> then</w:t>
+      </w:r>
       <w:r>
         <w:rPr>
           <w:rFonts w:eastAsia="Arial" w:cs="Arial"/>
           <w:color w:val="222222"/>
         </w:rPr>
-        <w:t xml:space="preserve"> OR </w:t>
-      </w:r>
-      <w:proofErr w:type="spellStart"/>
+        <w:t xml:space="preserve"> </w:t>
+      </w:r>
       <w:r>
         <w:rPr>
           <w:rFonts w:eastAsia="Arial" w:cs="Arial"/>
           <w:color w:val="222222"/>
         </w:rPr>
-        <w:t>category_name</w:t>
-      </w:r>
-      <w:proofErr w:type="spellEnd"/>
+        <w:t>the row is discarded.</w:t>
+      </w:r>
       <w:r>
         <w:rPr>
           <w:rFonts w:eastAsia="Arial" w:cs="Arial"/>
           <w:color w:val="222222"/>
         </w:rPr>
-        <w:t xml:space="preserve"> OR </w:t>
-      </w:r>
-      <w:proofErr w:type="spellStart"/>
-      <w:r>
-        <w:rPr>
-          <w:rFonts w:eastAsia="Arial" w:cs="Arial"/>
-          <w:color w:val="222222"/>
-        </w:rPr>
-        <w:t>brand_name</w:t>
-      </w:r>
-      <w:proofErr w:type="spellEnd"/>
-      <w:r>
-        <w:rPr>
-          <w:rFonts w:eastAsia="Arial" w:cs="Arial"/>
-          <w:color w:val="222222"/>
-        </w:rPr>
-        <w:t xml:space="preserve"> OR </w:t>
-      </w:r>
-      <w:proofErr w:type="spellStart"/>
-      <w:r>
-        <w:rPr>
-          <w:rFonts w:eastAsia="Arial" w:cs="Arial"/>
-          <w:color w:val="222222"/>
-        </w:rPr>
-        <w:t>model_year</w:t>
-      </w:r>
-      <w:proofErr w:type="spellEnd"/>
-      <w:r>
-        <w:rPr>
-          <w:rFonts w:eastAsia="Arial" w:cs="Arial"/>
-          <w:color w:val="222222"/>
-        </w:rPr>
-        <w:t xml:space="preserve">) </w:t>
-      </w:r>
-      <w:r>
-        <w:rPr>
-          <w:rFonts w:eastAsia="Arial" w:cs="Arial"/>
-          <w:color w:val="222222"/>
-        </w:rPr>
-        <w:t xml:space="preserve">then the </w:t>
-      </w:r>
-      <w:r>
-        <w:rPr>
-          <w:rFonts w:eastAsia="Arial" w:cs="Arial"/>
-          <w:color w:val="222222"/>
-        </w:rPr>
-        <w:t>OLE DB Command runs UPDATE to expire old row (</w:t>
-      </w:r>
-      <w:proofErr w:type="spellStart"/>
-      <w:r>
-        <w:rPr>
-          <w:rFonts w:eastAsia="Arial" w:cs="Arial"/>
-          <w:color w:val="222222"/>
-        </w:rPr>
-        <w:t>EndDate</w:t>
-      </w:r>
-      <w:proofErr w:type="spellEnd"/>
-      <w:r>
-        <w:rPr>
-          <w:rFonts w:eastAsia="Arial" w:cs="Arial"/>
-          <w:color w:val="222222"/>
-        </w:rPr>
-        <w:t>=</w:t>
-      </w:r>
-      <w:proofErr w:type="gramStart"/>
-      <w:r>
-        <w:rPr>
-          <w:rFonts w:eastAsia="Arial" w:cs="Arial"/>
-          <w:color w:val="222222"/>
-        </w:rPr>
-        <w:t>GETDATE(</w:t>
-      </w:r>
-      <w:proofErr w:type="gramEnd"/>
-      <w:r>
-        <w:rPr>
-          <w:rFonts w:eastAsia="Arial" w:cs="Arial"/>
-          <w:color w:val="222222"/>
-        </w:rPr>
-        <w:t xml:space="preserve">), </w:t>
-      </w:r>
-      <w:proofErr w:type="spellStart"/>
-      <w:r>
-        <w:rPr>
-          <w:rFonts w:eastAsia="Arial" w:cs="Arial"/>
-          <w:color w:val="222222"/>
-        </w:rPr>
-        <w:t>IsCurrent</w:t>
-      </w:r>
-      <w:proofErr w:type="spellEnd"/>
-      <w:r>
-        <w:rPr>
-          <w:rFonts w:eastAsia="Arial" w:cs="Arial"/>
-          <w:color w:val="222222"/>
-        </w:rPr>
-        <w:t xml:space="preserve">=0), then new row inserted with </w:t>
-      </w:r>
-      <w:proofErr w:type="spellStart"/>
-      <w:r>
-        <w:rPr>
-          <w:rFonts w:eastAsia="Arial" w:cs="Arial"/>
-          <w:color w:val="222222"/>
-        </w:rPr>
-        <w:t>IsCurrent</w:t>
-      </w:r>
-      <w:proofErr w:type="spellEnd"/>
-      <w:r>
-        <w:rPr>
-          <w:rFonts w:eastAsia="Arial" w:cs="Arial"/>
-          <w:color w:val="222222"/>
-        </w:rPr>
-        <w:t xml:space="preserve">=1. </w:t>
-      </w:r>
-      <w:r>
-        <w:rPr>
-          <w:rFonts w:eastAsia="Arial" w:cs="Arial"/>
-          <w:color w:val="222222"/>
-        </w:rPr>
-        <w:t xml:space="preserve">Else if there </w:t>
-      </w:r>
-      <w:proofErr w:type="gramStart"/>
-      <w:r>
-        <w:rPr>
-          <w:rFonts w:eastAsia="Arial" w:cs="Arial"/>
-          <w:color w:val="222222"/>
-        </w:rPr>
-        <w:t>is</w:t>
-      </w:r>
-      <w:proofErr w:type="gramEnd"/>
-      <w:r>
-        <w:rPr>
-          <w:rFonts w:eastAsia="Arial" w:cs="Arial"/>
-          <w:color w:val="222222"/>
-        </w:rPr>
-        <w:t xml:space="preserve"> a m</w:t>
-      </w:r>
-      <w:r>
-        <w:rPr>
-          <w:rFonts w:eastAsia="Arial" w:cs="Arial"/>
-          <w:color w:val="222222"/>
-        </w:rPr>
-        <w:t>atch</w:t>
-      </w:r>
-      <w:r>
-        <w:rPr>
-          <w:rFonts w:eastAsia="Arial" w:cs="Arial"/>
-          <w:color w:val="222222"/>
-        </w:rPr>
-        <w:t xml:space="preserve"> and</w:t>
-      </w:r>
-      <w:r>
-        <w:rPr>
-          <w:rFonts w:eastAsia="Arial" w:cs="Arial"/>
-          <w:color w:val="222222"/>
-        </w:rPr>
-        <w:t xml:space="preserve"> </w:t>
-      </w:r>
-      <w:r>
-        <w:rPr>
-          <w:rFonts w:eastAsia="Arial" w:cs="Arial"/>
-          <w:color w:val="222222"/>
-        </w:rPr>
-        <w:t xml:space="preserve">no </w:t>
-      </w:r>
-      <w:r>
-        <w:rPr>
-          <w:rFonts w:eastAsia="Arial" w:cs="Arial"/>
-          <w:color w:val="222222"/>
-        </w:rPr>
-        <w:t>change</w:t>
-      </w:r>
-      <w:r>
-        <w:rPr>
-          <w:rFonts w:eastAsia="Arial" w:cs="Arial"/>
-          <w:color w:val="222222"/>
-        </w:rPr>
-        <w:t xml:space="preserve"> then</w:t>
-      </w:r>
-      <w:r>
-        <w:rPr>
-          <w:rFonts w:eastAsia="Arial" w:cs="Arial"/>
-          <w:color w:val="222222"/>
-        </w:rPr>
-        <w:t xml:space="preserve"> </w:t>
-      </w:r>
-      <w:r>
-        <w:rPr>
-          <w:rFonts w:eastAsia="Arial" w:cs="Arial"/>
-          <w:color w:val="222222"/>
-        </w:rPr>
-        <w:t>the row is discarded.</w:t>
-      </w:r>
-      <w:r>
-        <w:rPr>
-          <w:rFonts w:eastAsia="Arial" w:cs="Arial"/>
-          <w:color w:val="222222"/>
-        </w:rPr>
-        <w:t xml:space="preserve"> DDL includes StartDate, </w:t>
-      </w:r>
-      <w:proofErr w:type="spellStart"/>
-      <w:r>
-        <w:rPr>
-          <w:rFonts w:eastAsia="Arial" w:cs="Arial"/>
-          <w:color w:val="222222"/>
-        </w:rPr>
-        <w:t>EndDate</w:t>
-      </w:r>
-      <w:proofErr w:type="spellEnd"/>
-      <w:r>
-        <w:rPr>
-          <w:rFonts w:eastAsia="Arial" w:cs="Arial"/>
-          <w:color w:val="222222"/>
-        </w:rPr>
-        <w:t xml:space="preserve">, </w:t>
-      </w:r>
-      <w:proofErr w:type="spellStart"/>
-      <w:r>
-        <w:rPr>
-          <w:rFonts w:eastAsia="Arial" w:cs="Arial"/>
-          <w:color w:val="222222"/>
-        </w:rPr>
-        <w:t>IsCurrent</w:t>
-      </w:r>
-      <w:proofErr w:type="spellEnd"/>
-      <w:r>
-        <w:rPr>
-          <w:rFonts w:eastAsia="Arial" w:cs="Arial"/>
-          <w:color w:val="222222"/>
-        </w:rPr>
-        <w:t xml:space="preserve"> columns on </w:t>
-      </w:r>
-      <w:proofErr w:type="spellStart"/>
-      <w:r>
-        <w:rPr>
-          <w:rFonts w:eastAsia="Arial" w:cs="Arial"/>
-          <w:color w:val="222222"/>
-        </w:rPr>
-        <w:t>Dim_Product</w:t>
-      </w:r>
-      <w:proofErr w:type="spellEnd"/>
-      <w:r>
-        <w:rPr>
-          <w:rFonts w:eastAsia="Arial" w:cs="Arial"/>
-          <w:color w:val="222222"/>
-        </w:rPr>
-        <w:t>.</w:t>
+        <w:t xml:space="preserve"> DDL includes StartDate, EndDate, IsCurrent columns on Dim_Product.</w:t>
       </w:r>
     </w:p>
     <w:p>
@@ -7976,7 +6421,6 @@
           <w:bCs/>
         </w:rPr>
       </w:pPr>
-      <w:proofErr w:type="spellStart"/>
       <w:r>
         <w:rPr>
           <w:b/>
@@ -7984,7 +6428,6 @@
         </w:rPr>
         <w:t>Dim_Staff.dtsx</w:t>
       </w:r>
-      <w:proofErr w:type="spellEnd"/>
       <w:r>
         <w:rPr>
           <w:b/>
@@ -8120,13 +6563,8 @@
         </w:rPr>
         <w:t xml:space="preserve">Title: </w:t>
       </w:r>
-      <w:proofErr w:type="spellStart"/>
-      <w:r>
-        <w:t>Dim_Staff</w:t>
-      </w:r>
-      <w:proofErr w:type="spellEnd"/>
-      <w:r>
-        <w:t xml:space="preserve"> — Control Flow Overview</w:t>
+      <w:r>
+        <w:t>Dim_Staff — Control Flow Overview</w:t>
       </w:r>
     </w:p>
     <w:p>
@@ -8146,7 +6584,6 @@
           <w:bCs/>
         </w:rPr>
       </w:pPr>
-      <w:proofErr w:type="spellStart"/>
       <w:r>
         <w:rPr>
           <w:b/>
@@ -8159,15 +6596,7 @@
           <w:b/>
           <w:bCs/>
         </w:rPr>
-        <w:t>x</w:t>
-      </w:r>
-      <w:proofErr w:type="spellEnd"/>
-      <w:r>
-        <w:rPr>
-          <w:b/>
-          <w:bCs/>
-        </w:rPr>
-        <w:t>:</w:t>
+        <w:t>x:</w:t>
       </w:r>
     </w:p>
     <w:p>
@@ -8215,13 +6644,8 @@
         </w:rPr>
         <w:t xml:space="preserve">Title: </w:t>
       </w:r>
-      <w:proofErr w:type="spellStart"/>
-      <w:r>
-        <w:t>Dim_Staff</w:t>
-      </w:r>
-      <w:proofErr w:type="spellEnd"/>
-      <w:r>
-        <w:t xml:space="preserve"> — SCD Type 2: Full Version Tracking with ISNULL Handling</w:t>
+      <w:r>
+        <w:t>Dim_Staff — SCD Type 2: Full Version Tracking with ISNULL Handling</w:t>
       </w:r>
     </w:p>
     <w:p>
@@ -8326,367 +6750,175 @@
           <w:rFonts w:eastAsia="Arial" w:cs="Arial"/>
           <w:color w:val="222222"/>
         </w:rPr>
-        <w:t xml:space="preserve"> </w:t>
-      </w:r>
-      <w:proofErr w:type="spellStart"/>
+        <w:t xml:space="preserve"> STG_staffs with ISNULL handling (first_name+last_name → Staff_Name, email → Staff_Email, active → Active_Status). Lookup matches on Staff_Source_ID. </w:t>
+      </w:r>
       <w:r>
         <w:rPr>
           <w:rFonts w:eastAsia="Arial" w:cs="Arial"/>
           <w:color w:val="222222"/>
         </w:rPr>
-        <w:t>STG_staffs</w:t>
-      </w:r>
-      <w:proofErr w:type="spellEnd"/>
+        <w:t>If there is no m</w:t>
+      </w:r>
       <w:r>
         <w:rPr>
           <w:rFonts w:eastAsia="Arial" w:cs="Arial"/>
           <w:color w:val="222222"/>
         </w:rPr>
-        <w:t xml:space="preserve"> with ISNULL handling (</w:t>
-      </w:r>
-      <w:proofErr w:type="spellStart"/>
+        <w:t xml:space="preserve">atch </w:t>
+      </w:r>
       <w:r>
         <w:rPr>
           <w:rFonts w:eastAsia="Arial" w:cs="Arial"/>
           <w:color w:val="222222"/>
         </w:rPr>
-        <w:t>first_name+last_name</w:t>
-      </w:r>
-      <w:proofErr w:type="spellEnd"/>
+        <w:t xml:space="preserve">then </w:t>
+      </w:r>
       <w:r>
         <w:rPr>
           <w:rFonts w:eastAsia="Arial" w:cs="Arial"/>
           <w:color w:val="222222"/>
         </w:rPr>
-        <w:t xml:space="preserve"> → </w:t>
-      </w:r>
-      <w:proofErr w:type="spellStart"/>
+        <w:t xml:space="preserve">insert new row. </w:t>
+      </w:r>
       <w:r>
         <w:rPr>
           <w:rFonts w:eastAsia="Arial" w:cs="Arial"/>
           <w:color w:val="222222"/>
         </w:rPr>
-        <w:t>Staff_Name</w:t>
-      </w:r>
-      <w:proofErr w:type="spellEnd"/>
+        <w:t>Else if there is a m</w:t>
+      </w:r>
       <w:r>
         <w:rPr>
           <w:rFonts w:eastAsia="Arial" w:cs="Arial"/>
           <w:color w:val="222222"/>
         </w:rPr>
-        <w:t xml:space="preserve">, email → </w:t>
-      </w:r>
-      <w:proofErr w:type="spellStart"/>
+        <w:t xml:space="preserve">atch </w:t>
+      </w:r>
       <w:r>
         <w:rPr>
           <w:rFonts w:eastAsia="Arial" w:cs="Arial"/>
           <w:color w:val="222222"/>
         </w:rPr>
-        <w:t>Staff_Email</w:t>
-      </w:r>
-      <w:proofErr w:type="spellEnd"/>
+        <w:t>and has been c</w:t>
+      </w:r>
       <w:r>
         <w:rPr>
           <w:rFonts w:eastAsia="Arial" w:cs="Arial"/>
           <w:color w:val="222222"/>
         </w:rPr>
-        <w:t xml:space="preserve">, active → </w:t>
-      </w:r>
-      <w:proofErr w:type="spellStart"/>
+        <w:t>hanged (Staff_Name OR Staff_Email OR Active_Status)</w:t>
+      </w:r>
       <w:r>
         <w:rPr>
           <w:rFonts w:eastAsia="Arial" w:cs="Arial"/>
           <w:color w:val="222222"/>
         </w:rPr>
-        <w:t>Active_Status</w:t>
-      </w:r>
-      <w:proofErr w:type="spellEnd"/>
+        <w:t xml:space="preserve">, then </w:t>
+      </w:r>
       <w:r>
         <w:rPr>
           <w:rFonts w:eastAsia="Arial" w:cs="Arial"/>
           <w:color w:val="222222"/>
         </w:rPr>
-        <w:t xml:space="preserve">). Lookup matches on </w:t>
-      </w:r>
-      <w:proofErr w:type="spellStart"/>
+        <w:t xml:space="preserve">expire old row </w:t>
+      </w:r>
       <w:r>
         <w:rPr>
           <w:rFonts w:eastAsia="Arial" w:cs="Arial"/>
           <w:color w:val="222222"/>
         </w:rPr>
-        <w:t>Staff_Source_ID</w:t>
-      </w:r>
-      <w:proofErr w:type="spellEnd"/>
+        <w:t>and</w:t>
+      </w:r>
       <w:r>
         <w:rPr>
           <w:rFonts w:eastAsia="Arial" w:cs="Arial"/>
           <w:color w:val="222222"/>
         </w:rPr>
-        <w:t xml:space="preserve">. </w:t>
+        <w:t xml:space="preserve"> insert </w:t>
       </w:r>
       <w:r>
         <w:rPr>
           <w:rFonts w:eastAsia="Arial" w:cs="Arial"/>
           <w:color w:val="222222"/>
         </w:rPr>
-        <w:t>If there is no m</w:t>
+        <w:t xml:space="preserve">the </w:t>
       </w:r>
       <w:r>
         <w:rPr>
           <w:rFonts w:eastAsia="Arial" w:cs="Arial"/>
           <w:color w:val="222222"/>
         </w:rPr>
-        <w:t xml:space="preserve">atch </w:t>
+        <w:t>new</w:t>
       </w:r>
       <w:r>
         <w:rPr>
           <w:rFonts w:eastAsia="Arial" w:cs="Arial"/>
           <w:color w:val="222222"/>
         </w:rPr>
-        <w:t xml:space="preserve">then </w:t>
+        <w:t xml:space="preserve"> one</w:t>
       </w:r>
       <w:r>
         <w:rPr>
           <w:rFonts w:eastAsia="Arial" w:cs="Arial"/>
           <w:color w:val="222222"/>
         </w:rPr>
-        <w:t xml:space="preserve">insert new row. </w:t>
+        <w:t>.</w:t>
       </w:r>
       <w:r>
         <w:rPr>
           <w:rFonts w:eastAsia="Arial" w:cs="Arial"/>
           <w:color w:val="222222"/>
         </w:rPr>
-        <w:t>Else if there is a m</w:t>
+        <w:t xml:space="preserve"> Else</w:t>
       </w:r>
       <w:r>
         <w:rPr>
           <w:rFonts w:eastAsia="Arial" w:cs="Arial"/>
           <w:color w:val="222222"/>
         </w:rPr>
-        <w:t xml:space="preserve">atch </w:t>
+        <w:t xml:space="preserve"> </w:t>
       </w:r>
       <w:r>
         <w:rPr>
           <w:rFonts w:eastAsia="Arial" w:cs="Arial"/>
           <w:color w:val="222222"/>
         </w:rPr>
-        <w:t>and has been c</w:t>
+        <w:t>if there was a m</w:t>
       </w:r>
       <w:r>
         <w:rPr>
           <w:rFonts w:eastAsia="Arial" w:cs="Arial"/>
           <w:color w:val="222222"/>
         </w:rPr>
-        <w:t>hanged (</w:t>
-      </w:r>
-      <w:proofErr w:type="spellStart"/>
+        <w:t xml:space="preserve">atch </w:t>
+      </w:r>
       <w:r>
         <w:rPr>
           <w:rFonts w:eastAsia="Arial" w:cs="Arial"/>
           <w:color w:val="222222"/>
         </w:rPr>
-        <w:t>Staff_Name</w:t>
-      </w:r>
-      <w:proofErr w:type="spellEnd"/>
+        <w:t xml:space="preserve">and wasn’t </w:t>
+      </w:r>
       <w:r>
         <w:rPr>
           <w:rFonts w:eastAsia="Arial" w:cs="Arial"/>
           <w:color w:val="222222"/>
         </w:rPr>
-        <w:t xml:space="preserve"> OR </w:t>
-      </w:r>
-      <w:proofErr w:type="spellStart"/>
+        <w:t xml:space="preserve">changed </w:t>
+      </w:r>
       <w:r>
         <w:rPr>
           <w:rFonts w:eastAsia="Arial" w:cs="Arial"/>
           <w:color w:val="222222"/>
         </w:rPr>
-        <w:t>Staff_Email</w:t>
-      </w:r>
-      <w:proofErr w:type="spellEnd"/>
+        <w:t>then discard the row</w:t>
+      </w:r>
       <w:r>
         <w:rPr>
           <w:rFonts w:eastAsia="Arial" w:cs="Arial"/>
           <w:color w:val="222222"/>
         </w:rPr>
-        <w:t xml:space="preserve"> OR </w:t>
-      </w:r>
-      <w:proofErr w:type="spellStart"/>
-      <w:r>
-        <w:rPr>
-          <w:rFonts w:eastAsia="Arial" w:cs="Arial"/>
-          <w:color w:val="222222"/>
-        </w:rPr>
-        <w:t>Active_Status</w:t>
-      </w:r>
-      <w:proofErr w:type="spellEnd"/>
-      <w:r>
-        <w:rPr>
-          <w:rFonts w:eastAsia="Arial" w:cs="Arial"/>
-          <w:color w:val="222222"/>
-        </w:rPr>
-        <w:t>)</w:t>
-      </w:r>
-      <w:r>
-        <w:rPr>
-          <w:rFonts w:eastAsia="Arial" w:cs="Arial"/>
-          <w:color w:val="222222"/>
-        </w:rPr>
-        <w:t xml:space="preserve">, then </w:t>
-      </w:r>
-      <w:r>
-        <w:rPr>
-          <w:rFonts w:eastAsia="Arial" w:cs="Arial"/>
-          <w:color w:val="222222"/>
-        </w:rPr>
-        <w:t xml:space="preserve">expire old row </w:t>
-      </w:r>
-      <w:r>
-        <w:rPr>
-          <w:rFonts w:eastAsia="Arial" w:cs="Arial"/>
-          <w:color w:val="222222"/>
-        </w:rPr>
-        <w:t>and</w:t>
-      </w:r>
-      <w:r>
-        <w:rPr>
-          <w:rFonts w:eastAsia="Arial" w:cs="Arial"/>
-          <w:color w:val="222222"/>
-        </w:rPr>
-        <w:t xml:space="preserve"> insert </w:t>
-      </w:r>
-      <w:r>
-        <w:rPr>
-          <w:rFonts w:eastAsia="Arial" w:cs="Arial"/>
-          <w:color w:val="222222"/>
-        </w:rPr>
-        <w:t xml:space="preserve">the </w:t>
-      </w:r>
-      <w:r>
-        <w:rPr>
-          <w:rFonts w:eastAsia="Arial" w:cs="Arial"/>
-          <w:color w:val="222222"/>
-        </w:rPr>
-        <w:t>new</w:t>
-      </w:r>
-      <w:r>
-        <w:rPr>
-          <w:rFonts w:eastAsia="Arial" w:cs="Arial"/>
-          <w:color w:val="222222"/>
-        </w:rPr>
-        <w:t xml:space="preserve"> one</w:t>
-      </w:r>
-      <w:r>
-        <w:rPr>
-          <w:rFonts w:eastAsia="Arial" w:cs="Arial"/>
-          <w:color w:val="222222"/>
-        </w:rPr>
-        <w:t>.</w:t>
-      </w:r>
-      <w:r>
-        <w:rPr>
-          <w:rFonts w:eastAsia="Arial" w:cs="Arial"/>
-          <w:color w:val="222222"/>
-        </w:rPr>
-        <w:t xml:space="preserve"> Else</w:t>
-      </w:r>
-      <w:r>
-        <w:rPr>
-          <w:rFonts w:eastAsia="Arial" w:cs="Arial"/>
-          <w:color w:val="222222"/>
-        </w:rPr>
-        <w:t xml:space="preserve"> </w:t>
-      </w:r>
-      <w:r>
-        <w:rPr>
-          <w:rFonts w:eastAsia="Arial" w:cs="Arial"/>
-          <w:color w:val="222222"/>
-        </w:rPr>
-        <w:t>if there was a m</w:t>
-      </w:r>
-      <w:r>
-        <w:rPr>
-          <w:rFonts w:eastAsia="Arial" w:cs="Arial"/>
-          <w:color w:val="222222"/>
-        </w:rPr>
-        <w:t xml:space="preserve">atch </w:t>
-      </w:r>
-      <w:r>
-        <w:rPr>
-          <w:rFonts w:eastAsia="Arial" w:cs="Arial"/>
-          <w:color w:val="222222"/>
-        </w:rPr>
-        <w:t xml:space="preserve">and wasn’t </w:t>
-      </w:r>
-      <w:r>
-        <w:rPr>
-          <w:rFonts w:eastAsia="Arial" w:cs="Arial"/>
-          <w:color w:val="222222"/>
-        </w:rPr>
-        <w:t xml:space="preserve">changed </w:t>
-      </w:r>
-      <w:r>
-        <w:rPr>
-          <w:rFonts w:eastAsia="Arial" w:cs="Arial"/>
-          <w:color w:val="222222"/>
-        </w:rPr>
-        <w:t>then discard the row</w:t>
-      </w:r>
-      <w:r>
-        <w:rPr>
-          <w:rFonts w:eastAsia="Arial" w:cs="Arial"/>
-          <w:color w:val="222222"/>
-        </w:rPr>
-        <w:t xml:space="preserve">. DDL includes StartDate, </w:t>
-      </w:r>
-      <w:proofErr w:type="spellStart"/>
-      <w:r>
-        <w:rPr>
-          <w:rFonts w:eastAsia="Arial" w:cs="Arial"/>
-          <w:color w:val="222222"/>
-        </w:rPr>
-        <w:t>EndDate</w:t>
-      </w:r>
-      <w:proofErr w:type="spellEnd"/>
-      <w:r>
-        <w:rPr>
-          <w:rFonts w:eastAsia="Arial" w:cs="Arial"/>
-          <w:color w:val="222222"/>
-        </w:rPr>
-        <w:t xml:space="preserve">, </w:t>
-      </w:r>
-      <w:proofErr w:type="spellStart"/>
-      <w:r>
-        <w:rPr>
-          <w:rFonts w:eastAsia="Arial" w:cs="Arial"/>
-          <w:color w:val="222222"/>
-        </w:rPr>
-        <w:t>IsCurrent</w:t>
-      </w:r>
-      <w:proofErr w:type="spellEnd"/>
-      <w:r>
-        <w:rPr>
-          <w:rFonts w:eastAsia="Arial" w:cs="Arial"/>
-          <w:color w:val="222222"/>
-        </w:rPr>
-        <w:t xml:space="preserve"> columns on </w:t>
-      </w:r>
-      <w:proofErr w:type="spellStart"/>
-      <w:r>
-        <w:rPr>
-          <w:rFonts w:eastAsia="Arial" w:cs="Arial"/>
-          <w:color w:val="222222"/>
-        </w:rPr>
-        <w:t>Dim_Staff</w:t>
-      </w:r>
-      <w:proofErr w:type="spellEnd"/>
-      <w:r>
-        <w:rPr>
-          <w:rFonts w:eastAsia="Arial" w:cs="Arial"/>
-          <w:color w:val="222222"/>
-        </w:rPr>
-        <w:t>.</w:t>
+        <w:t>. DDL includes StartDate, EndDate, IsCurrent columns on Dim_Staff.</w:t>
       </w:r>
     </w:p>
     <w:p>
@@ -8701,7 +6933,6 @@
           <w:bCs/>
         </w:rPr>
       </w:pPr>
-      <w:proofErr w:type="spellStart"/>
       <w:r>
         <w:rPr>
           <w:b/>
@@ -8709,7 +6940,6 @@
         </w:rPr>
         <w:t>Fact_Sales.dtsx</w:t>
       </w:r>
-      <w:proofErr w:type="spellEnd"/>
       <w:r>
         <w:rPr>
           <w:rFonts w:ascii="Wingdings" w:eastAsia="Wingdings" w:hAnsi="Wingdings" w:cs="Wingdings"/>
@@ -8796,7 +7026,6 @@
           <w:numId w:val="21"/>
         </w:numPr>
       </w:pPr>
-      <w:proofErr w:type="spellStart"/>
       <w:r>
         <w:rPr>
           <w:b/>
@@ -8805,7 +7034,6 @@
         <w:lastRenderedPageBreak/>
         <w:t>Fact_Sales.dtsx</w:t>
       </w:r>
-      <w:proofErr w:type="spellEnd"/>
       <w:r>
         <w:t>:</w:t>
       </w:r>
@@ -8942,7 +7170,6 @@
           <w:bCs/>
         </w:rPr>
       </w:pPr>
-      <w:proofErr w:type="spellStart"/>
       <w:r>
         <w:rPr>
           <w:b/>
@@ -8950,7 +7177,6 @@
         </w:rPr>
         <w:t>Fact_Shipping.dtsx</w:t>
       </w:r>
-      <w:proofErr w:type="spellEnd"/>
       <w:r>
         <w:rPr>
           <w:b/>
@@ -9052,7 +7278,6 @@
           <w:numId w:val="21"/>
         </w:numPr>
       </w:pPr>
-      <w:proofErr w:type="spellStart"/>
       <w:r>
         <w:rPr>
           <w:b/>
@@ -9061,7 +7286,6 @@
         <w:lastRenderedPageBreak/>
         <w:t>Fact_Shipping.dtsx</w:t>
       </w:r>
-      <w:proofErr w:type="spellEnd"/>
       <w:r>
         <w:rPr>
           <w:b/>
@@ -9218,7 +7442,6 @@
           <w:bCs/>
         </w:rPr>
       </w:pPr>
-      <w:proofErr w:type="spellStart"/>
       <w:r>
         <w:rPr>
           <w:b/>
@@ -9226,7 +7449,6 @@
         </w:rPr>
         <w:t>Fact_Order.dtsx</w:t>
       </w:r>
-      <w:proofErr w:type="spellEnd"/>
       <w:r>
         <w:rPr>
           <w:b/>
@@ -9328,7 +7550,6 @@
           <w:bCs/>
         </w:rPr>
       </w:pPr>
-      <w:proofErr w:type="spellStart"/>
       <w:r>
         <w:rPr>
           <w:b/>
@@ -9337,7 +7558,6 @@
         <w:lastRenderedPageBreak/>
         <w:t>Fact_Order.dtsx</w:t>
       </w:r>
-      <w:proofErr w:type="spellEnd"/>
       <w:r>
         <w:rPr>
           <w:b/>
@@ -9767,17 +7987,8 @@
           <w:b/>
           <w:bCs/>
         </w:rPr>
-        <w:t xml:space="preserve">Fact_Shipping </w:t>
-      </w:r>
-      <w:proofErr w:type="gramStart"/>
-      <w:r>
-        <w:rPr>
-          <w:b/>
-          <w:bCs/>
-        </w:rPr>
-        <w:t>queries:-</w:t>
-      </w:r>
-      <w:proofErr w:type="gramEnd"/>
+        <w:t>Fact_Shipping queries:-</w:t>
+      </w:r>
     </w:p>
     <w:p>
       <w:pPr>
@@ -9960,17 +8171,8 @@
           <w:b/>
           <w:bCs/>
         </w:rPr>
-        <w:t xml:space="preserve">Fact_Orders </w:t>
-      </w:r>
-      <w:proofErr w:type="gramStart"/>
-      <w:r>
-        <w:rPr>
-          <w:b/>
-          <w:bCs/>
-        </w:rPr>
-        <w:t>queries:-</w:t>
-      </w:r>
-      <w:proofErr w:type="gramEnd"/>
+        <w:t>Fact_Orders queries:-</w:t>
+      </w:r>
     </w:p>
     <w:p>
       <w:pPr>
@@ -10721,11 +8923,20 @@
           <w:bCs/>
         </w:rPr>
       </w:pPr>
-      <w:r>
-        <w:rPr>
-          <w:b/>
-          <w:bCs/>
-        </w:rPr>
+    </w:p>
+    <w:p>
+      <w:pPr>
+        <w:rPr>
+          <w:b/>
+          <w:bCs/>
+        </w:rPr>
+      </w:pPr>
+      <w:r>
+        <w:rPr>
+          <w:b/>
+          <w:bCs/>
+        </w:rPr>
+        <w:lastRenderedPageBreak/>
         <w:t xml:space="preserve">Order Management </w:t>
       </w:r>
       <w:r>
@@ -10756,7 +8967,6 @@
           <w:bCs/>
           <w:noProof/>
         </w:rPr>
-        <w:lastRenderedPageBreak/>
         <w:drawing>
           <wp:inline distT="0" distB="0" distL="0" distR="0" wp14:anchorId="2910F539" wp14:editId="607DE291">
             <wp:extent cx="5731510" cy="3224530"/>
@@ -17855,12 +16065,6 @@
 </file>
 
 <file path=customXml/item1.xml><?xml version="1.0" encoding="utf-8"?>
-<p:properties xmlns:p="http://schemas.microsoft.com/office/2006/metadata/properties" xmlns:xsi="http://www.w3.org/2001/XMLSchema-instance" xmlns:pc="http://schemas.microsoft.com/office/infopath/2007/PartnerControls">
-  <documentManagement/>
-</p:properties>
-</file>
-
-<file path=customXml/item2.xml><?xml version="1.0" encoding="utf-8"?>
 <ct:contentTypeSchema xmlns:ct="http://schemas.microsoft.com/office/2006/metadata/contentType" xmlns:ma="http://schemas.microsoft.com/office/2006/metadata/properties/metaAttributes" ct:_="" ma:_="" ma:contentTypeName="Document" ma:contentTypeID="0x010100DD324CF696ABE44096995EA6E9653397" ma:contentTypeVersion="4" ma:contentTypeDescription="Create a new document." ma:contentTypeScope="" ma:versionID="94601065dd9065098b3e6c9965c38eba">
   <xsd:schema xmlns:xsd="http://www.w3.org/2001/XMLSchema" xmlns:xs="http://www.w3.org/2001/XMLSchema" xmlns:p="http://schemas.microsoft.com/office/2006/metadata/properties" xmlns:ns3="9ffdf6cc-3978-4601-a405-42bc48eb9bd2" targetNamespace="http://schemas.microsoft.com/office/2006/metadata/properties" ma:root="true" ma:fieldsID="862a5dd496b6ef1a8a7a086dd2f98e79" ns3:_="">
     <xsd:import namespace="9ffdf6cc-3978-4601-a405-42bc48eb9bd2"/>
@@ -18004,11 +16208,7 @@
 </ct:contentTypeSchema>
 </file>
 
-<file path=customXml/item3.xml><?xml version="1.0" encoding="utf-8"?>
-<b:Sources xmlns:b="http://schemas.openxmlformats.org/officeDocument/2006/bibliography" xmlns="http://schemas.openxmlformats.org/officeDocument/2006/bibliography" SelectedStyle="\APASixthEditionOfficeOnline.xsl" StyleName="APA" Version="6"/>
-</file>
-
-<file path=customXml/item4.xml><?xml version="1.0" encoding="utf-8"?>
+<file path=customXml/item2.xml><?xml version="1.0" encoding="utf-8"?>
 <?mso-contentType ?>
 <FormTemplates xmlns="http://schemas.microsoft.com/sharepoint/v3/contenttype/forms">
   <Display>DocumentLibraryForm</Display>
@@ -18017,16 +16217,17 @@
 </FormTemplates>
 </file>
 
-<file path=customXml/itemProps1.xml><?xml version="1.0" encoding="utf-8"?>
-<ds:datastoreItem xmlns:ds="http://schemas.openxmlformats.org/officeDocument/2006/customXml" ds:itemID="{0F66B206-0738-481D-9B6B-BC126CF019A4}">
-  <ds:schemaRefs>
-    <ds:schemaRef ds:uri="http://schemas.microsoft.com/office/2006/metadata/properties"/>
-    <ds:schemaRef ds:uri="http://schemas.microsoft.com/office/infopath/2007/PartnerControls"/>
-  </ds:schemaRefs>
-</ds:datastoreItem>
+<file path=customXml/item3.xml><?xml version="1.0" encoding="utf-8"?>
+<b:Sources xmlns:b="http://schemas.openxmlformats.org/officeDocument/2006/bibliography" xmlns="http://schemas.openxmlformats.org/officeDocument/2006/bibliography" SelectedStyle="\APASixthEditionOfficeOnline.xsl" StyleName="APA" Version="6"/>
 </file>
 
-<file path=customXml/itemProps2.xml><?xml version="1.0" encoding="utf-8"?>
+<file path=customXml/item4.xml><?xml version="1.0" encoding="utf-8"?>
+<p:properties xmlns:p="http://schemas.microsoft.com/office/2006/metadata/properties" xmlns:xsi="http://www.w3.org/2001/XMLSchema-instance" xmlns:pc="http://schemas.microsoft.com/office/infopath/2007/PartnerControls">
+  <documentManagement/>
+</p:properties>
+</file>
+
+<file path=customXml/itemProps1.xml><?xml version="1.0" encoding="utf-8"?>
 <ds:datastoreItem xmlns:ds="http://schemas.openxmlformats.org/officeDocument/2006/customXml" ds:itemID="{0C7CAC1E-855F-4C3F-B3F4-E580E230E92B}">
   <ds:schemaRefs>
     <ds:schemaRef ds:uri="http://schemas.microsoft.com/office/2006/metadata/contentType"/>
@@ -18044,6 +16245,14 @@
 </ds:datastoreItem>
 </file>
 
+<file path=customXml/itemProps2.xml><?xml version="1.0" encoding="utf-8"?>
+<ds:datastoreItem xmlns:ds="http://schemas.openxmlformats.org/officeDocument/2006/customXml" ds:itemID="{148FC632-1085-4E72-BB08-D59641C1AF1C}">
+  <ds:schemaRefs>
+    <ds:schemaRef ds:uri="http://schemas.microsoft.com/sharepoint/v3/contenttype/forms"/>
+  </ds:schemaRefs>
+</ds:datastoreItem>
+</file>
+
 <file path=customXml/itemProps3.xml><?xml version="1.0" encoding="utf-8"?>
 <ds:datastoreItem xmlns:ds="http://schemas.openxmlformats.org/officeDocument/2006/customXml" ds:itemID="{A81FC163-2753-497E-BE40-93305BF420E8}">
   <ds:schemaRefs>
@@ -18053,9 +16262,10 @@
 </file>
 
 <file path=customXml/itemProps4.xml><?xml version="1.0" encoding="utf-8"?>
-<ds:datastoreItem xmlns:ds="http://schemas.openxmlformats.org/officeDocument/2006/customXml" ds:itemID="{148FC632-1085-4E72-BB08-D59641C1AF1C}">
+<ds:datastoreItem xmlns:ds="http://schemas.openxmlformats.org/officeDocument/2006/customXml" ds:itemID="{0F66B206-0738-481D-9B6B-BC126CF019A4}">
   <ds:schemaRefs>
-    <ds:schemaRef ds:uri="http://schemas.microsoft.com/sharepoint/v3/contenttype/forms"/>
+    <ds:schemaRef ds:uri="http://schemas.microsoft.com/office/2006/metadata/properties"/>
+    <ds:schemaRef ds:uri="http://schemas.microsoft.com/office/infopath/2007/PartnerControls"/>
   </ds:schemaRefs>
 </ds:datastoreItem>
 </file>
</xml_diff>